<commit_message>
changed the executables to a python script, less sleek but more straightforward
</commit_message>
<xml_diff>
--- a/submission/CMPT310_Group14_Project_Writeup.docx
+++ b/submission/CMPT310_Group14_Project_Writeup.docx
@@ -63,6 +63,7 @@
       <w:r>
         <w:t>1</w:t>
       </w:r>
+      <w:proofErr w:type="gramStart"/>
       <w:r>
         <w:t>.</w:t>
       </w:r>
@@ -74,7 +75,15 @@
           <w:rFonts w:hint="eastAsia"/>
           <w:lang w:eastAsia="ja-JP"/>
         </w:rPr>
-        <w:t>System E</w:t>
+        <w:t>System</w:t>
+      </w:r>
+      <w:proofErr w:type="gramEnd"/>
+      <w:r>
+        <w:rPr>
+          <w:rFonts w:hint="eastAsia"/>
+          <w:lang w:eastAsia="ja-JP"/>
+        </w:rPr>
+        <w:t xml:space="preserve"> E</w:t>
       </w:r>
       <w:r>
         <w:t>xplanation</w:t>
@@ -964,6 +973,7 @@
         </w:rPr>
         <w:t xml:space="preserve">Running the </w:t>
       </w:r>
+      <w:proofErr w:type="gramStart"/>
       <w:r>
         <w:rPr>
           <w:lang w:eastAsia="ja-JP"/>
@@ -984,6 +994,7 @@
         </w:rPr>
         <w:t>s</w:t>
       </w:r>
+      <w:proofErr w:type="gramEnd"/>
       <w:r>
         <w:rPr>
           <w:rFonts w:hint="eastAsia"/>
@@ -3003,7 +3014,15 @@
         <w:t>6</w:t>
       </w:r>
       <w:r>
-        <w:t xml:space="preserve"> predictions are severe Low↔High mistakes (</w:t>
+        <w:t xml:space="preserve"> predictions are severe </w:t>
+      </w:r>
+      <w:proofErr w:type="spellStart"/>
+      <w:r>
+        <w:t>Low↔High</w:t>
+      </w:r>
+      <w:proofErr w:type="spellEnd"/>
+      <w:r>
+        <w:t xml:space="preserve"> mistakes (</w:t>
       </w:r>
       <w:r>
         <w:rPr>
@@ -3103,7 +3122,23 @@
           <w:rFonts w:hint="eastAsia"/>
           <w:lang w:eastAsia="ja-JP"/>
         </w:rPr>
-        <w:t xml:space="preserve">Unfortunately, due to a lack of further, complete data available, alongside a highly limited universe of real-world data (given there are only so many townhomes in Calgary), the model is undercut by lacking a chance to discern broader patterns. Additionally, the features we have elected to use to glean an ROI classification, may simply not yield </w:t>
+        <w:t xml:space="preserve">Unfortunately, due to a lack of further, complete data available, alongside a highly limited universe of real-world data (given there are only so many townhomes in Calgary), the model is undercut by lacking a chance to discern broader patterns. Additionally, the features we have elected to use to glean </w:t>
+      </w:r>
+      <w:proofErr w:type="gramStart"/>
+      <w:r>
+        <w:rPr>
+          <w:rFonts w:hint="eastAsia"/>
+          <w:lang w:eastAsia="ja-JP"/>
+        </w:rPr>
+        <w:t>an ROI</w:t>
+      </w:r>
+      <w:proofErr w:type="gramEnd"/>
+      <w:r>
+        <w:rPr>
+          <w:rFonts w:hint="eastAsia"/>
+          <w:lang w:eastAsia="ja-JP"/>
+        </w:rPr>
+        <w:t xml:space="preserve"> classification, may simply not yield </w:t>
       </w:r>
       <w:r>
         <w:rPr>
@@ -3175,12 +3210,21 @@
           <w:lang w:eastAsia="ja-JP"/>
         </w:rPr>
       </w:pPr>
+      <w:proofErr w:type="gramStart"/>
       <w:r>
         <w:rPr>
           <w:rFonts w:hint="eastAsia"/>
           <w:lang w:eastAsia="ja-JP"/>
         </w:rPr>
-        <w:t xml:space="preserve">In an attempt to mitigate these problems, we </w:t>
+        <w:t>In an attempt to</w:t>
+      </w:r>
+      <w:proofErr w:type="gramEnd"/>
+      <w:r>
+        <w:rPr>
+          <w:rFonts w:hint="eastAsia"/>
+          <w:lang w:eastAsia="ja-JP"/>
+        </w:rPr>
+        <w:t xml:space="preserve"> mitigate these problems, we </w:t>
       </w:r>
       <w:r>
         <w:rPr>
@@ -3456,14 +3500,13 @@
               <w:spacing w:after="0"/>
               <w:rPr>
                 <w:rFonts w:hint="eastAsia"/>
-                <w:lang w:eastAsia="ja-JP"/>
+                <w:sz w:val="13"/>
               </w:rPr>
             </w:pPr>
             <w:r>
               <w:rPr>
                 <w:rFonts w:hint="eastAsia"/>
                 <w:sz w:val="13"/>
-                <w:lang w:eastAsia="ja-JP"/>
               </w:rPr>
               <w:t>Data gathering, organizing and, filtering</w:t>
             </w:r>
@@ -3482,6 +3525,9 @@
           <w:p>
             <w:pPr>
               <w:spacing w:after="0"/>
+              <w:rPr>
+                <w:sz w:val="13"/>
+              </w:rPr>
             </w:pPr>
             <w:r>
               <w:rPr>
@@ -3504,12 +3550,14 @@
           <w:p>
             <w:pPr>
               <w:spacing w:after="0"/>
+              <w:rPr>
+                <w:sz w:val="13"/>
+              </w:rPr>
             </w:pPr>
             <w:r>
               <w:rPr>
                 <w:rFonts w:hint="eastAsia"/>
                 <w:sz w:val="13"/>
-                <w:lang w:eastAsia="ja-JP"/>
               </w:rPr>
               <w:t>5</w:t>
             </w:r>
@@ -3534,6 +3582,9 @@
           <w:p>
             <w:pPr>
               <w:spacing w:after="0"/>
+              <w:rPr>
+                <w:sz w:val="13"/>
+              </w:rPr>
             </w:pPr>
             <w:r>
               <w:rPr>
@@ -3558,7 +3609,7 @@
               <w:spacing w:after="0"/>
               <w:rPr>
                 <w:rFonts w:hint="eastAsia"/>
-                <w:lang w:eastAsia="ja-JP"/>
+                <w:sz w:val="13"/>
               </w:rPr>
             </w:pPr>
             <w:r>
@@ -3571,10 +3622,18 @@
               <w:rPr>
                 <w:rFonts w:hint="eastAsia"/>
                 <w:sz w:val="13"/>
-                <w:lang w:eastAsia="ja-JP"/>
-              </w:rPr>
-              <w:t>, Monem Moheq</w:t>
-            </w:r>
+              </w:rPr>
+              <w:t xml:space="preserve">, Monem </w:t>
+            </w:r>
+            <w:proofErr w:type="spellStart"/>
+            <w:r>
+              <w:rPr>
+                <w:rFonts w:hint="eastAsia"/>
+                <w:sz w:val="13"/>
+              </w:rPr>
+              <w:t>Moheq</w:t>
+            </w:r>
+            <w:proofErr w:type="spellEnd"/>
           </w:p>
         </w:tc>
         <w:tc>
@@ -3592,14 +3651,13 @@
               <w:spacing w:after="0"/>
               <w:rPr>
                 <w:rFonts w:hint="eastAsia"/>
-                <w:lang w:eastAsia="ja-JP"/>
+                <w:sz w:val="13"/>
               </w:rPr>
             </w:pPr>
             <w:r>
               <w:rPr>
                 <w:rFonts w:hint="eastAsia"/>
                 <w:sz w:val="13"/>
-                <w:lang w:eastAsia="ja-JP"/>
               </w:rPr>
               <w:t>Building permits, assessment reports, and other municipal datasets are gathered and sorted through</w:t>
             </w:r>
@@ -3607,7 +3665,6 @@
               <w:rPr>
                 <w:rFonts w:hint="eastAsia"/>
                 <w:sz w:val="13"/>
-                <w:lang w:eastAsia="ja-JP"/>
               </w:rPr>
               <w:t>.</w:t>
             </w:r>
@@ -3634,14 +3691,12 @@
               <w:rPr>
                 <w:rFonts w:hint="eastAsia"/>
                 <w:sz w:val="13"/>
-                <w:lang w:eastAsia="ja-JP"/>
               </w:rPr>
             </w:pPr>
             <w:r>
               <w:rPr>
                 <w:rFonts w:hint="eastAsia"/>
                 <w:sz w:val="13"/>
-                <w:lang w:eastAsia="ja-JP"/>
               </w:rPr>
               <w:t>Data reconciliation and synthesization</w:t>
             </w:r>
@@ -3663,14 +3718,12 @@
               <w:rPr>
                 <w:rFonts w:hint="eastAsia"/>
                 <w:sz w:val="13"/>
-                <w:lang w:eastAsia="ja-JP"/>
               </w:rPr>
             </w:pPr>
             <w:r>
               <w:rPr>
                 <w:rFonts w:hint="eastAsia"/>
                 <w:sz w:val="13"/>
-                <w:lang w:eastAsia="ja-JP"/>
               </w:rPr>
               <w:t>Local</w:t>
             </w:r>
@@ -3692,14 +3745,12 @@
               <w:rPr>
                 <w:rFonts w:hint="eastAsia"/>
                 <w:sz w:val="13"/>
-                <w:lang w:eastAsia="ja-JP"/>
               </w:rPr>
             </w:pPr>
             <w:r>
               <w:rPr>
                 <w:rFonts w:hint="eastAsia"/>
                 <w:sz w:val="13"/>
-                <w:lang w:eastAsia="ja-JP"/>
               </w:rPr>
               <w:t>5/5</w:t>
             </w:r>
@@ -3721,14 +3772,12 @@
               <w:rPr>
                 <w:rFonts w:hint="eastAsia"/>
                 <w:sz w:val="13"/>
-                <w:lang w:eastAsia="ja-JP"/>
               </w:rPr>
             </w:pPr>
             <w:r>
               <w:rPr>
                 <w:rFonts w:hint="eastAsia"/>
                 <w:sz w:val="13"/>
-                <w:lang w:eastAsia="ja-JP"/>
               </w:rPr>
               <w:t>Python</w:t>
             </w:r>
@@ -3750,17 +3799,24 @@
               <w:rPr>
                 <w:rFonts w:hint="eastAsia"/>
                 <w:sz w:val="13"/>
-                <w:lang w:eastAsia="ja-JP"/>
               </w:rPr>
             </w:pPr>
             <w:r>
               <w:rPr>
                 <w:rFonts w:hint="eastAsia"/>
                 <w:sz w:val="13"/>
-                <w:lang w:eastAsia="ja-JP"/>
-              </w:rPr>
-              <w:t>Finley Thomson, Monem Moheq</w:t>
-            </w:r>
+              </w:rPr>
+              <w:t xml:space="preserve">Finley Thomson, Monem </w:t>
+            </w:r>
+            <w:proofErr w:type="spellStart"/>
+            <w:r>
+              <w:rPr>
+                <w:rFonts w:hint="eastAsia"/>
+                <w:sz w:val="13"/>
+              </w:rPr>
+              <w:t>Moheq</w:t>
+            </w:r>
+            <w:proofErr w:type="spellEnd"/>
           </w:p>
         </w:tc>
         <w:tc>
@@ -3779,16 +3835,20 @@
               <w:rPr>
                 <w:rFonts w:hint="eastAsia"/>
                 <w:sz w:val="13"/>
-                <w:lang w:eastAsia="ja-JP"/>
               </w:rPr>
             </w:pPr>
             <w:r>
               <w:rPr>
-                <w:rFonts w:hint="eastAsia"/>
                 <w:sz w:val="13"/>
-                <w:lang w:eastAsia="ja-JP"/>
-              </w:rPr>
-              <w:t>Combined all relevant data across all datasets into final 224 townhouse project dataset.</w:t>
+              </w:rPr>
+              <w:t>Combine</w:t>
+            </w:r>
+            <w:r>
+              <w:rPr>
+                <w:rFonts w:hint="eastAsia"/>
+                <w:sz w:val="13"/>
+              </w:rPr>
+              <w:t xml:space="preserve"> all relevant data across all datasets into final 224 townhouse project dataset.</w:t>
             </w:r>
           </w:p>
         </w:tc>
@@ -3813,14 +3873,12 @@
               <w:rPr>
                 <w:rFonts w:hint="eastAsia"/>
                 <w:sz w:val="13"/>
-                <w:lang w:eastAsia="ja-JP"/>
               </w:rPr>
             </w:pPr>
             <w:r>
               <w:rPr>
                 <w:rFonts w:hint="eastAsia"/>
                 <w:sz w:val="13"/>
-                <w:lang w:eastAsia="ja-JP"/>
               </w:rPr>
               <w:t xml:space="preserve">Decision tree and random forest classifiers </w:t>
             </w:r>
@@ -3842,14 +3900,12 @@
               <w:rPr>
                 <w:rFonts w:hint="eastAsia"/>
                 <w:sz w:val="13"/>
-                <w:lang w:eastAsia="ja-JP"/>
               </w:rPr>
             </w:pPr>
             <w:r>
               <w:rPr>
                 <w:rFonts w:hint="eastAsia"/>
                 <w:sz w:val="13"/>
-                <w:lang w:eastAsia="ja-JP"/>
               </w:rPr>
               <w:t>Local</w:t>
             </w:r>
@@ -3871,14 +3927,12 @@
               <w:rPr>
                 <w:rFonts w:hint="eastAsia"/>
                 <w:sz w:val="13"/>
-                <w:lang w:eastAsia="ja-JP"/>
               </w:rPr>
             </w:pPr>
             <w:r>
               <w:rPr>
                 <w:rFonts w:hint="eastAsia"/>
                 <w:sz w:val="13"/>
-                <w:lang w:eastAsia="ja-JP"/>
               </w:rPr>
               <w:t>4/5</w:t>
             </w:r>
@@ -3900,14 +3954,12 @@
               <w:rPr>
                 <w:rFonts w:hint="eastAsia"/>
                 <w:sz w:val="13"/>
-                <w:lang w:eastAsia="ja-JP"/>
               </w:rPr>
             </w:pPr>
             <w:r>
               <w:rPr>
                 <w:rFonts w:hint="eastAsia"/>
                 <w:sz w:val="13"/>
-                <w:lang w:eastAsia="ja-JP"/>
               </w:rPr>
               <w:t>Python</w:t>
             </w:r>
@@ -3929,14 +3981,12 @@
               <w:rPr>
                 <w:rFonts w:hint="eastAsia"/>
                 <w:sz w:val="13"/>
-                <w:lang w:eastAsia="ja-JP"/>
               </w:rPr>
             </w:pPr>
             <w:r>
               <w:rPr>
                 <w:rFonts w:hint="eastAsia"/>
                 <w:sz w:val="13"/>
-                <w:lang w:eastAsia="ja-JP"/>
               </w:rPr>
               <w:t>Finley Thomson, Jarrod Hwang</w:t>
             </w:r>
@@ -3958,14 +4008,12 @@
               <w:rPr>
                 <w:rFonts w:hint="eastAsia"/>
                 <w:sz w:val="13"/>
-                <w:lang w:eastAsia="ja-JP"/>
               </w:rPr>
             </w:pPr>
             <w:r>
               <w:rPr>
                 <w:rFonts w:hint="eastAsia"/>
                 <w:sz w:val="13"/>
-                <w:lang w:eastAsia="ja-JP"/>
               </w:rPr>
               <w:t>Built decision tree and random forest ensemble from scratch, w</w:t>
             </w:r>
@@ -3979,7 +4027,6 @@
               <w:rPr>
                 <w:rFonts w:hint="eastAsia"/>
                 <w:sz w:val="13"/>
-                <w:lang w:eastAsia="ja-JP"/>
               </w:rPr>
               <w:t xml:space="preserve"> but has </w:t>
             </w:r>
@@ -3993,7 +4040,6 @@
               <w:rPr>
                 <w:rFonts w:hint="eastAsia"/>
                 <w:sz w:val="13"/>
-                <w:lang w:eastAsia="ja-JP"/>
               </w:rPr>
               <w:t>.</w:t>
             </w:r>
@@ -4020,14 +4066,12 @@
               <w:rPr>
                 <w:rFonts w:hint="eastAsia"/>
                 <w:sz w:val="13"/>
-                <w:lang w:eastAsia="ja-JP"/>
               </w:rPr>
             </w:pPr>
             <w:r>
               <w:rPr>
                 <w:rFonts w:hint="eastAsia"/>
                 <w:sz w:val="13"/>
-                <w:lang w:eastAsia="ja-JP"/>
               </w:rPr>
               <w:t xml:space="preserve">Ordinal Logistic Regressor </w:t>
             </w:r>
@@ -4049,14 +4093,12 @@
               <w:rPr>
                 <w:rFonts w:hint="eastAsia"/>
                 <w:sz w:val="13"/>
-                <w:lang w:eastAsia="ja-JP"/>
               </w:rPr>
             </w:pPr>
             <w:r>
               <w:rPr>
                 <w:rFonts w:hint="eastAsia"/>
                 <w:sz w:val="13"/>
-                <w:lang w:eastAsia="ja-JP"/>
               </w:rPr>
               <w:t>Local</w:t>
             </w:r>
@@ -4078,14 +4120,12 @@
               <w:rPr>
                 <w:rFonts w:hint="eastAsia"/>
                 <w:sz w:val="13"/>
-                <w:lang w:eastAsia="ja-JP"/>
               </w:rPr>
             </w:pPr>
             <w:r>
               <w:rPr>
                 <w:rFonts w:hint="eastAsia"/>
                 <w:sz w:val="13"/>
-                <w:lang w:eastAsia="ja-JP"/>
               </w:rPr>
               <w:t>4/5</w:t>
             </w:r>
@@ -4107,14 +4147,12 @@
               <w:rPr>
                 <w:rFonts w:hint="eastAsia"/>
                 <w:sz w:val="13"/>
-                <w:lang w:eastAsia="ja-JP"/>
               </w:rPr>
             </w:pPr>
             <w:r>
               <w:rPr>
                 <w:rFonts w:hint="eastAsia"/>
                 <w:sz w:val="13"/>
-                <w:lang w:eastAsia="ja-JP"/>
               </w:rPr>
               <w:t>Python</w:t>
             </w:r>
@@ -4136,17 +4174,24 @@
               <w:rPr>
                 <w:rFonts w:hint="eastAsia"/>
                 <w:sz w:val="13"/>
-                <w:lang w:eastAsia="ja-JP"/>
               </w:rPr>
             </w:pPr>
             <w:r>
               <w:rPr>
                 <w:rFonts w:hint="eastAsia"/>
                 <w:sz w:val="13"/>
-                <w:lang w:eastAsia="ja-JP"/>
-              </w:rPr>
-              <w:t>Finley Thomson, Monem Moheq</w:t>
-            </w:r>
+              </w:rPr>
+              <w:t xml:space="preserve">Finley Thomson, Monem </w:t>
+            </w:r>
+            <w:proofErr w:type="spellStart"/>
+            <w:r>
+              <w:rPr>
+                <w:rFonts w:hint="eastAsia"/>
+                <w:sz w:val="13"/>
+              </w:rPr>
+              <w:t>Moheq</w:t>
+            </w:r>
+            <w:proofErr w:type="spellEnd"/>
           </w:p>
         </w:tc>
         <w:tc>
@@ -4165,14 +4210,12 @@
               <w:rPr>
                 <w:rFonts w:hint="eastAsia"/>
                 <w:sz w:val="13"/>
-                <w:lang w:eastAsia="ja-JP"/>
               </w:rPr>
             </w:pPr>
             <w:r>
               <w:rPr>
                 <w:rFonts w:hint="eastAsia"/>
                 <w:sz w:val="13"/>
-                <w:lang w:eastAsia="ja-JP"/>
               </w:rPr>
               <w:t>Built ordinal logistic regressor from scratch, working and reproducible but needs work to ensure proper threshold ordering</w:t>
             </w:r>
@@ -4180,7 +4223,6 @@
               <w:rPr>
                 <w:rFonts w:hint="eastAsia"/>
                 <w:sz w:val="13"/>
-                <w:lang w:eastAsia="ja-JP"/>
               </w:rPr>
               <w:t>.</w:t>
             </w:r>
@@ -4207,14 +4249,12 @@
               <w:rPr>
                 <w:rFonts w:hint="eastAsia"/>
                 <w:sz w:val="13"/>
-                <w:lang w:eastAsia="ja-JP"/>
               </w:rPr>
             </w:pPr>
             <w:r>
               <w:rPr>
                 <w:rFonts w:hint="eastAsia"/>
                 <w:sz w:val="13"/>
-                <w:lang w:eastAsia="ja-JP"/>
               </w:rPr>
               <w:t>Ensemble Voter Infrastructure</w:t>
             </w:r>
@@ -4236,14 +4276,12 @@
               <w:rPr>
                 <w:rFonts w:hint="eastAsia"/>
                 <w:sz w:val="13"/>
-                <w:lang w:eastAsia="ja-JP"/>
               </w:rPr>
             </w:pPr>
             <w:r>
               <w:rPr>
                 <w:rFonts w:hint="eastAsia"/>
                 <w:sz w:val="13"/>
-                <w:lang w:eastAsia="ja-JP"/>
               </w:rPr>
               <w:t>Local</w:t>
             </w:r>
@@ -4265,14 +4303,12 @@
               <w:rPr>
                 <w:rFonts w:hint="eastAsia"/>
                 <w:sz w:val="13"/>
-                <w:lang w:eastAsia="ja-JP"/>
               </w:rPr>
             </w:pPr>
             <w:r>
               <w:rPr>
                 <w:rFonts w:hint="eastAsia"/>
                 <w:sz w:val="13"/>
-                <w:lang w:eastAsia="ja-JP"/>
               </w:rPr>
               <w:t>5/5</w:t>
             </w:r>
@@ -4294,14 +4330,12 @@
               <w:rPr>
                 <w:rFonts w:hint="eastAsia"/>
                 <w:sz w:val="13"/>
-                <w:lang w:eastAsia="ja-JP"/>
               </w:rPr>
             </w:pPr>
             <w:r>
               <w:rPr>
                 <w:rFonts w:hint="eastAsia"/>
                 <w:sz w:val="13"/>
-                <w:lang w:eastAsia="ja-JP"/>
               </w:rPr>
               <w:t>Python</w:t>
             </w:r>
@@ -4323,14 +4357,12 @@
               <w:rPr>
                 <w:rFonts w:hint="eastAsia"/>
                 <w:sz w:val="13"/>
-                <w:lang w:eastAsia="ja-JP"/>
               </w:rPr>
             </w:pPr>
             <w:r>
               <w:rPr>
                 <w:rFonts w:hint="eastAsia"/>
                 <w:sz w:val="13"/>
-                <w:lang w:eastAsia="ja-JP"/>
               </w:rPr>
               <w:t>Finley Thomson</w:t>
             </w:r>
@@ -4352,14 +4384,12 @@
               <w:rPr>
                 <w:rFonts w:hint="eastAsia"/>
                 <w:sz w:val="13"/>
-                <w:lang w:eastAsia="ja-JP"/>
               </w:rPr>
             </w:pPr>
             <w:r>
               <w:rPr>
                 <w:rFonts w:hint="eastAsia"/>
                 <w:sz w:val="13"/>
-                <w:lang w:eastAsia="ja-JP"/>
               </w:rPr>
               <w:t>Built ensemble infrastructure to engage other models in a soft voting structure.</w:t>
             </w:r>
@@ -4386,14 +4416,12 @@
               <w:rPr>
                 <w:rFonts w:hint="eastAsia"/>
                 <w:sz w:val="13"/>
-                <w:lang w:eastAsia="ja-JP"/>
               </w:rPr>
             </w:pPr>
             <w:r>
               <w:rPr>
                 <w:rFonts w:hint="eastAsia"/>
                 <w:sz w:val="13"/>
-                <w:lang w:eastAsia="ja-JP"/>
               </w:rPr>
               <w:t>Synthetic Data Generation</w:t>
             </w:r>
@@ -4415,14 +4443,12 @@
               <w:rPr>
                 <w:rFonts w:hint="eastAsia"/>
                 <w:sz w:val="13"/>
-                <w:lang w:eastAsia="ja-JP"/>
               </w:rPr>
             </w:pPr>
             <w:r>
               <w:rPr>
                 <w:rFonts w:hint="eastAsia"/>
                 <w:sz w:val="13"/>
-                <w:lang w:eastAsia="ja-JP"/>
               </w:rPr>
               <w:t>Local</w:t>
             </w:r>
@@ -4444,14 +4470,12 @@
               <w:rPr>
                 <w:rFonts w:hint="eastAsia"/>
                 <w:sz w:val="13"/>
-                <w:lang w:eastAsia="ja-JP"/>
               </w:rPr>
             </w:pPr>
             <w:r>
               <w:rPr>
                 <w:rFonts w:hint="eastAsia"/>
                 <w:sz w:val="13"/>
-                <w:lang w:eastAsia="ja-JP"/>
               </w:rPr>
               <w:t>4/5</w:t>
             </w:r>
@@ -4473,14 +4497,12 @@
               <w:rPr>
                 <w:rFonts w:hint="eastAsia"/>
                 <w:sz w:val="13"/>
-                <w:lang w:eastAsia="ja-JP"/>
               </w:rPr>
             </w:pPr>
             <w:r>
               <w:rPr>
                 <w:rFonts w:hint="eastAsia"/>
                 <w:sz w:val="13"/>
-                <w:lang w:eastAsia="ja-JP"/>
               </w:rPr>
               <w:t>Python</w:t>
             </w:r>
@@ -4502,14 +4524,12 @@
               <w:rPr>
                 <w:rFonts w:hint="eastAsia"/>
                 <w:sz w:val="13"/>
-                <w:lang w:eastAsia="ja-JP"/>
               </w:rPr>
             </w:pPr>
             <w:r>
               <w:rPr>
                 <w:rFonts w:hint="eastAsia"/>
                 <w:sz w:val="13"/>
-                <w:lang w:eastAsia="ja-JP"/>
               </w:rPr>
               <w:t>Finley Thomson, Jarrod Hwang</w:t>
             </w:r>
@@ -4531,14 +4551,12 @@
               <w:rPr>
                 <w:rFonts w:hint="eastAsia"/>
                 <w:sz w:val="13"/>
-                <w:lang w:eastAsia="ja-JP"/>
               </w:rPr>
             </w:pPr>
             <w:r>
               <w:rPr>
                 <w:rFonts w:hint="eastAsia"/>
                 <w:sz w:val="13"/>
-                <w:lang w:eastAsia="ja-JP"/>
               </w:rPr>
               <w:t xml:space="preserve">Integrated synthetic data generation based off a </w:t>
             </w:r>
@@ -4546,10 +4564,25 @@
               <w:rPr>
                 <w:rFonts w:hint="eastAsia"/>
                 <w:sz w:val="13"/>
-                <w:lang w:eastAsia="ja-JP"/>
               </w:rPr>
               <w:lastRenderedPageBreak/>
-              <w:t>multivariate lognormal distribution; more confirmation needed for validity of the distribution.</w:t>
+              <w:t xml:space="preserve">multivariate lognormal </w:t>
+            </w:r>
+            <w:proofErr w:type="gramStart"/>
+            <w:r>
+              <w:rPr>
+                <w:rFonts w:hint="eastAsia"/>
+                <w:sz w:val="13"/>
+              </w:rPr>
+              <w:t>distribution;</w:t>
+            </w:r>
+            <w:proofErr w:type="gramEnd"/>
+            <w:r>
+              <w:rPr>
+                <w:rFonts w:hint="eastAsia"/>
+                <w:sz w:val="13"/>
+              </w:rPr>
+              <w:t xml:space="preserve"> more confirmation needed for validity of the distribution.</w:t>
             </w:r>
           </w:p>
         </w:tc>
@@ -4574,14 +4607,12 @@
               <w:rPr>
                 <w:rFonts w:hint="eastAsia"/>
                 <w:sz w:val="13"/>
-                <w:lang w:eastAsia="ja-JP"/>
               </w:rPr>
             </w:pPr>
             <w:r>
               <w:rPr>
                 <w:rFonts w:hint="eastAsia"/>
                 <w:sz w:val="13"/>
-                <w:lang w:eastAsia="ja-JP"/>
               </w:rPr>
               <w:lastRenderedPageBreak/>
               <w:t>Leakage-Safe Stratified Cross-Validation</w:t>
@@ -4604,14 +4635,12 @@
               <w:rPr>
                 <w:rFonts w:hint="eastAsia"/>
                 <w:sz w:val="13"/>
-                <w:lang w:eastAsia="ja-JP"/>
               </w:rPr>
             </w:pPr>
             <w:r>
               <w:rPr>
                 <w:rFonts w:hint="eastAsia"/>
                 <w:sz w:val="13"/>
-                <w:lang w:eastAsia="ja-JP"/>
               </w:rPr>
               <w:t>Local</w:t>
             </w:r>
@@ -4633,14 +4662,12 @@
               <w:rPr>
                 <w:rFonts w:hint="eastAsia"/>
                 <w:sz w:val="13"/>
-                <w:lang w:eastAsia="ja-JP"/>
               </w:rPr>
             </w:pPr>
             <w:r>
               <w:rPr>
                 <w:rFonts w:hint="eastAsia"/>
                 <w:sz w:val="13"/>
-                <w:lang w:eastAsia="ja-JP"/>
               </w:rPr>
               <w:t>5/5</w:t>
             </w:r>
@@ -4662,14 +4689,12 @@
               <w:rPr>
                 <w:rFonts w:hint="eastAsia"/>
                 <w:sz w:val="13"/>
-                <w:lang w:eastAsia="ja-JP"/>
               </w:rPr>
             </w:pPr>
             <w:r>
               <w:rPr>
                 <w:rFonts w:hint="eastAsia"/>
                 <w:sz w:val="13"/>
-                <w:lang w:eastAsia="ja-JP"/>
               </w:rPr>
               <w:t>Python</w:t>
             </w:r>
@@ -4691,14 +4716,12 @@
               <w:rPr>
                 <w:rFonts w:hint="eastAsia"/>
                 <w:sz w:val="13"/>
-                <w:lang w:eastAsia="ja-JP"/>
               </w:rPr>
             </w:pPr>
             <w:r>
               <w:rPr>
                 <w:rFonts w:hint="eastAsia"/>
                 <w:sz w:val="13"/>
-                <w:lang w:eastAsia="ja-JP"/>
               </w:rPr>
               <w:t>Finley Thomson, Jarrod Hwang</w:t>
             </w:r>
@@ -4720,7 +4743,6 @@
               <w:rPr>
                 <w:rFonts w:hint="eastAsia"/>
                 <w:sz w:val="13"/>
-                <w:lang w:eastAsia="ja-JP"/>
               </w:rPr>
             </w:pPr>
             <w:r>
@@ -4752,7 +4774,6 @@
               <w:rPr>
                 <w:rFonts w:hint="eastAsia"/>
                 <w:sz w:val="13"/>
-                <w:lang w:eastAsia="ja-JP"/>
               </w:rPr>
             </w:pPr>
             <w:r>
@@ -4765,9 +4786,24 @@
               <w:rPr>
                 <w:rFonts w:hint="eastAsia"/>
                 <w:sz w:val="13"/>
-                <w:lang w:eastAsia="ja-JP"/>
-              </w:rPr>
-              <w:t>and Evaluate Models (Including sklearn Random Forest and Baseline)</w:t>
+              </w:rPr>
+              <w:t xml:space="preserve">and Evaluate Models (Including </w:t>
+            </w:r>
+            <w:proofErr w:type="spellStart"/>
+            <w:r>
+              <w:rPr>
+                <w:rFonts w:hint="eastAsia"/>
+                <w:sz w:val="13"/>
+              </w:rPr>
+              <w:t>sklearn</w:t>
+            </w:r>
+            <w:proofErr w:type="spellEnd"/>
+            <w:r>
+              <w:rPr>
+                <w:rFonts w:hint="eastAsia"/>
+                <w:sz w:val="13"/>
+              </w:rPr>
+              <w:t xml:space="preserve"> Random Forest and Baseline)</w:t>
             </w:r>
           </w:p>
         </w:tc>
@@ -4787,7 +4823,6 @@
               <w:rPr>
                 <w:rFonts w:hint="eastAsia"/>
                 <w:sz w:val="13"/>
-                <w:lang w:eastAsia="ja-JP"/>
               </w:rPr>
             </w:pPr>
             <w:r>
@@ -4814,7 +4849,6 @@
               <w:rPr>
                 <w:rFonts w:hint="eastAsia"/>
                 <w:sz w:val="13"/>
-                <w:lang w:eastAsia="ja-JP"/>
               </w:rPr>
             </w:pPr>
             <w:r>
@@ -4841,7 +4875,6 @@
               <w:rPr>
                 <w:rFonts w:hint="eastAsia"/>
                 <w:sz w:val="13"/>
-                <w:lang w:eastAsia="ja-JP"/>
               </w:rPr>
             </w:pPr>
             <w:r>
@@ -4868,7 +4901,6 @@
               <w:rPr>
                 <w:rFonts w:hint="eastAsia"/>
                 <w:sz w:val="13"/>
-                <w:lang w:eastAsia="ja-JP"/>
               </w:rPr>
             </w:pPr>
             <w:r>
@@ -4881,7 +4913,6 @@
               <w:rPr>
                 <w:rFonts w:hint="eastAsia"/>
                 <w:sz w:val="13"/>
-                <w:lang w:eastAsia="ja-JP"/>
               </w:rPr>
               <w:t>, Finley Thomson</w:t>
             </w:r>
@@ -4909,214 +4940,6 @@
                 <w:sz w:val="13"/>
               </w:rPr>
               <w:t>Canonical CLI reports accuracy, macro-F1, ordinal error, and severe errors.</w:t>
-            </w:r>
-          </w:p>
-        </w:tc>
-      </w:tr>
-    </w:tbl>
-    <w:p/>
-    <w:p/>
-    <w:p/>
-    <w:p/>
-    <w:p/>
-    <w:p/>
-    <w:p/>
-    <w:p/>
-    <w:p/>
-    <w:p/>
-    <w:p/>
-    <w:p/>
-    <w:p/>
-    <w:p/>
-    <w:p/>
-    <w:p/>
-    <w:p/>
-    <w:p/>
-    <w:p/>
-    <w:p/>
-    <w:p/>
-    <w:p/>
-    <w:p/>
-    <w:p/>
-    <w:p/>
-    <w:p/>
-    <w:p/>
-    <w:p/>
-    <w:p/>
-    <w:tbl>
-      <w:tblPr>
-        <w:tblW w:w="0" w:type="auto"/>
-        <w:jc w:val="center"/>
-        <w:tblBorders>
-          <w:top w:val="single" w:sz="6" w:space="0" w:color="C9CDD1"/>
-          <w:left w:val="single" w:sz="6" w:space="0" w:color="C9CDD1"/>
-          <w:bottom w:val="single" w:sz="6" w:space="0" w:color="C9CDD1"/>
-          <w:right w:val="single" w:sz="6" w:space="0" w:color="C9CDD1"/>
-          <w:insideH w:val="single" w:sz="6" w:space="0" w:color="C9CDD1"/>
-          <w:insideV w:val="single" w:sz="6" w:space="0" w:color="C9CDD1"/>
-        </w:tblBorders>
-        <w:tblLook w:val="04A0" w:firstRow="1" w:lastRow="0" w:firstColumn="1" w:lastColumn="0" w:noHBand="0" w:noVBand="1"/>
-      </w:tblPr>
-      <w:tblGrid>
-        <w:gridCol w:w="1762"/>
-        <w:gridCol w:w="1762"/>
-        <w:gridCol w:w="1762"/>
-        <w:gridCol w:w="1762"/>
-        <w:gridCol w:w="1762"/>
-        <w:gridCol w:w="1762"/>
-      </w:tblGrid>
-      <w:tr>
-        <w:trPr>
-          <w:tblHeader/>
-          <w:jc w:val="center"/>
-        </w:trPr>
-        <w:tc>
-          <w:tcPr>
-            <w:tcW w:w="1762" w:type="dxa"/>
-            <w:shd w:val="clear" w:color="auto" w:fill="343A40"/>
-            <w:tcMar>
-              <w:top w:w="60" w:type="dxa"/>
-              <w:left w:w="70" w:type="dxa"/>
-              <w:bottom w:w="60" w:type="dxa"/>
-              <w:right w:w="70" w:type="dxa"/>
-            </w:tcMar>
-          </w:tcPr>
-          <w:p>
-            <w:pPr>
-              <w:spacing w:after="0"/>
-            </w:pPr>
-            <w:r>
-              <w:rPr>
-                <w:b/>
-                <w:color w:val="FFFFFF"/>
-                <w:sz w:val="13"/>
-              </w:rPr>
-              <w:t>Description</w:t>
-            </w:r>
-          </w:p>
-        </w:tc>
-        <w:tc>
-          <w:tcPr>
-            <w:tcW w:w="1762" w:type="dxa"/>
-            <w:shd w:val="clear" w:color="auto" w:fill="343A40"/>
-            <w:tcMar>
-              <w:top w:w="60" w:type="dxa"/>
-              <w:left w:w="70" w:type="dxa"/>
-              <w:bottom w:w="60" w:type="dxa"/>
-              <w:right w:w="70" w:type="dxa"/>
-            </w:tcMar>
-          </w:tcPr>
-          <w:p>
-            <w:pPr>
-              <w:spacing w:after="0"/>
-            </w:pPr>
-            <w:r>
-              <w:rPr>
-                <w:b/>
-                <w:color w:val="FFFFFF"/>
-                <w:sz w:val="13"/>
-              </w:rPr>
-              <w:t>Platform</w:t>
-            </w:r>
-          </w:p>
-        </w:tc>
-        <w:tc>
-          <w:tcPr>
-            <w:tcW w:w="1762" w:type="dxa"/>
-            <w:shd w:val="clear" w:color="auto" w:fill="343A40"/>
-            <w:tcMar>
-              <w:top w:w="60" w:type="dxa"/>
-              <w:left w:w="70" w:type="dxa"/>
-              <w:bottom w:w="60" w:type="dxa"/>
-              <w:right w:w="70" w:type="dxa"/>
-            </w:tcMar>
-          </w:tcPr>
-          <w:p>
-            <w:pPr>
-              <w:spacing w:after="0"/>
-            </w:pPr>
-            <w:r>
-              <w:rPr>
-                <w:b/>
-                <w:color w:val="FFFFFF"/>
-                <w:sz w:val="13"/>
-              </w:rPr>
-              <w:t>Complete</w:t>
-            </w:r>
-          </w:p>
-        </w:tc>
-        <w:tc>
-          <w:tcPr>
-            <w:tcW w:w="1762" w:type="dxa"/>
-            <w:shd w:val="clear" w:color="auto" w:fill="343A40"/>
-            <w:tcMar>
-              <w:top w:w="60" w:type="dxa"/>
-              <w:left w:w="70" w:type="dxa"/>
-              <w:bottom w:w="60" w:type="dxa"/>
-              <w:right w:w="70" w:type="dxa"/>
-            </w:tcMar>
-          </w:tcPr>
-          <w:p>
-            <w:pPr>
-              <w:spacing w:after="0"/>
-            </w:pPr>
-            <w:r>
-              <w:rPr>
-                <w:b/>
-                <w:color w:val="FFFFFF"/>
-                <w:sz w:val="13"/>
-              </w:rPr>
-              <w:t>Code</w:t>
-            </w:r>
-          </w:p>
-        </w:tc>
-        <w:tc>
-          <w:tcPr>
-            <w:tcW w:w="1762" w:type="dxa"/>
-            <w:shd w:val="clear" w:color="auto" w:fill="343A40"/>
-            <w:tcMar>
-              <w:top w:w="60" w:type="dxa"/>
-              <w:left w:w="70" w:type="dxa"/>
-              <w:bottom w:w="60" w:type="dxa"/>
-              <w:right w:w="70" w:type="dxa"/>
-            </w:tcMar>
-          </w:tcPr>
-          <w:p>
-            <w:pPr>
-              <w:spacing w:after="0"/>
-            </w:pPr>
-            <w:r>
-              <w:rPr>
-                <w:b/>
-                <w:color w:val="FFFFFF"/>
-                <w:sz w:val="13"/>
-              </w:rPr>
-              <w:t>Author(s)</w:t>
-            </w:r>
-          </w:p>
-        </w:tc>
-        <w:tc>
-          <w:tcPr>
-            <w:tcW w:w="1762" w:type="dxa"/>
-            <w:shd w:val="clear" w:color="auto" w:fill="343A40"/>
-            <w:tcMar>
-              <w:top w:w="60" w:type="dxa"/>
-              <w:left w:w="70" w:type="dxa"/>
-              <w:bottom w:w="60" w:type="dxa"/>
-              <w:right w:w="70" w:type="dxa"/>
-            </w:tcMar>
-          </w:tcPr>
-          <w:p>
-            <w:pPr>
-              <w:spacing w:after="0"/>
-            </w:pPr>
-            <w:r>
-              <w:rPr>
-                <w:b/>
-                <w:color w:val="FFFFFF"/>
-                <w:sz w:val="13"/>
-              </w:rPr>
-              <w:t>Notes</w:t>
             </w:r>
           </w:p>
         </w:tc>
@@ -5138,12 +4961,15 @@
           <w:p>
             <w:pPr>
               <w:spacing w:after="0"/>
+              <w:rPr>
+                <w:sz w:val="13"/>
+              </w:rPr>
             </w:pPr>
             <w:r>
               <w:rPr>
                 <w:sz w:val="13"/>
               </w:rPr>
-              <w:t>Prepare final Calgary modeling table</w:t>
+              <w:t>Export evaluation evidence</w:t>
             </w:r>
           </w:p>
         </w:tc>
@@ -5160,6 +4986,9 @@
           <w:p>
             <w:pPr>
               <w:spacing w:after="0"/>
+              <w:rPr>
+                <w:sz w:val="13"/>
+              </w:rPr>
             </w:pPr>
             <w:r>
               <w:rPr>
@@ -5182,12 +5011,15 @@
           <w:p>
             <w:pPr>
               <w:spacing w:after="0"/>
+              <w:rPr>
+                <w:sz w:val="13"/>
+              </w:rPr>
             </w:pPr>
             <w:r>
               <w:rPr>
                 <w:sz w:val="13"/>
               </w:rPr>
-              <w:t>4/5</w:t>
+              <w:t>5/5</w:t>
             </w:r>
           </w:p>
         </w:tc>
@@ -5204,6 +5036,9 @@
           <w:p>
             <w:pPr>
               <w:spacing w:after="0"/>
+              <w:rPr>
+                <w:sz w:val="13"/>
+              </w:rPr>
             </w:pPr>
             <w:r>
               <w:rPr>
@@ -5226,12 +5061,15 @@
           <w:p>
             <w:pPr>
               <w:spacing w:after="0"/>
+              <w:rPr>
+                <w:sz w:val="13"/>
+              </w:rPr>
             </w:pPr>
             <w:r>
               <w:rPr>
                 <w:sz w:val="13"/>
               </w:rPr>
-              <w:t>Finley Thomson</w:t>
+              <w:t>Jarrod Hwang</w:t>
             </w:r>
           </w:p>
         </w:tc>
@@ -5248,155 +5086,15 @@
           <w:p>
             <w:pPr>
               <w:spacing w:after="0"/>
+              <w:rPr>
+                <w:sz w:val="13"/>
+              </w:rPr>
             </w:pPr>
             <w:r>
               <w:rPr>
                 <w:sz w:val="13"/>
               </w:rPr>
-              <w:t>224-row CSV is validated for model inputs; raw preparation involved manual historical steps.</w:t>
-            </w:r>
-          </w:p>
-        </w:tc>
-      </w:tr>
-      <w:tr>
-        <w:trPr>
-          <w:jc w:val="center"/>
-        </w:trPr>
-        <w:tc>
-          <w:tcPr>
-            <w:tcW w:w="1762" w:type="dxa"/>
-            <w:shd w:val="clear" w:color="auto" w:fill="F4F5F6"/>
-            <w:tcMar>
-              <w:top w:w="60" w:type="dxa"/>
-              <w:left w:w="70" w:type="dxa"/>
-              <w:bottom w:w="60" w:type="dxa"/>
-              <w:right w:w="70" w:type="dxa"/>
-            </w:tcMar>
-          </w:tcPr>
-          <w:p>
-            <w:pPr>
-              <w:spacing w:after="0"/>
-            </w:pPr>
-            <w:r>
-              <w:rPr>
-                <w:sz w:val="13"/>
-              </w:rPr>
-              <w:t>Generate fold-local synthetic records</w:t>
-            </w:r>
-          </w:p>
-        </w:tc>
-        <w:tc>
-          <w:tcPr>
-            <w:tcW w:w="1762" w:type="dxa"/>
-            <w:shd w:val="clear" w:color="auto" w:fill="F4F5F6"/>
-            <w:tcMar>
-              <w:top w:w="60" w:type="dxa"/>
-              <w:left w:w="70" w:type="dxa"/>
-              <w:bottom w:w="60" w:type="dxa"/>
-              <w:right w:w="70" w:type="dxa"/>
-            </w:tcMar>
-          </w:tcPr>
-          <w:p>
-            <w:pPr>
-              <w:spacing w:after="0"/>
-            </w:pPr>
-            <w:r>
-              <w:rPr>
-                <w:sz w:val="13"/>
-              </w:rPr>
-              <w:t>Local</w:t>
-            </w:r>
-          </w:p>
-        </w:tc>
-        <w:tc>
-          <w:tcPr>
-            <w:tcW w:w="1762" w:type="dxa"/>
-            <w:shd w:val="clear" w:color="auto" w:fill="F4F5F6"/>
-            <w:tcMar>
-              <w:top w:w="60" w:type="dxa"/>
-              <w:left w:w="70" w:type="dxa"/>
-              <w:bottom w:w="60" w:type="dxa"/>
-              <w:right w:w="70" w:type="dxa"/>
-            </w:tcMar>
-          </w:tcPr>
-          <w:p>
-            <w:pPr>
-              <w:spacing w:after="0"/>
-            </w:pPr>
-            <w:r>
-              <w:rPr>
-                <w:sz w:val="13"/>
-              </w:rPr>
-              <w:t>4/5</w:t>
-            </w:r>
-          </w:p>
-        </w:tc>
-        <w:tc>
-          <w:tcPr>
-            <w:tcW w:w="1762" w:type="dxa"/>
-            <w:shd w:val="clear" w:color="auto" w:fill="F4F5F6"/>
-            <w:tcMar>
-              <w:top w:w="60" w:type="dxa"/>
-              <w:left w:w="70" w:type="dxa"/>
-              <w:bottom w:w="60" w:type="dxa"/>
-              <w:right w:w="70" w:type="dxa"/>
-            </w:tcMar>
-          </w:tcPr>
-          <w:p>
-            <w:pPr>
-              <w:spacing w:after="0"/>
-            </w:pPr>
-            <w:r>
-              <w:rPr>
-                <w:sz w:val="13"/>
-              </w:rPr>
-              <w:t>Python</w:t>
-            </w:r>
-          </w:p>
-        </w:tc>
-        <w:tc>
-          <w:tcPr>
-            <w:tcW w:w="1762" w:type="dxa"/>
-            <w:shd w:val="clear" w:color="auto" w:fill="F4F5F6"/>
-            <w:tcMar>
-              <w:top w:w="60" w:type="dxa"/>
-              <w:left w:w="70" w:type="dxa"/>
-              <w:bottom w:w="60" w:type="dxa"/>
-              <w:right w:w="70" w:type="dxa"/>
-            </w:tcMar>
-          </w:tcPr>
-          <w:p>
-            <w:pPr>
-              <w:spacing w:after="0"/>
-            </w:pPr>
-            <w:r>
-              <w:rPr>
-                <w:sz w:val="13"/>
-              </w:rPr>
-              <w:t>Finley Thomson; Jarrod Hwang</w:t>
-            </w:r>
-          </w:p>
-        </w:tc>
-        <w:tc>
-          <w:tcPr>
-            <w:tcW w:w="1762" w:type="dxa"/>
-            <w:shd w:val="clear" w:color="auto" w:fill="F4F5F6"/>
-            <w:tcMar>
-              <w:top w:w="60" w:type="dxa"/>
-              <w:left w:w="70" w:type="dxa"/>
-              <w:bottom w:w="60" w:type="dxa"/>
-              <w:right w:w="70" w:type="dxa"/>
-            </w:tcMar>
-          </w:tcPr>
-          <w:p>
-            <w:pPr>
-              <w:spacing w:after="0"/>
-            </w:pPr>
-            <w:r>
-              <w:rPr>
-                <w:sz w:val="13"/>
-              </w:rPr>
-              <w:t>Seeded and integrated. Training-fold isolation prevents direct test leakage; augmentation reduced performance.</w:t>
+              <w:t>Produces JSON/CSV summaries, class/fold metrics, matrices, plots, hash, and manifest.</w:t>
             </w:r>
           </w:p>
         </w:tc>
@@ -5418,12 +5116,17 @@
           <w:p>
             <w:pPr>
               <w:spacing w:after="0"/>
+              <w:rPr>
+                <w:rFonts w:hint="eastAsia"/>
+                <w:sz w:val="13"/>
+              </w:rPr>
             </w:pPr>
             <w:r>
               <w:rPr>
+                <w:rFonts w:hint="eastAsia"/>
                 <w:sz w:val="13"/>
               </w:rPr>
-              <w:t>Implement custom tree and forest</w:t>
+              <w:t xml:space="preserve">Hyperparameter Tuning and Final Training </w:t>
             </w:r>
           </w:p>
         </w:tc>
@@ -5440,9 +5143,14 @@
           <w:p>
             <w:pPr>
               <w:spacing w:after="0"/>
+              <w:rPr>
+                <w:rFonts w:hint="eastAsia"/>
+                <w:sz w:val="13"/>
+              </w:rPr>
             </w:pPr>
             <w:r>
               <w:rPr>
+                <w:rFonts w:hint="eastAsia"/>
                 <w:sz w:val="13"/>
               </w:rPr>
               <w:t>Local</w:t>
@@ -5462,12 +5170,17 @@
           <w:p>
             <w:pPr>
               <w:spacing w:after="0"/>
+              <w:rPr>
+                <w:rFonts w:hint="eastAsia"/>
+                <w:sz w:val="13"/>
+              </w:rPr>
             </w:pPr>
             <w:r>
               <w:rPr>
+                <w:rFonts w:hint="eastAsia"/>
                 <w:sz w:val="13"/>
               </w:rPr>
-              <w:t>4/5</w:t>
+              <w:t>5/5</w:t>
             </w:r>
           </w:p>
         </w:tc>
@@ -5484,9 +5197,14 @@
           <w:p>
             <w:pPr>
               <w:spacing w:after="0"/>
+              <w:rPr>
+                <w:rFonts w:hint="eastAsia"/>
+                <w:sz w:val="13"/>
+              </w:rPr>
             </w:pPr>
             <w:r>
               <w:rPr>
+                <w:rFonts w:hint="eastAsia"/>
                 <w:sz w:val="13"/>
               </w:rPr>
               <w:t>Python</w:t>
@@ -5506,12 +5224,17 @@
           <w:p>
             <w:pPr>
               <w:spacing w:after="0"/>
+              <w:rPr>
+                <w:rFonts w:hint="eastAsia"/>
+                <w:sz w:val="13"/>
+              </w:rPr>
             </w:pPr>
             <w:r>
               <w:rPr>
+                <w:rFonts w:hint="eastAsia"/>
                 <w:sz w:val="13"/>
               </w:rPr>
-              <w:t>Finley Thomson; Jarrod Hwang</w:t>
+              <w:t>Finley Thomson</w:t>
             </w:r>
           </w:p>
         </w:tc>
@@ -5528,156 +5251,33 @@
           <w:p>
             <w:pPr>
               <w:spacing w:after="0"/>
+              <w:rPr>
+                <w:rFonts w:hint="eastAsia"/>
+                <w:sz w:val="13"/>
+              </w:rPr>
             </w:pPr>
             <w:r>
               <w:rPr>
+                <w:rFonts w:hint="eastAsia"/>
                 <w:sz w:val="13"/>
               </w:rPr>
-              <w:t>Working and reproducible; slower than scikit-learn and has limited boundary coverage.</w:t>
-            </w:r>
-          </w:p>
-        </w:tc>
-      </w:tr>
-      <w:tr>
-        <w:trPr>
-          <w:jc w:val="center"/>
-        </w:trPr>
-        <w:tc>
-          <w:tcPr>
-            <w:tcW w:w="1762" w:type="dxa"/>
-            <w:shd w:val="clear" w:color="auto" w:fill="F4F5F6"/>
-            <w:tcMar>
-              <w:top w:w="60" w:type="dxa"/>
-              <w:left w:w="70" w:type="dxa"/>
-              <w:bottom w:w="60" w:type="dxa"/>
-              <w:right w:w="70" w:type="dxa"/>
-            </w:tcMar>
-          </w:tcPr>
-          <w:p>
-            <w:pPr>
-              <w:spacing w:after="0"/>
-            </w:pPr>
-            <w:r>
-              <w:rPr>
+              <w:t xml:space="preserve">Performing a random grid search to attempt to find optimal hyperparameter values before training a </w:t>
+            </w:r>
+            <w:proofErr w:type="gramStart"/>
+            <w:r>
+              <w:rPr>
+                <w:rFonts w:hint="eastAsia"/>
                 <w:sz w:val="13"/>
               </w:rPr>
-              <w:lastRenderedPageBreak/>
-              <w:t>Leakage-safe stratified CV</w:t>
-            </w:r>
-          </w:p>
-        </w:tc>
-        <w:tc>
-          <w:tcPr>
-            <w:tcW w:w="1762" w:type="dxa"/>
-            <w:shd w:val="clear" w:color="auto" w:fill="F4F5F6"/>
-            <w:tcMar>
-              <w:top w:w="60" w:type="dxa"/>
-              <w:left w:w="70" w:type="dxa"/>
-              <w:bottom w:w="60" w:type="dxa"/>
-              <w:right w:w="70" w:type="dxa"/>
-            </w:tcMar>
-          </w:tcPr>
-          <w:p>
-            <w:pPr>
-              <w:spacing w:after="0"/>
-            </w:pPr>
-            <w:r>
-              <w:rPr>
+              <w:t>storing models</w:t>
+            </w:r>
+            <w:proofErr w:type="gramEnd"/>
+            <w:r>
+              <w:rPr>
+                <w:rFonts w:hint="eastAsia"/>
                 <w:sz w:val="13"/>
               </w:rPr>
-              <w:t>Local</w:t>
-            </w:r>
-          </w:p>
-        </w:tc>
-        <w:tc>
-          <w:tcPr>
-            <w:tcW w:w="1762" w:type="dxa"/>
-            <w:shd w:val="clear" w:color="auto" w:fill="F4F5F6"/>
-            <w:tcMar>
-              <w:top w:w="60" w:type="dxa"/>
-              <w:left w:w="70" w:type="dxa"/>
-              <w:bottom w:w="60" w:type="dxa"/>
-              <w:right w:w="70" w:type="dxa"/>
-            </w:tcMar>
-          </w:tcPr>
-          <w:p>
-            <w:pPr>
-              <w:spacing w:after="0"/>
-            </w:pPr>
-            <w:r>
-              <w:rPr>
-                <w:sz w:val="13"/>
-              </w:rPr>
-              <w:t>5/5</w:t>
-            </w:r>
-          </w:p>
-        </w:tc>
-        <w:tc>
-          <w:tcPr>
-            <w:tcW w:w="1762" w:type="dxa"/>
-            <w:shd w:val="clear" w:color="auto" w:fill="F4F5F6"/>
-            <w:tcMar>
-              <w:top w:w="60" w:type="dxa"/>
-              <w:left w:w="70" w:type="dxa"/>
-              <w:bottom w:w="60" w:type="dxa"/>
-              <w:right w:w="70" w:type="dxa"/>
-            </w:tcMar>
-          </w:tcPr>
-          <w:p>
-            <w:pPr>
-              <w:spacing w:after="0"/>
-            </w:pPr>
-            <w:r>
-              <w:rPr>
-                <w:sz w:val="13"/>
-              </w:rPr>
-              <w:t>Python</w:t>
-            </w:r>
-          </w:p>
-        </w:tc>
-        <w:tc>
-          <w:tcPr>
-            <w:tcW w:w="1762" w:type="dxa"/>
-            <w:shd w:val="clear" w:color="auto" w:fill="F4F5F6"/>
-            <w:tcMar>
-              <w:top w:w="60" w:type="dxa"/>
-              <w:left w:w="70" w:type="dxa"/>
-              <w:bottom w:w="60" w:type="dxa"/>
-              <w:right w:w="70" w:type="dxa"/>
-            </w:tcMar>
-          </w:tcPr>
-          <w:p>
-            <w:pPr>
-              <w:spacing w:after="0"/>
-            </w:pPr>
-            <w:r>
-              <w:rPr>
-                <w:sz w:val="13"/>
-              </w:rPr>
-              <w:t>Finley Thomson; Jarrod Hwang</w:t>
-            </w:r>
-          </w:p>
-        </w:tc>
-        <w:tc>
-          <w:tcPr>
-            <w:tcW w:w="1762" w:type="dxa"/>
-            <w:shd w:val="clear" w:color="auto" w:fill="F4F5F6"/>
-            <w:tcMar>
-              <w:top w:w="60" w:type="dxa"/>
-              <w:left w:w="70" w:type="dxa"/>
-              <w:bottom w:w="60" w:type="dxa"/>
-              <w:right w:w="70" w:type="dxa"/>
-            </w:tcMar>
-          </w:tcPr>
-          <w:p>
-            <w:pPr>
-              <w:spacing w:after="0"/>
-            </w:pPr>
-            <w:r>
-              <w:rPr>
-                <w:sz w:val="13"/>
-              </w:rPr>
-              <w:t>Five folds, real held-out evidence, fold-local generation, and deterministic configuration.</w:t>
+              <w:t xml:space="preserve"> for interfacing.</w:t>
             </w:r>
           </w:p>
         </w:tc>
@@ -5699,12 +5299,17 @@
           <w:p>
             <w:pPr>
               <w:spacing w:after="0"/>
+              <w:rPr>
+                <w:rFonts w:hint="eastAsia"/>
+                <w:sz w:val="13"/>
+              </w:rPr>
             </w:pPr>
             <w:r>
               <w:rPr>
+                <w:rFonts w:hint="eastAsia"/>
                 <w:sz w:val="13"/>
               </w:rPr>
-              <w:t>Compare baseline and sklearn RF</w:t>
+              <w:t>Website Interface Design</w:t>
             </w:r>
           </w:p>
         </w:tc>
@@ -5721,9 +5326,14 @@
           <w:p>
             <w:pPr>
               <w:spacing w:after="0"/>
+              <w:rPr>
+                <w:rFonts w:hint="eastAsia"/>
+                <w:sz w:val="13"/>
+              </w:rPr>
             </w:pPr>
             <w:r>
               <w:rPr>
+                <w:rFonts w:hint="eastAsia"/>
                 <w:sz w:val="13"/>
               </w:rPr>
               <w:t>Local</w:t>
@@ -5743,9 +5353,14 @@
           <w:p>
             <w:pPr>
               <w:spacing w:after="0"/>
+              <w:rPr>
+                <w:rFonts w:hint="eastAsia"/>
+                <w:sz w:val="13"/>
+              </w:rPr>
             </w:pPr>
             <w:r>
               <w:rPr>
+                <w:rFonts w:hint="eastAsia"/>
                 <w:sz w:val="13"/>
               </w:rPr>
               <w:t>5/5</w:t>
@@ -5765,12 +5380,17 @@
           <w:p>
             <w:pPr>
               <w:spacing w:after="0"/>
+              <w:rPr>
+                <w:rFonts w:hint="eastAsia"/>
+                <w:sz w:val="13"/>
+              </w:rPr>
             </w:pPr>
             <w:r>
               <w:rPr>
+                <w:rFonts w:hint="eastAsia"/>
                 <w:sz w:val="13"/>
               </w:rPr>
-              <w:t>Python</w:t>
+              <w:t>HTML, CSS, and JavaScript</w:t>
             </w:r>
           </w:p>
         </w:tc>
@@ -5787,12 +5407,17 @@
           <w:p>
             <w:pPr>
               <w:spacing w:after="0"/>
+              <w:rPr>
+                <w:rFonts w:hint="eastAsia"/>
+                <w:sz w:val="13"/>
+              </w:rPr>
             </w:pPr>
             <w:r>
               <w:rPr>
+                <w:rFonts w:hint="eastAsia"/>
                 <w:sz w:val="13"/>
               </w:rPr>
-              <w:t>Jarrod Hwang</w:t>
+              <w:t>Finley Thomson</w:t>
             </w:r>
           </w:p>
         </w:tc>
@@ -5809,12 +5434,17 @@
           <w:p>
             <w:pPr>
               <w:spacing w:after="0"/>
+              <w:rPr>
+                <w:rFonts w:hint="eastAsia"/>
+                <w:sz w:val="13"/>
+              </w:rPr>
             </w:pPr>
             <w:r>
               <w:rPr>
+                <w:rFonts w:hint="eastAsia"/>
                 <w:sz w:val="13"/>
               </w:rPr>
-              <w:t>Canonical CLI reports accuracy, macro-F1, ordinal error, and severe errors.</w:t>
+              <w:t>Creating and designing website interface for ease of user input.</w:t>
             </w:r>
           </w:p>
         </w:tc>
@@ -5826,7 +5456,6 @@
         <w:tc>
           <w:tcPr>
             <w:tcW w:w="1762" w:type="dxa"/>
-            <w:shd w:val="clear" w:color="auto" w:fill="F4F5F6"/>
             <w:tcMar>
               <w:top w:w="60" w:type="dxa"/>
               <w:left w:w="70" w:type="dxa"/>
@@ -5837,19 +5466,23 @@
           <w:p>
             <w:pPr>
               <w:spacing w:after="0"/>
+              <w:rPr>
+                <w:rFonts w:hint="eastAsia"/>
+                <w:sz w:val="13"/>
+              </w:rPr>
             </w:pPr>
             <w:r>
               <w:rPr>
+                <w:rFonts w:hint="eastAsia"/>
                 <w:sz w:val="13"/>
               </w:rPr>
-              <w:t>Export evaluation evidence</w:t>
+              <w:t>Website Integration</w:t>
             </w:r>
           </w:p>
         </w:tc>
         <w:tc>
           <w:tcPr>
             <w:tcW w:w="1762" w:type="dxa"/>
-            <w:shd w:val="clear" w:color="auto" w:fill="F4F5F6"/>
             <w:tcMar>
               <w:top w:w="60" w:type="dxa"/>
               <w:left w:w="70" w:type="dxa"/>
@@ -5860,9 +5493,14 @@
           <w:p>
             <w:pPr>
               <w:spacing w:after="0"/>
+              <w:rPr>
+                <w:rFonts w:hint="eastAsia"/>
+                <w:sz w:val="13"/>
+              </w:rPr>
             </w:pPr>
             <w:r>
               <w:rPr>
+                <w:rFonts w:hint="eastAsia"/>
                 <w:sz w:val="13"/>
               </w:rPr>
               <w:t>Local</w:t>
@@ -5872,7 +5510,6 @@
         <w:tc>
           <w:tcPr>
             <w:tcW w:w="1762" w:type="dxa"/>
-            <w:shd w:val="clear" w:color="auto" w:fill="F4F5F6"/>
             <w:tcMar>
               <w:top w:w="60" w:type="dxa"/>
               <w:left w:w="70" w:type="dxa"/>
@@ -5883,9 +5520,14 @@
           <w:p>
             <w:pPr>
               <w:spacing w:after="0"/>
+              <w:rPr>
+                <w:rFonts w:hint="eastAsia"/>
+                <w:sz w:val="13"/>
+              </w:rPr>
             </w:pPr>
             <w:r>
               <w:rPr>
+                <w:rFonts w:hint="eastAsia"/>
                 <w:sz w:val="13"/>
               </w:rPr>
               <w:t>5/5</w:t>
@@ -5895,7 +5537,6 @@
         <w:tc>
           <w:tcPr>
             <w:tcW w:w="1762" w:type="dxa"/>
-            <w:shd w:val="clear" w:color="auto" w:fill="F4F5F6"/>
             <w:tcMar>
               <w:top w:w="60" w:type="dxa"/>
               <w:left w:w="70" w:type="dxa"/>
@@ -5906,19 +5547,23 @@
           <w:p>
             <w:pPr>
               <w:spacing w:after="0"/>
+              <w:rPr>
+                <w:rFonts w:hint="eastAsia"/>
+                <w:sz w:val="13"/>
+              </w:rPr>
             </w:pPr>
             <w:r>
               <w:rPr>
+                <w:rFonts w:hint="eastAsia"/>
                 <w:sz w:val="13"/>
               </w:rPr>
-              <w:t>Python</w:t>
+              <w:t>Python, JavaScript, HTML</w:t>
             </w:r>
           </w:p>
         </w:tc>
         <w:tc>
           <w:tcPr>
             <w:tcW w:w="1762" w:type="dxa"/>
-            <w:shd w:val="clear" w:color="auto" w:fill="F4F5F6"/>
             <w:tcMar>
               <w:top w:w="60" w:type="dxa"/>
               <w:left w:w="70" w:type="dxa"/>
@@ -5929,19 +5574,23 @@
           <w:p>
             <w:pPr>
               <w:spacing w:after="0"/>
+              <w:rPr>
+                <w:rFonts w:hint="eastAsia"/>
+                <w:sz w:val="13"/>
+              </w:rPr>
             </w:pPr>
             <w:r>
               <w:rPr>
+                <w:rFonts w:hint="eastAsia"/>
                 <w:sz w:val="13"/>
               </w:rPr>
-              <w:t>Jarrod Hwang</w:t>
+              <w:t>Finley Thomson</w:t>
             </w:r>
           </w:p>
         </w:tc>
         <w:tc>
           <w:tcPr>
             <w:tcW w:w="1762" w:type="dxa"/>
-            <w:shd w:val="clear" w:color="auto" w:fill="F4F5F6"/>
             <w:tcMar>
               <w:top w:w="60" w:type="dxa"/>
               <w:left w:w="70" w:type="dxa"/>
@@ -5952,17 +5601,24 @@
           <w:p>
             <w:pPr>
               <w:spacing w:after="0"/>
+              <w:rPr>
+                <w:rFonts w:hint="eastAsia"/>
+                <w:sz w:val="13"/>
+              </w:rPr>
             </w:pPr>
             <w:r>
               <w:rPr>
+                <w:rFonts w:hint="eastAsia"/>
                 <w:sz w:val="13"/>
               </w:rPr>
-              <w:t>Produces JSON/CSV summaries, class/fold metrics, matrices, plots, hash, and manifest.</w:t>
+              <w:t>Integration of website interface with models, converts address, community, purchase price, and est. units to full data point to predict and display ROI.</w:t>
             </w:r>
           </w:p>
         </w:tc>
       </w:tr>
     </w:tbl>
+    <w:p/>
+    <w:p/>
     <w:p>
       <w:pPr>
         <w:pStyle w:val="Heading2"/>
@@ -6501,7 +6157,7 @@
                     <w:rPr>
                       <w:sz w:val="14"/>
                     </w:rPr>
-                    <w:t>Folds, scaling, baseline, RF, metrics.</w:t>
+                    <w:t>Folds, scaling, baseline, metrics.</w:t>
                   </w:r>
                 </w:p>
               </w:tc>

</xml_diff>

<commit_message>
removed  some real datapoints from the set to have as user examples for website
</commit_message>
<xml_diff>
--- a/submission/CMPT310_Group14_Project_Writeup.docx
+++ b/submission/CMPT310_Group14_Project_Writeup.docx
@@ -6,6 +6,8 @@
       <w:pPr>
         <w:spacing w:after="40"/>
       </w:pPr>
+      <w:bookmarkStart w:id="0" w:name="_Hlk237251209"/>
+      <w:bookmarkEnd w:id="0"/>
       <w:r>
         <w:rPr>
           <w:b/>
@@ -63,7 +65,6 @@
       <w:r>
         <w:t>1</w:t>
       </w:r>
-      <w:proofErr w:type="gramStart"/>
       <w:r>
         <w:t>.</w:t>
       </w:r>
@@ -75,15 +76,7 @@
           <w:rFonts w:hint="eastAsia"/>
           <w:lang w:eastAsia="ja-JP"/>
         </w:rPr>
-        <w:t>System</w:t>
-      </w:r>
-      <w:proofErr w:type="gramEnd"/>
-      <w:r>
-        <w:rPr>
-          <w:rFonts w:hint="eastAsia"/>
-          <w:lang w:eastAsia="ja-JP"/>
-        </w:rPr>
-        <w:t xml:space="preserve"> E</w:t>
+        <w:t>System E</w:t>
       </w:r>
       <w:r>
         <w:t>xplanation</w:t>
@@ -171,7 +164,7 @@
               <w:spacing w:after="0"/>
               <w:rPr>
                 <w:rFonts w:hint="eastAsia"/>
-                <w:highlight w:val="yellow"/>
+                <w:highlight w:val="cyan"/>
                 <w:lang w:eastAsia="ja-JP"/>
               </w:rPr>
             </w:pPr>
@@ -535,6 +528,7 @@
             <w:pPr>
               <w:jc w:val="center"/>
             </w:pPr>
+            <w:bookmarkStart w:id="1" w:name="_Hlk237251087"/>
             <w:r>
               <w:rPr>
                 <w:b/>
@@ -555,6 +549,7 @@
               </w:rPr>
               <w:t>Permits, assessments, income and amenities</w:t>
             </w:r>
+            <w:bookmarkEnd w:id="1"/>
           </w:p>
         </w:tc>
         <w:tc>
@@ -973,7 +968,6 @@
         </w:rPr>
         <w:t xml:space="preserve">Running the </w:t>
       </w:r>
-      <w:proofErr w:type="gramStart"/>
       <w:r>
         <w:rPr>
           <w:lang w:eastAsia="ja-JP"/>
@@ -994,7 +988,6 @@
         </w:rPr>
         <w:t>s</w:t>
       </w:r>
-      <w:proofErr w:type="gramEnd"/>
       <w:r>
         <w:rPr>
           <w:rFonts w:hint="eastAsia"/>
@@ -3014,15 +3007,7 @@
         <w:t>6</w:t>
       </w:r>
       <w:r>
-        <w:t xml:space="preserve"> predictions are severe </w:t>
-      </w:r>
-      <w:proofErr w:type="spellStart"/>
-      <w:r>
-        <w:t>Low↔High</w:t>
-      </w:r>
-      <w:proofErr w:type="spellEnd"/>
-      <w:r>
-        <w:t xml:space="preserve"> mistakes (</w:t>
+        <w:t xml:space="preserve"> predictions are severe Low↔High mistakes (</w:t>
       </w:r>
       <w:r>
         <w:rPr>
@@ -3122,23 +3107,7 @@
           <w:rFonts w:hint="eastAsia"/>
           <w:lang w:eastAsia="ja-JP"/>
         </w:rPr>
-        <w:t xml:space="preserve">Unfortunately, due to a lack of further, complete data available, alongside a highly limited universe of real-world data (given there are only so many townhomes in Calgary), the model is undercut by lacking a chance to discern broader patterns. Additionally, the features we have elected to use to glean </w:t>
-      </w:r>
-      <w:proofErr w:type="gramStart"/>
-      <w:r>
-        <w:rPr>
-          <w:rFonts w:hint="eastAsia"/>
-          <w:lang w:eastAsia="ja-JP"/>
-        </w:rPr>
-        <w:t>an ROI</w:t>
-      </w:r>
-      <w:proofErr w:type="gramEnd"/>
-      <w:r>
-        <w:rPr>
-          <w:rFonts w:hint="eastAsia"/>
-          <w:lang w:eastAsia="ja-JP"/>
-        </w:rPr>
-        <w:t xml:space="preserve"> classification, may simply not yield </w:t>
+        <w:t xml:space="preserve">Unfortunately, due to a lack of further, complete data available, alongside a highly limited universe of real-world data (given there are only so many townhomes in Calgary), the model is undercut by lacking a chance to discern broader patterns. Additionally, the features we have elected to use to glean an ROI classification, may simply not yield </w:t>
       </w:r>
       <w:r>
         <w:rPr>
@@ -3210,21 +3179,12 @@
           <w:lang w:eastAsia="ja-JP"/>
         </w:rPr>
       </w:pPr>
-      <w:proofErr w:type="gramStart"/>
       <w:r>
         <w:rPr>
           <w:rFonts w:hint="eastAsia"/>
           <w:lang w:eastAsia="ja-JP"/>
         </w:rPr>
-        <w:t>In an attempt to</w:t>
-      </w:r>
-      <w:proofErr w:type="gramEnd"/>
-      <w:r>
-        <w:rPr>
-          <w:rFonts w:hint="eastAsia"/>
-          <w:lang w:eastAsia="ja-JP"/>
-        </w:rPr>
-        <w:t xml:space="preserve"> mitigate these problems, we </w:t>
+        <w:t xml:space="preserve">In an attempt to mitigate these problems, we </w:t>
       </w:r>
       <w:r>
         <w:rPr>
@@ -3623,17 +3583,8 @@
                 <w:rFonts w:hint="eastAsia"/>
                 <w:sz w:val="13"/>
               </w:rPr>
-              <w:t xml:space="preserve">, Monem </w:t>
-            </w:r>
-            <w:proofErr w:type="spellStart"/>
-            <w:r>
-              <w:rPr>
-                <w:rFonts w:hint="eastAsia"/>
-                <w:sz w:val="13"/>
-              </w:rPr>
-              <w:t>Moheq</w:t>
-            </w:r>
-            <w:proofErr w:type="spellEnd"/>
+              <w:t>, Monem Moheq</w:t>
+            </w:r>
           </w:p>
         </w:tc>
         <w:tc>
@@ -3806,17 +3757,8 @@
                 <w:rFonts w:hint="eastAsia"/>
                 <w:sz w:val="13"/>
               </w:rPr>
-              <w:t xml:space="preserve">Finley Thomson, Monem </w:t>
-            </w:r>
-            <w:proofErr w:type="spellStart"/>
-            <w:r>
-              <w:rPr>
-                <w:rFonts w:hint="eastAsia"/>
-                <w:sz w:val="13"/>
-              </w:rPr>
-              <w:t>Moheq</w:t>
-            </w:r>
-            <w:proofErr w:type="spellEnd"/>
+              <w:t>Finley Thomson, Monem Moheq</w:t>
+            </w:r>
           </w:p>
         </w:tc>
         <w:tc>
@@ -4181,17 +4123,8 @@
                 <w:rFonts w:hint="eastAsia"/>
                 <w:sz w:val="13"/>
               </w:rPr>
-              <w:t xml:space="preserve">Finley Thomson, Monem </w:t>
-            </w:r>
-            <w:proofErr w:type="spellStart"/>
-            <w:r>
-              <w:rPr>
-                <w:rFonts w:hint="eastAsia"/>
-                <w:sz w:val="13"/>
-              </w:rPr>
-              <w:t>Moheq</w:t>
-            </w:r>
-            <w:proofErr w:type="spellEnd"/>
+              <w:t>Finley Thomson, Monem Moheq</w:t>
+            </w:r>
           </w:p>
         </w:tc>
         <w:tc>
@@ -4566,23 +4499,7 @@
                 <w:sz w:val="13"/>
               </w:rPr>
               <w:lastRenderedPageBreak/>
-              <w:t xml:space="preserve">multivariate lognormal </w:t>
-            </w:r>
-            <w:proofErr w:type="gramStart"/>
-            <w:r>
-              <w:rPr>
-                <w:rFonts w:hint="eastAsia"/>
-                <w:sz w:val="13"/>
-              </w:rPr>
-              <w:t>distribution;</w:t>
-            </w:r>
-            <w:proofErr w:type="gramEnd"/>
-            <w:r>
-              <w:rPr>
-                <w:rFonts w:hint="eastAsia"/>
-                <w:sz w:val="13"/>
-              </w:rPr>
-              <w:t xml:space="preserve"> more confirmation needed for validity of the distribution.</w:t>
+              <w:t>multivariate lognormal distribution; more confirmation needed for validity of the distribution.</w:t>
             </w:r>
           </w:p>
         </w:tc>
@@ -4787,23 +4704,7 @@
                 <w:rFonts w:hint="eastAsia"/>
                 <w:sz w:val="13"/>
               </w:rPr>
-              <w:t xml:space="preserve">and Evaluate Models (Including </w:t>
-            </w:r>
-            <w:proofErr w:type="spellStart"/>
-            <w:r>
-              <w:rPr>
-                <w:rFonts w:hint="eastAsia"/>
-                <w:sz w:val="13"/>
-              </w:rPr>
-              <w:t>sklearn</w:t>
-            </w:r>
-            <w:proofErr w:type="spellEnd"/>
-            <w:r>
-              <w:rPr>
-                <w:rFonts w:hint="eastAsia"/>
-                <w:sz w:val="13"/>
-              </w:rPr>
-              <w:t xml:space="preserve"> Random Forest and Baseline)</w:t>
+              <w:t>and Evaluate Models (Including sklearn Random Forest and Baseline)</w:t>
             </w:r>
           </w:p>
         </w:tc>
@@ -5261,23 +5162,7 @@
                 <w:rFonts w:hint="eastAsia"/>
                 <w:sz w:val="13"/>
               </w:rPr>
-              <w:t xml:space="preserve">Performing a random grid search to attempt to find optimal hyperparameter values before training a </w:t>
-            </w:r>
-            <w:proofErr w:type="gramStart"/>
-            <w:r>
-              <w:rPr>
-                <w:rFonts w:hint="eastAsia"/>
-                <w:sz w:val="13"/>
-              </w:rPr>
-              <w:t>storing models</w:t>
-            </w:r>
-            <w:proofErr w:type="gramEnd"/>
-            <w:r>
-              <w:rPr>
-                <w:rFonts w:hint="eastAsia"/>
-                <w:sz w:val="13"/>
-              </w:rPr>
-              <w:t xml:space="preserve"> for interfacing.</w:t>
+              <w:t>Performing a random grid search to attempt to find optimal hyperparameter values before training a storing models for interfacing.</w:t>
             </w:r>
           </w:p>
         </w:tc>
@@ -5617,8 +5502,6 @@
         </w:tc>
       </w:tr>
     </w:tbl>
-    <w:p/>
-    <w:p/>
     <w:p>
       <w:pPr>
         <w:pStyle w:val="Heading2"/>
@@ -5711,6 +5594,7 @@
               <w:rPr>
                 <w:rFonts w:ascii="Courier New" w:hAnsi="Courier New"/>
                 <w:sz w:val="15"/>
+                <w:highlight w:val="cyan"/>
               </w:rPr>
               <w:t>CMPT310_Group14_Code_Submission/</w:t>
             </w:r>
@@ -5718,6 +5602,7 @@
               <w:rPr>
                 <w:rFonts w:ascii="Courier New" w:hAnsi="Courier New"/>
                 <w:sz w:val="15"/>
+                <w:highlight w:val="cyan"/>
               </w:rPr>
               <w:br/>
               <w:t>├── Model/                 # evaluator, CV, metrics, custom tree/forest</w:t>
@@ -5726,6 +5611,7 @@
               <w:rPr>
                 <w:rFonts w:ascii="Courier New" w:hAnsi="Courier New"/>
                 <w:sz w:val="15"/>
+                <w:highlight w:val="cyan"/>
               </w:rPr>
               <w:br/>
               <w:t>├── Data/Code/             # fold-local synthetic generator</w:t>
@@ -5734,6 +5620,7 @@
               <w:rPr>
                 <w:rFonts w:ascii="Courier New" w:hAnsi="Courier New"/>
                 <w:sz w:val="15"/>
+                <w:highlight w:val="cyan"/>
               </w:rPr>
               <w:br/>
               <w:t>├── Data/CSVs/Sorted/      # final modeling table</w:t>
@@ -5742,6 +5629,7 @@
               <w:rPr>
                 <w:rFonts w:ascii="Courier New" w:hAnsi="Courier New"/>
                 <w:sz w:val="15"/>
+                <w:highlight w:val="cyan"/>
               </w:rPr>
               <w:br/>
               <w:t>├── Artifacts/Milestone2/  # figures, CSV and JSON evidence</w:t>
@@ -5750,6 +5638,7 @@
               <w:rPr>
                 <w:rFonts w:ascii="Courier New" w:hAnsi="Courier New"/>
                 <w:sz w:val="15"/>
+                <w:highlight w:val="cyan"/>
               </w:rPr>
               <w:br/>
               <w:t>├── tests/                 # deterministic checks</w:t>
@@ -5758,6 +5647,7 @@
               <w:rPr>
                 <w:rFonts w:ascii="Courier New" w:hAnsi="Courier New"/>
                 <w:sz w:val="15"/>
+                <w:highlight w:val="cyan"/>
               </w:rPr>
               <w:br/>
               <w:t>├── requirements*.txt</w:t>
@@ -5766,6 +5656,7 @@
               <w:rPr>
                 <w:rFonts w:ascii="Courier New" w:hAnsi="Courier New"/>
                 <w:sz w:val="15"/>
+                <w:highlight w:val="cyan"/>
               </w:rPr>
               <w:br/>
               <w:t>├── run_evaluation.sh / run_tests.sh</w:t>
@@ -5774,6 +5665,7 @@
               <w:rPr>
                 <w:rFonts w:ascii="Courier New" w:hAnsi="Courier New"/>
                 <w:sz w:val="15"/>
+                <w:highlight w:val="cyan"/>
               </w:rPr>
               <w:br/>
               <w:t>└── README.md</w:t>
@@ -5787,193 +5679,37 @@
         <w:pStyle w:val="Heading2"/>
       </w:pPr>
       <w:r>
+        <w:rPr>
+          <w:highlight w:val="cyan"/>
+        </w:rPr>
         <w:t>Practical software-quality assessment</w:t>
       </w:r>
     </w:p>
-    <w:tbl>
-      <w:tblPr>
-        <w:tblW w:w="0" w:type="auto"/>
-        <w:tblLook w:val="04A0" w:firstRow="1" w:lastRow="0" w:firstColumn="1" w:lastColumn="0" w:noHBand="0" w:noVBand="1"/>
-      </w:tblPr>
-      <w:tblGrid>
-        <w:gridCol w:w="3523"/>
-        <w:gridCol w:w="3523"/>
-        <w:gridCol w:w="3523"/>
-      </w:tblGrid>
-      <w:tr>
-        <w:tc>
-          <w:tcPr>
-            <w:tcW w:w="3523" w:type="dxa"/>
-            <w:shd w:val="clear" w:color="auto" w:fill="F4F5F6"/>
-          </w:tcPr>
-          <w:p>
-            <w:r>
-              <w:rPr>
-                <w:b/>
-                <w:color w:val="CC0633"/>
-              </w:rPr>
-              <w:t>Functional suitability</w:t>
-            </w:r>
-            <w:r>
-              <w:rPr>
-                <w:b/>
-                <w:color w:val="CC0633"/>
-              </w:rPr>
-              <w:br/>
-            </w:r>
-            <w:r>
-              <w:rPr>
-                <w:sz w:val="14"/>
-              </w:rPr>
-              <w:t>Evaluation, baseline, forests, metrics and artifacts work; no live inference UI is claimed.</w:t>
-            </w:r>
-          </w:p>
-        </w:tc>
-        <w:tc>
-          <w:tcPr>
-            <w:tcW w:w="3523" w:type="dxa"/>
-            <w:shd w:val="clear" w:color="auto" w:fill="F4F5F6"/>
-          </w:tcPr>
-          <w:p>
-            <w:r>
-              <w:rPr>
-                <w:b/>
-                <w:color w:val="CC0633"/>
-              </w:rPr>
-              <w:t>Reliability</w:t>
-            </w:r>
-            <w:r>
-              <w:rPr>
-                <w:b/>
-                <w:color w:val="CC0633"/>
-              </w:rPr>
-              <w:br/>
-            </w:r>
-            <w:r>
-              <w:rPr>
-                <w:sz w:val="14"/>
-              </w:rPr>
-              <w:t>Fixed seeds and held-out evidence support repeatability; the small dataset creates high variance.</w:t>
-            </w:r>
-          </w:p>
-        </w:tc>
-        <w:tc>
-          <w:tcPr>
-            <w:tcW w:w="3523" w:type="dxa"/>
-            <w:shd w:val="clear" w:color="auto" w:fill="F4F5F6"/>
-          </w:tcPr>
-          <w:p>
-            <w:r>
-              <w:rPr>
-                <w:b/>
-                <w:color w:val="CC0633"/>
-              </w:rPr>
-              <w:t>Performance</w:t>
-            </w:r>
-            <w:r>
-              <w:rPr>
-                <w:b/>
-                <w:color w:val="CC0633"/>
-              </w:rPr>
-              <w:br/>
-            </w:r>
-            <w:r>
-              <w:rPr>
-                <w:sz w:val="14"/>
-              </w:rPr>
-              <w:t>scikit-learn runs quickly; the custom implementation is deliberately opt-in.</w:t>
-            </w:r>
-          </w:p>
-        </w:tc>
-      </w:tr>
-      <w:tr>
-        <w:tc>
-          <w:tcPr>
-            <w:tcW w:w="3523" w:type="dxa"/>
-            <w:shd w:val="clear" w:color="auto" w:fill="F4F5F6"/>
-          </w:tcPr>
-          <w:p>
-            <w:r>
-              <w:rPr>
-                <w:b/>
-                <w:color w:val="CC0633"/>
-              </w:rPr>
-              <w:t>Maintainability</w:t>
-            </w:r>
-            <w:r>
-              <w:rPr>
-                <w:b/>
-                <w:color w:val="CC0633"/>
-              </w:rPr>
-              <w:br/>
-            </w:r>
-            <w:r>
-              <w:rPr>
-                <w:sz w:val="14"/>
-              </w:rPr>
-              <w:t>Evaluation responsibilities are separated; raw preprocessing remains outside the clean run path.</w:t>
-            </w:r>
-          </w:p>
-        </w:tc>
-        <w:tc>
-          <w:tcPr>
-            <w:tcW w:w="3523" w:type="dxa"/>
-            <w:shd w:val="clear" w:color="auto" w:fill="F4F5F6"/>
-          </w:tcPr>
-          <w:p>
-            <w:r>
-              <w:rPr>
-                <w:b/>
-                <w:color w:val="CC0633"/>
-              </w:rPr>
-              <w:t>Compatibility</w:t>
-            </w:r>
-            <w:r>
-              <w:rPr>
-                <w:b/>
-                <w:color w:val="CC0633"/>
-              </w:rPr>
-              <w:br/>
-            </w:r>
-            <w:r>
-              <w:rPr>
-                <w:sz w:val="14"/>
-              </w:rPr>
-              <w:t>Runs locally on Python 3.11+ from the included final CSV.</w:t>
-            </w:r>
-          </w:p>
-        </w:tc>
-        <w:tc>
-          <w:tcPr>
-            <w:tcW w:w="3523" w:type="dxa"/>
-            <w:shd w:val="clear" w:color="auto" w:fill="F4F5F6"/>
-          </w:tcPr>
-          <w:p>
-            <w:r>
-              <w:rPr>
-                <w:b/>
-                <w:color w:val="CC0633"/>
-              </w:rPr>
-              <w:t>Security and usability</w:t>
-            </w:r>
-            <w:r>
-              <w:rPr>
-                <w:b/>
-                <w:color w:val="CC0633"/>
-              </w:rPr>
-              <w:br/>
-            </w:r>
-            <w:r>
-              <w:rPr>
-                <w:sz w:val="14"/>
-              </w:rPr>
-              <w:t>No credentials or student IDs are included; explicit warnings reduce financial risk.</w:t>
-            </w:r>
-          </w:p>
-        </w:tc>
-      </w:tr>
-    </w:tbl>
     <w:p>
+      <w:pPr>
+        <w:pStyle w:val="Heading2"/>
+        <w:tabs>
+          <w:tab w:val="left" w:pos="6946"/>
+        </w:tabs>
+      </w:pPr>
+      <w:r>
+        <w:rPr>
+          <w:noProof/>
+        </w:rPr>
+        <w:drawing>
+          <wp:inline distT="0" distB="0" distL="0" distR="0" wp14:anchorId="5937D2AE" wp14:editId="792B469B">
+            <wp:extent cx="6705600" cy="2108200"/>
+            <wp:effectExtent l="0" t="0" r="0" b="25400"/>
+            <wp:docPr id="1765757694" name="Diagram 2"/>
+            <wp:cNvGraphicFramePr/>
+            <a:graphic xmlns:a="http://schemas.openxmlformats.org/drawingml/2006/main">
+              <a:graphicData uri="http://schemas.openxmlformats.org/drawingml/2006/diagram">
+                <dgm:relIds xmlns:dgm="http://schemas.openxmlformats.org/drawingml/2006/diagram" xmlns:r="http://schemas.openxmlformats.org/officeDocument/2006/relationships" r:dm="rId10" r:lo="rId11" r:qs="rId12" r:cs="rId13"/>
+              </a:graphicData>
+            </a:graphic>
+          </wp:inline>
+        </w:drawing>
+      </w:r>
       <w:r>
         <w:br w:type="page"/>
       </w:r>
@@ -5984,7 +5720,37 @@
       </w:pPr>
       <w:r>
         <w:lastRenderedPageBreak/>
-        <w:t>3. External tools, libraries, and data</w:t>
+        <w:t xml:space="preserve">3. External </w:t>
+      </w:r>
+      <w:r>
+        <w:rPr>
+          <w:rFonts w:hint="eastAsia"/>
+          <w:lang w:eastAsia="ja-JP"/>
+        </w:rPr>
+        <w:t>T</w:t>
+      </w:r>
+      <w:r>
+        <w:t xml:space="preserve">ools, </w:t>
+      </w:r>
+      <w:r>
+        <w:rPr>
+          <w:rFonts w:hint="eastAsia"/>
+          <w:lang w:eastAsia="ja-JP"/>
+        </w:rPr>
+        <w:t>L</w:t>
+      </w:r>
+      <w:r>
+        <w:t xml:space="preserve">ibraries, and </w:t>
+      </w:r>
+      <w:r>
+        <w:rPr>
+          <w:rFonts w:hint="eastAsia"/>
+          <w:lang w:eastAsia="ja-JP"/>
+        </w:rPr>
+        <w:t>D</w:t>
+      </w:r>
+      <w:r>
+        <w:t>ata</w:t>
       </w:r>
     </w:p>
     <w:tbl>
@@ -6015,13 +5781,13 @@
               <w:tblLook w:val="04A0" w:firstRow="1" w:lastRow="0" w:firstColumn="1" w:lastColumn="0" w:noHBand="0" w:noVBand="1"/>
             </w:tblPr>
             <w:tblGrid>
-              <w:gridCol w:w="2527"/>
-              <w:gridCol w:w="2542"/>
+              <w:gridCol w:w="2530"/>
+              <w:gridCol w:w="2539"/>
             </w:tblGrid>
             <w:tr>
               <w:tc>
                 <w:tcPr>
-                  <w:tcW w:w="2642" w:type="dxa"/>
+                  <w:tcW w:w="2530" w:type="dxa"/>
                   <w:shd w:val="clear" w:color="auto" w:fill="343A40"/>
                 </w:tcPr>
                 <w:p>
@@ -6036,7 +5802,7 @@
               </w:tc>
               <w:tc>
                 <w:tcPr>
-                  <w:tcW w:w="2642" w:type="dxa"/>
+                  <w:tcW w:w="2539" w:type="dxa"/>
                   <w:shd w:val="clear" w:color="auto" w:fill="343A40"/>
                 </w:tcPr>
                 <w:p>
@@ -6053,35 +5819,8 @@
             <w:tr>
               <w:tc>
                 <w:tcPr>
-                  <w:tcW w:w="2642" w:type="dxa"/>
-                </w:tcPr>
-                <w:p>
-                  <w:r>
-                    <w:rPr>
-                      <w:sz w:val="14"/>
-                    </w:rPr>
-                    <w:t>Python 3.12.13</w:t>
-                  </w:r>
-                </w:p>
-              </w:tc>
-              <w:tc>
-                <w:tcPr>
-                  <w:tcW w:w="2642" w:type="dxa"/>
-                </w:tcPr>
-                <w:p>
-                  <w:r>
-                    <w:rPr>
-                      <w:sz w:val="14"/>
-                    </w:rPr>
-                    <w:t>Tested runtime and CLI orchestration.</w:t>
-                  </w:r>
-                </w:p>
-              </w:tc>
-            </w:tr>
-            <w:tr>
-              <w:tc>
-                <w:tcPr>
-                  <w:tcW w:w="2642" w:type="dxa"/>
+                  <w:tcW w:w="2530" w:type="dxa"/>
+                  <w:vAlign w:val="center"/>
                 </w:tcPr>
                 <w:p>
                   <w:r>
@@ -6094,14 +5833,58 @@
               </w:tc>
               <w:tc>
                 <w:tcPr>
-                  <w:tcW w:w="2642" w:type="dxa"/>
+                  <w:tcW w:w="2539" w:type="dxa"/>
                 </w:tcPr>
                 <w:p>
+                  <w:pPr>
+                    <w:rPr>
+                      <w:rFonts w:hint="eastAsia"/>
+                      <w:lang w:eastAsia="ja-JP"/>
+                    </w:rPr>
+                  </w:pPr>
                   <w:r>
                     <w:rPr>
                       <w:sz w:val="14"/>
                     </w:rPr>
-                    <w:t>Arrays, sampling, covariance, numeric work.</w:t>
+                    <w:t>Arrays</w:t>
+                  </w:r>
+                  <w:r>
+                    <w:rPr>
+                      <w:rFonts w:hint="eastAsia"/>
+                      <w:sz w:val="14"/>
+                      <w:lang w:eastAsia="ja-JP"/>
+                    </w:rPr>
+                    <w:t>,</w:t>
+                  </w:r>
+                  <w:r>
+                    <w:rPr>
+                      <w:sz w:val="14"/>
+                    </w:rPr>
+                    <w:t xml:space="preserve"> </w:t>
+                  </w:r>
+                  <w:r>
+                    <w:rPr>
+                      <w:rFonts w:hint="eastAsia"/>
+                      <w:sz w:val="14"/>
+                      <w:lang w:eastAsia="ja-JP"/>
+                    </w:rPr>
+                    <w:t>vectorized math operations</w:t>
+                  </w:r>
+                  <w:r>
+                    <w:rPr>
+                      <w:rFonts w:hint="eastAsia"/>
+                      <w:sz w:val="14"/>
+                      <w:lang w:eastAsia="ja-JP"/>
+                    </w:rPr>
+                    <w:t xml:space="preserve">, </w:t>
+                  </w:r>
+                  <w:r>
+                    <w:rPr>
+                      <w:rFonts w:hint="eastAsia"/>
+                      <w:sz w:val="14"/>
+                      <w:lang w:eastAsia="ja-JP"/>
+                    </w:rPr>
+                    <w:t xml:space="preserve">normal + covariance matrices. </w:t>
                   </w:r>
                 </w:p>
               </w:tc>
@@ -6109,7 +5892,8 @@
             <w:tr>
               <w:tc>
                 <w:tcPr>
-                  <w:tcW w:w="2642" w:type="dxa"/>
+                  <w:tcW w:w="2530" w:type="dxa"/>
+                  <w:vAlign w:val="center"/>
                 </w:tcPr>
                 <w:p>
                   <w:r>
@@ -6122,7 +5906,7 @@
               </w:tc>
               <w:tc>
                 <w:tcPr>
-                  <w:tcW w:w="2642" w:type="dxa"/>
+                  <w:tcW w:w="2539" w:type="dxa"/>
                 </w:tcPr>
                 <w:p>
                   <w:r>
@@ -6137,7 +5921,8 @@
             <w:tr>
               <w:tc>
                 <w:tcPr>
-                  <w:tcW w:w="2642" w:type="dxa"/>
+                  <w:tcW w:w="2530" w:type="dxa"/>
+                  <w:vAlign w:val="center"/>
                 </w:tcPr>
                 <w:p>
                   <w:r>
@@ -6150,14 +5935,50 @@
               </w:tc>
               <w:tc>
                 <w:tcPr>
-                  <w:tcW w:w="2642" w:type="dxa"/>
+                  <w:tcW w:w="2539" w:type="dxa"/>
                 </w:tcPr>
                 <w:p>
                   <w:r>
                     <w:rPr>
+                      <w:rFonts w:hint="eastAsia"/>
+                      <w:sz w:val="14"/>
+                      <w:lang w:eastAsia="ja-JP"/>
+                    </w:rPr>
+                    <w:t>Indices for train/test splits</w:t>
+                  </w:r>
+                  <w:r>
+                    <w:rPr>
                       <w:sz w:val="14"/>
                     </w:rPr>
-                    <w:t>Folds, scaling, baseline, metrics.</w:t>
+                    <w:t xml:space="preserve">, </w:t>
+                  </w:r>
+                  <w:r>
+                    <w:rPr>
+                      <w:rFonts w:hint="eastAsia"/>
+                      <w:sz w:val="14"/>
+                      <w:lang w:eastAsia="ja-JP"/>
+                    </w:rPr>
+                    <w:t xml:space="preserve">standard </w:t>
+                  </w:r>
+                  <w:r>
+                    <w:rPr>
+                      <w:sz w:val="14"/>
+                    </w:rPr>
+                    <w:t>scaling, baseline</w:t>
+                  </w:r>
+                  <w:r>
+                    <w:rPr>
+                      <w:rFonts w:hint="eastAsia"/>
+                      <w:sz w:val="14"/>
+                      <w:lang w:eastAsia="ja-JP"/>
+                    </w:rPr>
+                    <w:t xml:space="preserve"> comparison model</w:t>
+                  </w:r>
+                  <w:r>
+                    <w:rPr>
+                      <w:sz w:val="14"/>
+                    </w:rPr>
+                    <w:t>, metrics.</w:t>
                   </w:r>
                 </w:p>
               </w:tc>
@@ -6165,7 +5986,8 @@
             <w:tr>
               <w:tc>
                 <w:tcPr>
-                  <w:tcW w:w="2642" w:type="dxa"/>
+                  <w:tcW w:w="2530" w:type="dxa"/>
+                  <w:vAlign w:val="center"/>
                 </w:tcPr>
                 <w:p>
                   <w:r>
@@ -6178,7 +6000,7 @@
               </w:tc>
               <w:tc>
                 <w:tcPr>
-                  <w:tcW w:w="2642" w:type="dxa"/>
+                  <w:tcW w:w="2539" w:type="dxa"/>
                 </w:tcPr>
                 <w:p>
                   <w:r>
@@ -6190,6 +6012,161 @@
                 </w:p>
               </w:tc>
             </w:tr>
+            <w:tr>
+              <w:tc>
+                <w:tcPr>
+                  <w:tcW w:w="2530" w:type="dxa"/>
+                  <w:vAlign w:val="center"/>
+                </w:tcPr>
+                <w:p>
+                  <w:pPr>
+                    <w:rPr>
+                      <w:rFonts w:hint="eastAsia"/>
+                      <w:sz w:val="14"/>
+                      <w:lang w:eastAsia="ja-JP"/>
+                    </w:rPr>
+                  </w:pPr>
+                  <w:r>
+                    <w:rPr>
+                      <w:rFonts w:hint="eastAsia"/>
+                      <w:sz w:val="14"/>
+                      <w:lang w:eastAsia="ja-JP"/>
+                    </w:rPr>
+                    <w:t>Flask</w:t>
+                  </w:r>
+                </w:p>
+              </w:tc>
+              <w:tc>
+                <w:tcPr>
+                  <w:tcW w:w="2539" w:type="dxa"/>
+                </w:tcPr>
+                <w:p>
+                  <w:pPr>
+                    <w:rPr>
+                      <w:rFonts w:hint="eastAsia"/>
+                      <w:sz w:val="14"/>
+                      <w:lang w:eastAsia="ja-JP"/>
+                    </w:rPr>
+                  </w:pPr>
+                  <w:r>
+                    <w:rPr>
+                      <w:rFonts w:hint="eastAsia"/>
+                      <w:sz w:val="14"/>
+                      <w:lang w:eastAsia="ja-JP"/>
+                    </w:rPr>
+                    <w:t>Framework to implement web interface.</w:t>
+                  </w:r>
+                </w:p>
+              </w:tc>
+            </w:tr>
+            <w:tr>
+              <w:tc>
+                <w:tcPr>
+                  <w:tcW w:w="2530" w:type="dxa"/>
+                  <w:vAlign w:val="center"/>
+                </w:tcPr>
+                <w:p>
+                  <w:pPr>
+                    <w:rPr>
+                      <w:rFonts w:hint="eastAsia"/>
+                      <w:sz w:val="14"/>
+                      <w:lang w:eastAsia="ja-JP"/>
+                    </w:rPr>
+                  </w:pPr>
+                  <w:r>
+                    <w:rPr>
+                      <w:rFonts w:hint="eastAsia"/>
+                      <w:sz w:val="14"/>
+                      <w:lang w:eastAsia="ja-JP"/>
+                    </w:rPr>
+                    <w:t>Haversine</w:t>
+                  </w:r>
+                </w:p>
+              </w:tc>
+              <w:tc>
+                <w:tcPr>
+                  <w:tcW w:w="2539" w:type="dxa"/>
+                </w:tcPr>
+                <w:p>
+                  <w:pPr>
+                    <w:rPr>
+                      <w:rFonts w:hint="eastAsia"/>
+                      <w:sz w:val="14"/>
+                      <w:lang w:eastAsia="ja-JP"/>
+                    </w:rPr>
+                  </w:pPr>
+                  <w:r>
+                    <w:rPr>
+                      <w:rFonts w:hint="eastAsia"/>
+                      <w:sz w:val="14"/>
+                      <w:lang w:eastAsia="ja-JP"/>
+                    </w:rPr>
+                    <w:t>Calculating distances between coordinates.</w:t>
+                  </w:r>
+                </w:p>
+              </w:tc>
+            </w:tr>
+            <w:tr>
+              <w:tc>
+                <w:tcPr>
+                  <w:tcW w:w="2530" w:type="dxa"/>
+                  <w:vAlign w:val="center"/>
+                </w:tcPr>
+                <w:p>
+                  <w:pPr>
+                    <w:rPr>
+                      <w:rFonts w:hint="eastAsia"/>
+                      <w:sz w:val="14"/>
+                      <w:lang w:eastAsia="ja-JP"/>
+                    </w:rPr>
+                  </w:pPr>
+                  <w:r>
+                    <w:rPr>
+                      <w:rFonts w:hint="eastAsia"/>
+                      <w:sz w:val="14"/>
+                      <w:lang w:eastAsia="ja-JP"/>
+                    </w:rPr>
+                    <w:t>Joblib</w:t>
+                  </w:r>
+                </w:p>
+              </w:tc>
+              <w:tc>
+                <w:tcPr>
+                  <w:tcW w:w="2539" w:type="dxa"/>
+                </w:tcPr>
+                <w:p>
+                  <w:pPr>
+                    <w:rPr>
+                      <w:rFonts w:hint="eastAsia"/>
+                      <w:sz w:val="14"/>
+                      <w:lang w:eastAsia="ja-JP"/>
+                    </w:rPr>
+                  </w:pPr>
+                  <w:r>
+                    <w:rPr>
+                      <w:rFonts w:hint="eastAsia"/>
+                      <w:sz w:val="14"/>
+                      <w:lang w:eastAsia="ja-JP"/>
+                    </w:rPr>
+                    <w:t>Storing trained models int pkl files.</w:t>
+                  </w:r>
+                </w:p>
+              </w:tc>
+            </w:tr>
+            <w:tr>
+              <w:tc>
+                <w:tcPr>
+                  <w:tcW w:w="2530" w:type="dxa"/>
+                </w:tcPr>
+                <w:p/>
+              </w:tc>
+              <w:tc>
+                <w:tcPr>
+                  <w:tcW w:w="2539" w:type="dxa"/>
+                </w:tcPr>
+                <w:p/>
+              </w:tc>
+            </w:tr>
           </w:tbl>
           <w:p/>
         </w:tc>
@@ -6253,6 +6230,16 @@
             </w:pPr>
             <w:r>
               <w:t>CMHC Housing Market Information Portal income tables.</w:t>
+            </w:r>
+          </w:p>
+          <w:p>
+            <w:pPr>
+              <w:pStyle w:val="ListBullet"/>
+              <w:spacing w:after="40"/>
+              <w:ind w:left="259" w:hanging="173"/>
+            </w:pPr>
+            <w:r>
+              <w:t>Calgary Community Social Statistic Profiles</w:t>
             </w:r>
           </w:p>
         </w:tc>
@@ -6263,84 +6250,590 @@
         <w:pStyle w:val="Heading2"/>
       </w:pPr>
       <w:r>
-        <w:t>Installation and execution</w:t>
+        <w:t xml:space="preserve">Installation and </w:t>
+      </w:r>
+      <w:r>
+        <w:rPr>
+          <w:rFonts w:hint="eastAsia"/>
+          <w:lang w:eastAsia="ja-JP"/>
+        </w:rPr>
+        <w:t>E</w:t>
+      </w:r>
+      <w:r>
+        <w:t>xecution</w:t>
       </w:r>
     </w:p>
-    <w:tbl>
-      <w:tblPr>
-        <w:tblW w:w="0" w:type="auto"/>
-        <w:tblBorders>
-          <w:top w:val="single" w:sz="6" w:space="0" w:color="C9CDD1"/>
-          <w:left w:val="single" w:sz="6" w:space="0" w:color="C9CDD1"/>
-          <w:bottom w:val="single" w:sz="6" w:space="0" w:color="C9CDD1"/>
-          <w:right w:val="single" w:sz="6" w:space="0" w:color="C9CDD1"/>
-          <w:insideH w:val="single" w:sz="6" w:space="0" w:color="C9CDD1"/>
-          <w:insideV w:val="single" w:sz="6" w:space="0" w:color="C9CDD1"/>
-        </w:tblBorders>
-        <w:tblLook w:val="04A0" w:firstRow="1" w:lastRow="0" w:firstColumn="1" w:lastColumn="0" w:noHBand="0" w:noVBand="1"/>
-      </w:tblPr>
-      <w:tblGrid>
-        <w:gridCol w:w="10570"/>
-      </w:tblGrid>
-      <w:tr>
-        <w:tc>
-          <w:tcPr>
-            <w:tcW w:w="10570" w:type="dxa"/>
-            <w:shd w:val="clear" w:color="auto" w:fill="F4F5F6"/>
-            <w:tcMar>
-              <w:top w:w="65" w:type="dxa"/>
-              <w:left w:w="90" w:type="dxa"/>
-              <w:bottom w:w="65" w:type="dxa"/>
-              <w:right w:w="90" w:type="dxa"/>
-            </w:tcMar>
-          </w:tcPr>
-          <w:p>
-            <w:pPr>
-              <w:spacing w:after="0"/>
-            </w:pPr>
-            <w:r>
-              <w:rPr>
-                <w:rFonts w:ascii="Courier New" w:hAnsi="Courier New"/>
-                <w:sz w:val="15"/>
-              </w:rPr>
-              <w:t>python -m venv .venv</w:t>
-            </w:r>
-            <w:r>
-              <w:rPr>
-                <w:rFonts w:ascii="Courier New" w:hAnsi="Courier New"/>
-                <w:sz w:val="15"/>
-              </w:rPr>
-              <w:br/>
-              <w:t>source .venv/bin/activate          # Windows: .venv\Scripts\activate</w:t>
-            </w:r>
-            <w:r>
-              <w:rPr>
-                <w:rFonts w:ascii="Courier New" w:hAnsi="Courier New"/>
-                <w:sz w:val="15"/>
-              </w:rPr>
-              <w:br/>
-              <w:t>python -m pip install -r requirements.txt</w:t>
-            </w:r>
-            <w:r>
-              <w:rPr>
-                <w:rFonts w:ascii="Courier New" w:hAnsi="Courier New"/>
-                <w:sz w:val="15"/>
-              </w:rPr>
-              <w:br/>
-              <w:t>python -m Model.EvaluateModels --models dummy sklearn --output-dir Artifacts/FinalRun</w:t>
-            </w:r>
-            <w:r>
-              <w:rPr>
-                <w:rFonts w:ascii="Courier New" w:hAnsi="Courier New"/>
-                <w:sz w:val="15"/>
-              </w:rPr>
-              <w:br/>
-              <w:t>python -m unittest discover -s tests -v</w:t>
-            </w:r>
-          </w:p>
-        </w:tc>
-      </w:tr>
-    </w:tbl>
+    <w:p>
+      <w:pPr>
+        <w:spacing w:after="0"/>
+        <w:rPr>
+          <w:lang w:eastAsia="ja-JP"/>
+        </w:rPr>
+      </w:pPr>
+      <w:r>
+        <w:rPr>
+          <w:rFonts w:hint="eastAsia"/>
+          <w:lang w:eastAsia="ja-JP"/>
+        </w:rPr>
+        <w:t>To run the main web interface, follow the following steps:</w:t>
+      </w:r>
+      <w:r>
+        <w:rPr>
+          <w:noProof/>
+          <w:lang w:eastAsia="ja-JP"/>
+        </w:rPr>
+        <mc:AlternateContent>
+          <mc:Choice Requires="wps">
+            <w:drawing>
+              <wp:anchor distT="45720" distB="45720" distL="114300" distR="114300" simplePos="0" relativeHeight="251654656" behindDoc="0" locked="0" layoutInCell="1" allowOverlap="1" wp14:anchorId="79BA0DCA" wp14:editId="6AA23127">
+                <wp:simplePos x="0" y="0"/>
+                <wp:positionH relativeFrom="column">
+                  <wp:posOffset>-40640</wp:posOffset>
+                </wp:positionH>
+                <wp:positionV relativeFrom="paragraph">
+                  <wp:posOffset>207010</wp:posOffset>
+                </wp:positionV>
+                <wp:extent cx="6898639" cy="565784"/>
+                <wp:effectExtent l="0" t="0" r="17145" b="17145"/>
+                <wp:wrapSquare wrapText="bothSides"/>
+                <wp:docPr id="217" name="Text Box 2"/>
+                <wp:cNvGraphicFramePr>
+                  <a:graphicFrameLocks xmlns:a="http://schemas.openxmlformats.org/drawingml/2006/main"/>
+                </wp:cNvGraphicFramePr>
+                <a:graphic xmlns:a="http://schemas.openxmlformats.org/drawingml/2006/main">
+                  <a:graphicData uri="http://schemas.microsoft.com/office/word/2010/wordprocessingShape">
+                    <wps:wsp>
+                      <wps:cNvSpPr txBox="1">
+                        <a:spLocks noChangeArrowheads="1"/>
+                      </wps:cNvSpPr>
+                      <wps:spPr bwMode="auto">
+                        <a:xfrm>
+                          <a:off x="0" y="0"/>
+                          <a:ext cx="6898639" cy="565784"/>
+                        </a:xfrm>
+                        <a:prstGeom prst="rect">
+                          <a:avLst/>
+                        </a:prstGeom>
+                        <a:solidFill>
+                          <a:schemeClr val="bg1">
+                            <a:lumMod val="95000"/>
+                          </a:schemeClr>
+                        </a:solidFill>
+                        <a:ln w="3175">
+                          <a:solidFill>
+                            <a:schemeClr val="bg1">
+                              <a:lumMod val="85000"/>
+                            </a:schemeClr>
+                          </a:solidFill>
+                          <a:miter lim="800000"/>
+                          <a:headEnd/>
+                          <a:tailEnd/>
+                        </a:ln>
+                      </wps:spPr>
+                      <wps:txbx>
+                        <w:txbxContent>
+                          <w:p>
+                            <w:r>
+                              <w:rPr>
+                                <w:rFonts w:ascii="Courier New" w:hAnsi="Courier New"/>
+                                <w:sz w:val="15"/>
+                              </w:rPr>
+                              <w:t>python -m venv .venv</w:t>
+                            </w:r>
+                            <w:r>
+                              <w:rPr>
+                                <w:rFonts w:ascii="Courier New" w:hAnsi="Courier New"/>
+                                <w:sz w:val="15"/>
+                              </w:rPr>
+                              <w:br/>
+                              <w:t>source .venv/bin/activate          # Windows: .venv\Scripts\activate</w:t>
+                            </w:r>
+                            <w:r>
+                              <w:rPr>
+                                <w:rFonts w:ascii="Courier New" w:hAnsi="Courier New"/>
+                                <w:sz w:val="15"/>
+                              </w:rPr>
+                              <w:br/>
+                              <w:t>python -m pip install -r requirements.txt</w:t>
+                            </w:r>
+                            <w:r>
+                              <w:rPr>
+                                <w:rFonts w:ascii="Courier New" w:hAnsi="Courier New"/>
+                                <w:sz w:val="15"/>
+                              </w:rPr>
+                              <w:br/>
+                              <w:t xml:space="preserve">python -m </w:t>
+                            </w:r>
+                            <w:r>
+                              <w:rPr>
+                                <w:rFonts w:ascii="Courier New" w:hAnsi="Courier New" w:hint="eastAsia"/>
+                                <w:sz w:val="15"/>
+                                <w:lang w:eastAsia="ja-JP"/>
+                              </w:rPr>
+                              <w:t>RunROIClassifier</w:t>
+                            </w:r>
+                          </w:p>
+                        </w:txbxContent>
+                      </wps:txbx>
+                      <wps:bodyPr rot="0" vert="horz" wrap="square" lIns="91440" tIns="45720" rIns="91440" bIns="45720" anchor="t" anchorCtr="0">
+                        <a:spAutoFit/>
+                      </wps:bodyPr>
+                    </wps:wsp>
+                  </a:graphicData>
+                </a:graphic>
+                <wp14:sizeRelH relativeFrom="margin">
+                  <wp14:pctWidth>0</wp14:pctWidth>
+                </wp14:sizeRelH>
+                <wp14:sizeRelV relativeFrom="margin">
+                  <wp14:pctHeight>20000</wp14:pctHeight>
+                </wp14:sizeRelV>
+              </wp:anchor>
+            </w:drawing>
+          </mc:Choice>
+          <mc:Fallback>
+            <w:pict>
+              <v:shapetype w14:anchorId="79BA0DCA" id="_x0000_t202" coordsize="21600,21600" o:spt="202" path="m,l,21600r21600,l21600,xe">
+                <v:stroke joinstyle="miter"/>
+                <v:path gradientshapeok="t" o:connecttype="rect"/>
+              </v:shapetype>
+              <v:shape id="Text Box 2" o:spid="_x0000_s1026" type="#_x0000_t202" style="position:absolute;margin-left:-3.2pt;margin-top:16.3pt;width:543.2pt;height:44.55pt;z-index:251654656;visibility:visible;mso-wrap-style:square;mso-width-percent:0;mso-height-percent:200;mso-wrap-distance-left:9pt;mso-wrap-distance-top:3.6pt;mso-wrap-distance-right:9pt;mso-wrap-distance-bottom:3.6pt;mso-position-horizontal:absolute;mso-position-horizontal-relative:text;mso-position-vertical:absolute;mso-position-vertical-relative:text;mso-width-percent:0;mso-height-percent:200;mso-width-relative:margin;mso-height-relative:margin;v-text-anchor:top" o:gfxdata="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" fillcolor="#f2f2f2 [3052]" strokecolor="#d8d8d8 [2732]" strokeweight=".25pt">
+                <v:textbox style="mso-fit-shape-to-text:t">
+                  <w:txbxContent>
+                    <w:p>
+                      <w:r>
+                        <w:rPr>
+                          <w:rFonts w:ascii="Courier New" w:hAnsi="Courier New"/>
+                          <w:sz w:val="15"/>
+                        </w:rPr>
+                        <w:t>python -m venv .venv</w:t>
+                      </w:r>
+                      <w:r>
+                        <w:rPr>
+                          <w:rFonts w:ascii="Courier New" w:hAnsi="Courier New"/>
+                          <w:sz w:val="15"/>
+                        </w:rPr>
+                        <w:br/>
+                        <w:t>source .venv/bin/activate          # Windows: .venv\Scripts\activate</w:t>
+                      </w:r>
+                      <w:r>
+                        <w:rPr>
+                          <w:rFonts w:ascii="Courier New" w:hAnsi="Courier New"/>
+                          <w:sz w:val="15"/>
+                        </w:rPr>
+                        <w:br/>
+                        <w:t>python -m pip install -r requirements.txt</w:t>
+                      </w:r>
+                      <w:r>
+                        <w:rPr>
+                          <w:rFonts w:ascii="Courier New" w:hAnsi="Courier New"/>
+                          <w:sz w:val="15"/>
+                        </w:rPr>
+                        <w:br/>
+                        <w:t xml:space="preserve">python -m </w:t>
+                      </w:r>
+                      <w:r>
+                        <w:rPr>
+                          <w:rFonts w:ascii="Courier New" w:hAnsi="Courier New" w:hint="eastAsia"/>
+                          <w:sz w:val="15"/>
+                          <w:lang w:eastAsia="ja-JP"/>
+                        </w:rPr>
+                        <w:t>RunROIClassifier</w:t>
+                      </w:r>
+                    </w:p>
+                  </w:txbxContent>
+                </v:textbox>
+                <w10:wrap type="square"/>
+              </v:shape>
+            </w:pict>
+          </mc:Fallback>
+        </mc:AlternateContent>
+      </w:r>
+    </w:p>
+    <w:p>
+      <w:pPr>
+        <w:spacing w:after="0"/>
+        <w:rPr>
+          <w:lang w:eastAsia="ja-JP"/>
+        </w:rPr>
+      </w:pPr>
+      <w:r>
+        <w:rPr>
+          <w:noProof/>
+          <w:lang w:eastAsia="ja-JP"/>
+        </w:rPr>
+        <mc:AlternateContent>
+          <mc:Choice Requires="wps">
+            <w:drawing>
+              <wp:anchor distT="45720" distB="45720" distL="114300" distR="114300" simplePos="0" relativeHeight="251658752" behindDoc="0" locked="0" layoutInCell="1" allowOverlap="1" wp14:anchorId="2E059893" wp14:editId="7CB6A7C8">
+                <wp:simplePos x="0" y="0"/>
+                <wp:positionH relativeFrom="column">
+                  <wp:posOffset>-38735</wp:posOffset>
+                </wp:positionH>
+                <wp:positionV relativeFrom="paragraph">
+                  <wp:posOffset>943538</wp:posOffset>
+                </wp:positionV>
+                <wp:extent cx="6898005" cy="565150"/>
+                <wp:effectExtent l="0" t="0" r="17145" b="11430"/>
+                <wp:wrapSquare wrapText="bothSides"/>
+                <wp:docPr id="514895399" name="Text Box 2"/>
+                <wp:cNvGraphicFramePr>
+                  <a:graphicFrameLocks xmlns:a="http://schemas.openxmlformats.org/drawingml/2006/main"/>
+                </wp:cNvGraphicFramePr>
+                <a:graphic xmlns:a="http://schemas.openxmlformats.org/drawingml/2006/main">
+                  <a:graphicData uri="http://schemas.microsoft.com/office/word/2010/wordprocessingShape">
+                    <wps:wsp>
+                      <wps:cNvSpPr txBox="1">
+                        <a:spLocks noChangeArrowheads="1"/>
+                      </wps:cNvSpPr>
+                      <wps:spPr bwMode="auto">
+                        <a:xfrm>
+                          <a:off x="0" y="0"/>
+                          <a:ext cx="6898005" cy="565150"/>
+                        </a:xfrm>
+                        <a:prstGeom prst="rect">
+                          <a:avLst/>
+                        </a:prstGeom>
+                        <a:solidFill>
+                          <a:schemeClr val="bg1">
+                            <a:lumMod val="95000"/>
+                          </a:schemeClr>
+                        </a:solidFill>
+                        <a:ln w="3175">
+                          <a:solidFill>
+                            <a:schemeClr val="bg1">
+                              <a:lumMod val="85000"/>
+                            </a:schemeClr>
+                          </a:solidFill>
+                          <a:miter lim="800000"/>
+                          <a:headEnd/>
+                          <a:tailEnd/>
+                        </a:ln>
+                      </wps:spPr>
+                      <wps:txbx>
+                        <w:txbxContent>
+                          <w:p>
+                            <w:pPr>
+                              <w:rPr>
+                                <w:rFonts w:ascii="Courier New" w:hAnsi="Courier New"/>
+                                <w:sz w:val="15"/>
+                                <w:lang w:eastAsia="ja-JP"/>
+                              </w:rPr>
+                            </w:pPr>
+                            <w:r>
+                              <w:rPr>
+                                <w:rFonts w:ascii="Courier New" w:hAnsi="Courier New"/>
+                                <w:sz w:val="15"/>
+                              </w:rPr>
+                              <w:t>python -m venv .venv</w:t>
+                            </w:r>
+                            <w:r>
+                              <w:rPr>
+                                <w:rFonts w:ascii="Courier New" w:hAnsi="Courier New"/>
+                                <w:sz w:val="15"/>
+                              </w:rPr>
+                              <w:br/>
+                              <w:t>source .venv/bin/activate          # Windows: .venv\Scripts\activate</w:t>
+                            </w:r>
+                            <w:r>
+                              <w:rPr>
+                                <w:rFonts w:ascii="Courier New" w:hAnsi="Courier New"/>
+                                <w:sz w:val="15"/>
+                              </w:rPr>
+                              <w:br/>
+                              <w:t>python -m pip install -r requirements.txt</w:t>
+                            </w:r>
+                            <w:r>
+                              <w:rPr>
+                                <w:rFonts w:ascii="Courier New" w:hAnsi="Courier New"/>
+                                <w:sz w:val="15"/>
+                              </w:rPr>
+                              <w:br/>
+                              <w:t xml:space="preserve">python -m </w:t>
+                            </w:r>
+                            <w:r>
+                              <w:rPr>
+                                <w:rFonts w:ascii="Courier New" w:hAnsi="Courier New" w:hint="eastAsia"/>
+                                <w:sz w:val="15"/>
+                                <w:lang w:eastAsia="ja-JP"/>
+                              </w:rPr>
+                              <w:t xml:space="preserve">Model.EvaluateModels </w:t>
+                            </w:r>
+                            <w:r>
+                              <w:rPr>
+                                <w:rFonts w:ascii="Courier New" w:hAnsi="Courier New"/>
+                                <w:sz w:val="15"/>
+                                <w:lang w:eastAsia="ja-JP"/>
+                              </w:rPr>
+                              <w:t>–</w:t>
+                            </w:r>
+                            <w:r>
+                              <w:rPr>
+                                <w:rFonts w:ascii="Courier New" w:hAnsi="Courier New" w:hint="eastAsia"/>
+                                <w:sz w:val="15"/>
+                                <w:lang w:eastAsia="ja-JP"/>
+                              </w:rPr>
+                              <w:t>models dummy custom-rf</w:t>
+                            </w:r>
+                            <w:r>
+                              <w:rPr>
+                                <w:rFonts w:ascii="Courier New" w:hAnsi="Courier New" w:hint="eastAsia"/>
+                                <w:sz w:val="15"/>
+                                <w:lang w:eastAsia="ja-JP"/>
+                              </w:rPr>
+                              <w:t xml:space="preserve"> (other models)</w:t>
+                            </w:r>
+                            <w:r>
+                              <w:rPr>
+                                <w:rFonts w:ascii="Courier New" w:hAnsi="Courier New" w:hint="eastAsia"/>
+                                <w:sz w:val="15"/>
+                                <w:lang w:eastAsia="ja-JP"/>
+                              </w:rPr>
+                              <w:t xml:space="preserve"> --output-dir Artifacts/Comparison</w:t>
+                            </w:r>
+                            <w:r>
+                              <w:rPr>
+                                <w:rFonts w:ascii="Courier New" w:hAnsi="Courier New" w:hint="eastAsia"/>
+                                <w:sz w:val="15"/>
+                                <w:lang w:eastAsia="ja-JP"/>
+                              </w:rPr>
+                              <w:t xml:space="preserve"> </w:t>
+                            </w:r>
+                          </w:p>
+                          <w:p>
+                            <w:pPr>
+                              <w:rPr>
+                                <w:rFonts w:ascii="Courier New" w:hAnsi="Courier New"/>
+                                <w:sz w:val="15"/>
+                                <w:lang w:eastAsia="ja-JP"/>
+                              </w:rPr>
+                            </w:pPr>
+                            <w:r>
+                              <w:rPr>
+                                <w:rFonts w:ascii="Courier New" w:hAnsi="Courier New" w:hint="eastAsia"/>
+                                <w:sz w:val="15"/>
+                                <w:lang w:eastAsia="ja-JP"/>
+                              </w:rPr>
+                              <w:t># Models can be chosen from: dummy custom-rf custom-olr custom-ensemble sklearn</w:t>
+                            </w:r>
+                          </w:p>
+                          <w:p>
+                            <w:pPr>
+                              <w:rPr>
+                                <w:rFonts w:hint="eastAsia"/>
+                              </w:rPr>
+                            </w:pPr>
+                            <w:r>
+                              <w:rPr>
+                                <w:rFonts w:ascii="Courier New" w:hAnsi="Courier New"/>
+                                <w:sz w:val="15"/>
+                                <w:lang w:eastAsia="ja-JP"/>
+                              </w:rPr>
+                              <w:t>P</w:t>
+                            </w:r>
+                            <w:r>
+                              <w:rPr>
+                                <w:rFonts w:ascii="Courier New" w:hAnsi="Courier New" w:hint="eastAsia"/>
+                                <w:sz w:val="15"/>
+                                <w:lang w:eastAsia="ja-JP"/>
+                              </w:rPr>
+                              <w:t>ython -m unittest discover -s tests -v</w:t>
+                            </w:r>
+                          </w:p>
+                        </w:txbxContent>
+                      </wps:txbx>
+                      <wps:bodyPr rot="0" vert="horz" wrap="square" lIns="91440" tIns="45720" rIns="91440" bIns="45720" anchor="t" anchorCtr="0">
+                        <a:spAutoFit/>
+                      </wps:bodyPr>
+                    </wps:wsp>
+                  </a:graphicData>
+                </a:graphic>
+                <wp14:sizeRelH relativeFrom="margin">
+                  <wp14:pctWidth>0</wp14:pctWidth>
+                </wp14:sizeRelH>
+                <wp14:sizeRelV relativeFrom="margin">
+                  <wp14:pctHeight>20000</wp14:pctHeight>
+                </wp14:sizeRelV>
+              </wp:anchor>
+            </w:drawing>
+          </mc:Choice>
+          <mc:Fallback>
+            <w:pict>
+              <v:shape w14:anchorId="2E059893" id="_x0000_s1027" type="#_x0000_t202" style="position:absolute;margin-left:-3.05pt;margin-top:74.3pt;width:543.15pt;height:44.5pt;z-index:251658752;visibility:visible;mso-wrap-style:square;mso-width-percent:0;mso-height-percent:200;mso-wrap-distance-left:9pt;mso-wrap-distance-top:3.6pt;mso-wrap-distance-right:9pt;mso-wrap-distance-bottom:3.6pt;mso-position-horizontal:absolute;mso-position-horizontal-relative:text;mso-position-vertical:absolute;mso-position-vertical-relative:text;mso-width-percent:0;mso-height-percent:200;mso-width-relative:margin;mso-height-relative:margin;v-text-anchor:top" o:gfxdata="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" fillcolor="#f2f2f2 [3052]" strokecolor="#d8d8d8 [2732]" strokeweight=".25pt">
+                <v:textbox style="mso-fit-shape-to-text:t">
+                  <w:txbxContent>
+                    <w:p>
+                      <w:pPr>
+                        <w:rPr>
+                          <w:rFonts w:ascii="Courier New" w:hAnsi="Courier New"/>
+                          <w:sz w:val="15"/>
+                          <w:lang w:eastAsia="ja-JP"/>
+                        </w:rPr>
+                      </w:pPr>
+                      <w:r>
+                        <w:rPr>
+                          <w:rFonts w:ascii="Courier New" w:hAnsi="Courier New"/>
+                          <w:sz w:val="15"/>
+                        </w:rPr>
+                        <w:t>python -m venv .venv</w:t>
+                      </w:r>
+                      <w:r>
+                        <w:rPr>
+                          <w:rFonts w:ascii="Courier New" w:hAnsi="Courier New"/>
+                          <w:sz w:val="15"/>
+                        </w:rPr>
+                        <w:br/>
+                        <w:t>source .venv/bin/activate          # Windows: .venv\Scripts\activate</w:t>
+                      </w:r>
+                      <w:r>
+                        <w:rPr>
+                          <w:rFonts w:ascii="Courier New" w:hAnsi="Courier New"/>
+                          <w:sz w:val="15"/>
+                        </w:rPr>
+                        <w:br/>
+                        <w:t>python -m pip install -r requirements.txt</w:t>
+                      </w:r>
+                      <w:r>
+                        <w:rPr>
+                          <w:rFonts w:ascii="Courier New" w:hAnsi="Courier New"/>
+                          <w:sz w:val="15"/>
+                        </w:rPr>
+                        <w:br/>
+                        <w:t xml:space="preserve">python -m </w:t>
+                      </w:r>
+                      <w:r>
+                        <w:rPr>
+                          <w:rFonts w:ascii="Courier New" w:hAnsi="Courier New" w:hint="eastAsia"/>
+                          <w:sz w:val="15"/>
+                          <w:lang w:eastAsia="ja-JP"/>
+                        </w:rPr>
+                        <w:t xml:space="preserve">Model.EvaluateModels </w:t>
+                      </w:r>
+                      <w:r>
+                        <w:rPr>
+                          <w:rFonts w:ascii="Courier New" w:hAnsi="Courier New"/>
+                          <w:sz w:val="15"/>
+                          <w:lang w:eastAsia="ja-JP"/>
+                        </w:rPr>
+                        <w:t>–</w:t>
+                      </w:r>
+                      <w:r>
+                        <w:rPr>
+                          <w:rFonts w:ascii="Courier New" w:hAnsi="Courier New" w:hint="eastAsia"/>
+                          <w:sz w:val="15"/>
+                          <w:lang w:eastAsia="ja-JP"/>
+                        </w:rPr>
+                        <w:t>models dummy custom-rf</w:t>
+                      </w:r>
+                      <w:r>
+                        <w:rPr>
+                          <w:rFonts w:ascii="Courier New" w:hAnsi="Courier New" w:hint="eastAsia"/>
+                          <w:sz w:val="15"/>
+                          <w:lang w:eastAsia="ja-JP"/>
+                        </w:rPr>
+                        <w:t xml:space="preserve"> (other models)</w:t>
+                      </w:r>
+                      <w:r>
+                        <w:rPr>
+                          <w:rFonts w:ascii="Courier New" w:hAnsi="Courier New" w:hint="eastAsia"/>
+                          <w:sz w:val="15"/>
+                          <w:lang w:eastAsia="ja-JP"/>
+                        </w:rPr>
+                        <w:t xml:space="preserve"> --output-dir Artifacts/Comparison</w:t>
+                      </w:r>
+                      <w:r>
+                        <w:rPr>
+                          <w:rFonts w:ascii="Courier New" w:hAnsi="Courier New" w:hint="eastAsia"/>
+                          <w:sz w:val="15"/>
+                          <w:lang w:eastAsia="ja-JP"/>
+                        </w:rPr>
+                        <w:t xml:space="preserve"> </w:t>
+                      </w:r>
+                    </w:p>
+                    <w:p>
+                      <w:pPr>
+                        <w:rPr>
+                          <w:rFonts w:ascii="Courier New" w:hAnsi="Courier New"/>
+                          <w:sz w:val="15"/>
+                          <w:lang w:eastAsia="ja-JP"/>
+                        </w:rPr>
+                      </w:pPr>
+                      <w:r>
+                        <w:rPr>
+                          <w:rFonts w:ascii="Courier New" w:hAnsi="Courier New" w:hint="eastAsia"/>
+                          <w:sz w:val="15"/>
+                          <w:lang w:eastAsia="ja-JP"/>
+                        </w:rPr>
+                        <w:t># Models can be chosen from: dummy custom-rf custom-olr custom-ensemble sklearn</w:t>
+                      </w:r>
+                    </w:p>
+                    <w:p>
+                      <w:pPr>
+                        <w:rPr>
+                          <w:rFonts w:hint="eastAsia"/>
+                        </w:rPr>
+                      </w:pPr>
+                      <w:r>
+                        <w:rPr>
+                          <w:rFonts w:ascii="Courier New" w:hAnsi="Courier New"/>
+                          <w:sz w:val="15"/>
+                          <w:lang w:eastAsia="ja-JP"/>
+                        </w:rPr>
+                        <w:t>P</w:t>
+                      </w:r>
+                      <w:r>
+                        <w:rPr>
+                          <w:rFonts w:ascii="Courier New" w:hAnsi="Courier New" w:hint="eastAsia"/>
+                          <w:sz w:val="15"/>
+                          <w:lang w:eastAsia="ja-JP"/>
+                        </w:rPr>
+                        <w:t>ython -m unittest discover -s tests -v</w:t>
+                      </w:r>
+                    </w:p>
+                  </w:txbxContent>
+                </v:textbox>
+                <w10:wrap type="square"/>
+              </v:shape>
+            </w:pict>
+          </mc:Fallback>
+        </mc:AlternateContent>
+      </w:r>
+      <w:r>
+        <w:rPr>
+          <w:rFonts w:hint="eastAsia"/>
+          <w:lang w:eastAsia="ja-JP"/>
+        </w:rPr>
+        <w:t>To run the model comparison:</w:t>
+      </w:r>
+    </w:p>
+    <w:p>
+      <w:pPr>
+        <w:spacing w:after="0"/>
+        <w:rPr>
+          <w:rFonts w:hint="eastAsia"/>
+          <w:lang w:eastAsia="ja-JP"/>
+        </w:rPr>
+      </w:pPr>
+      <w:r>
+        <w:rPr>
+          <w:rFonts w:hint="eastAsia"/>
+          <w:lang w:eastAsia="ja-JP"/>
+        </w:rPr>
+        <w:t>Note: each run</w:t>
+      </w:r>
+      <w:r>
+        <w:rPr>
+          <w:lang w:eastAsia="ja-JP"/>
+        </w:rPr>
+        <w:t>’</w:t>
+      </w:r>
+      <w:r>
+        <w:rPr>
+          <w:rFonts w:hint="eastAsia"/>
+          <w:lang w:eastAsia="ja-JP"/>
+        </w:rPr>
+        <w:t>s output directory should be different to avoid mixing artifacts.</w:t>
+      </w:r>
+    </w:p>
     <w:p>
       <w:pPr>
         <w:pStyle w:val="Heading2"/>
@@ -6463,7 +6956,7 @@
     </w:p>
     <w:p>
       <w:r>
-        <w:t>The clean submission scopes reproducibility to evaluation from the included final modeling CSV. Historical raw-data preparation depended on manual extracts and local utilities, so it is not represented as a one-command pipeline. Results may not transfer across cities, time periods, project types, market conditions, or assessment policies.</w:t>
+        <w:t>Historical raw-data preparation depended on manual extracts and local utilities, so it is not represented as a one-command pipeline. Results may not transfer across cities, time periods, project types, market conditions, or assessment policies.</w:t>
       </w:r>
     </w:p>
     <w:tbl>
@@ -6544,21 +7037,11 @@
         <w:ind w:left="259" w:hanging="173"/>
       </w:pPr>
       <w:r>
-        <w:t>scikit-learn documentation: RandomForestClassifier, StratifiedKFold, StandardScaler, and model metrics.</w:t>
-      </w:r>
-    </w:p>
-    <w:p>
-      <w:pPr>
-        <w:pStyle w:val="ListBullet"/>
-        <w:spacing w:after="40"/>
-        <w:ind w:left="259" w:hanging="173"/>
-      </w:pPr>
-      <w:r>
         <w:t>Group 14 project repository and generated evidence under Artifacts/Milestone2.</w:t>
       </w:r>
     </w:p>
     <w:sectPr>
-      <w:footerReference w:type="default" r:id="rId10"/>
+      <w:footerReference w:type="default" r:id="rId15"/>
       <w:pgSz w:w="12240" w:h="15840"/>
       <w:pgMar w:top="720" w:right="835" w:bottom="749" w:left="835" w:header="720" w:footer="720" w:gutter="0"/>
       <w:cols w:space="720"/>
@@ -7470,7 +7953,6 @@
   <w:style w:type="character" w:default="1" w:styleId="DefaultParagraphFont">
     <w:name w:val="Default Paragraph Font"/>
     <w:uiPriority w:val="1"/>
-    <w:semiHidden/>
     <w:unhideWhenUsed/>
   </w:style>
   <w:style w:type="table" w:default="1" w:styleId="TableNormal">
@@ -18251,6 +18733,3129 @@
 </w:styles>
 </file>
 
+<file path=word/diagrams/colors1.xml><?xml version="1.0" encoding="utf-8"?>
+<dgm:colorsDef xmlns:dgm="http://schemas.openxmlformats.org/drawingml/2006/diagram" xmlns:a="http://schemas.openxmlformats.org/drawingml/2006/main" uniqueId="urn:microsoft.com/office/officeart/2005/8/colors/accent1_2">
+  <dgm:title val=""/>
+  <dgm:desc val=""/>
+  <dgm:catLst>
+    <dgm:cat type="accent1" pri="11200"/>
+  </dgm:catLst>
+  <dgm:styleLbl name="node0">
+    <dgm:fillClrLst meth="repeat">
+      <a:schemeClr val="accent1"/>
+    </dgm:fillClrLst>
+    <dgm:linClrLst meth="repeat">
+      <a:schemeClr val="lt1"/>
+    </dgm:linClrLst>
+    <dgm:effectClrLst/>
+    <dgm:txLinClrLst/>
+    <dgm:txFillClrLst/>
+    <dgm:txEffectClrLst/>
+  </dgm:styleLbl>
+  <dgm:styleLbl name="alignNode1">
+    <dgm:fillClrLst meth="repeat">
+      <a:schemeClr val="accent1"/>
+    </dgm:fillClrLst>
+    <dgm:linClrLst meth="repeat">
+      <a:schemeClr val="accent1"/>
+    </dgm:linClrLst>
+    <dgm:effectClrLst/>
+    <dgm:txLinClrLst/>
+    <dgm:txFillClrLst/>
+    <dgm:txEffectClrLst/>
+  </dgm:styleLbl>
+  <dgm:styleLbl name="node1">
+    <dgm:fillClrLst meth="repeat">
+      <a:schemeClr val="accent1"/>
+    </dgm:fillClrLst>
+    <dgm:linClrLst meth="repeat">
+      <a:schemeClr val="lt1"/>
+    </dgm:linClrLst>
+    <dgm:effectClrLst/>
+    <dgm:txLinClrLst/>
+    <dgm:txFillClrLst/>
+    <dgm:txEffectClrLst/>
+  </dgm:styleLbl>
+  <dgm:styleLbl name="lnNode1">
+    <dgm:fillClrLst meth="repeat">
+      <a:schemeClr val="accent1"/>
+    </dgm:fillClrLst>
+    <dgm:linClrLst meth="repeat">
+      <a:schemeClr val="lt1"/>
+    </dgm:linClrLst>
+    <dgm:effectClrLst/>
+    <dgm:txLinClrLst/>
+    <dgm:txFillClrLst/>
+    <dgm:txEffectClrLst/>
+  </dgm:styleLbl>
+  <dgm:styleLbl name="vennNode1">
+    <dgm:fillClrLst meth="repeat">
+      <a:schemeClr val="accent1">
+        <a:alpha val="50000"/>
+      </a:schemeClr>
+    </dgm:fillClrLst>
+    <dgm:linClrLst meth="repeat">
+      <a:schemeClr val="lt1"/>
+    </dgm:linClrLst>
+    <dgm:effectClrLst/>
+    <dgm:txLinClrLst/>
+    <dgm:txFillClrLst/>
+    <dgm:txEffectClrLst/>
+  </dgm:styleLbl>
+  <dgm:styleLbl name="node2">
+    <dgm:fillClrLst meth="repeat">
+      <a:schemeClr val="accent1"/>
+    </dgm:fillClrLst>
+    <dgm:linClrLst meth="repeat">
+      <a:schemeClr val="lt1"/>
+    </dgm:linClrLst>
+    <dgm:effectClrLst/>
+    <dgm:txLinClrLst/>
+    <dgm:txFillClrLst/>
+    <dgm:txEffectClrLst/>
+  </dgm:styleLbl>
+  <dgm:styleLbl name="node3">
+    <dgm:fillClrLst meth="repeat">
+      <a:schemeClr val="accent1"/>
+    </dgm:fillClrLst>
+    <dgm:linClrLst meth="repeat">
+      <a:schemeClr val="lt1"/>
+    </dgm:linClrLst>
+    <dgm:effectClrLst/>
+    <dgm:txLinClrLst/>
+    <dgm:txFillClrLst/>
+    <dgm:txEffectClrLst/>
+  </dgm:styleLbl>
+  <dgm:styleLbl name="node4">
+    <dgm:fillClrLst meth="repeat">
+      <a:schemeClr val="accent1"/>
+    </dgm:fillClrLst>
+    <dgm:linClrLst meth="repeat">
+      <a:schemeClr val="lt1"/>
+    </dgm:linClrLst>
+    <dgm:effectClrLst/>
+    <dgm:txLinClrLst/>
+    <dgm:txFillClrLst/>
+    <dgm:txEffectClrLst/>
+  </dgm:styleLbl>
+  <dgm:styleLbl name="fgImgPlace1">
+    <dgm:fillClrLst meth="repeat">
+      <a:schemeClr val="accent1">
+        <a:tint val="50000"/>
+      </a:schemeClr>
+    </dgm:fillClrLst>
+    <dgm:linClrLst meth="repeat">
+      <a:schemeClr val="lt1"/>
+    </dgm:linClrLst>
+    <dgm:effectClrLst/>
+    <dgm:txLinClrLst/>
+    <dgm:txFillClrLst meth="repeat">
+      <a:schemeClr val="lt1"/>
+    </dgm:txFillClrLst>
+    <dgm:txEffectClrLst/>
+  </dgm:styleLbl>
+  <dgm:styleLbl name="alignImgPlace1">
+    <dgm:fillClrLst meth="repeat">
+      <a:schemeClr val="accent1">
+        <a:tint val="50000"/>
+      </a:schemeClr>
+    </dgm:fillClrLst>
+    <dgm:linClrLst meth="repeat">
+      <a:schemeClr val="lt1"/>
+    </dgm:linClrLst>
+    <dgm:effectClrLst/>
+    <dgm:txLinClrLst/>
+    <dgm:txFillClrLst meth="repeat">
+      <a:schemeClr val="lt1"/>
+    </dgm:txFillClrLst>
+    <dgm:txEffectClrLst/>
+  </dgm:styleLbl>
+  <dgm:styleLbl name="bgImgPlace1">
+    <dgm:fillClrLst meth="repeat">
+      <a:schemeClr val="accent1">
+        <a:tint val="50000"/>
+      </a:schemeClr>
+    </dgm:fillClrLst>
+    <dgm:linClrLst meth="repeat">
+      <a:schemeClr val="lt1"/>
+    </dgm:linClrLst>
+    <dgm:effectClrLst/>
+    <dgm:txLinClrLst/>
+    <dgm:txFillClrLst meth="repeat">
+      <a:schemeClr val="lt1"/>
+    </dgm:txFillClrLst>
+    <dgm:txEffectClrLst/>
+  </dgm:styleLbl>
+  <dgm:styleLbl name="sibTrans2D1">
+    <dgm:fillClrLst meth="repeat">
+      <a:schemeClr val="accent1">
+        <a:tint val="60000"/>
+      </a:schemeClr>
+    </dgm:fillClrLst>
+    <dgm:linClrLst meth="repeat">
+      <a:schemeClr val="accent1">
+        <a:tint val="60000"/>
+      </a:schemeClr>
+    </dgm:linClrLst>
+    <dgm:effectClrLst/>
+    <dgm:txLinClrLst/>
+    <dgm:txFillClrLst/>
+    <dgm:txEffectClrLst/>
+  </dgm:styleLbl>
+  <dgm:styleLbl name="fgSibTrans2D1">
+    <dgm:fillClrLst meth="repeat">
+      <a:schemeClr val="accent1">
+        <a:tint val="60000"/>
+      </a:schemeClr>
+    </dgm:fillClrLst>
+    <dgm:linClrLst meth="repeat">
+      <a:schemeClr val="accent1">
+        <a:tint val="60000"/>
+      </a:schemeClr>
+    </dgm:linClrLst>
+    <dgm:effectClrLst/>
+    <dgm:txLinClrLst/>
+    <dgm:txFillClrLst/>
+    <dgm:txEffectClrLst/>
+  </dgm:styleLbl>
+  <dgm:styleLbl name="bgSibTrans2D1">
+    <dgm:fillClrLst meth="repeat">
+      <a:schemeClr val="accent1">
+        <a:tint val="60000"/>
+      </a:schemeClr>
+    </dgm:fillClrLst>
+    <dgm:linClrLst meth="repeat">
+      <a:schemeClr val="accent1">
+        <a:tint val="60000"/>
+      </a:schemeClr>
+    </dgm:linClrLst>
+    <dgm:effectClrLst/>
+    <dgm:txLinClrLst/>
+    <dgm:txFillClrLst/>
+    <dgm:txEffectClrLst/>
+  </dgm:styleLbl>
+  <dgm:styleLbl name="sibTrans1D1">
+    <dgm:fillClrLst meth="repeat">
+      <a:schemeClr val="accent1"/>
+    </dgm:fillClrLst>
+    <dgm:linClrLst meth="repeat">
+      <a:schemeClr val="accent1"/>
+    </dgm:linClrLst>
+    <dgm:effectClrLst/>
+    <dgm:txLinClrLst/>
+    <dgm:txFillClrLst meth="repeat">
+      <a:schemeClr val="tx1"/>
+    </dgm:txFillClrLst>
+    <dgm:txEffectClrLst/>
+  </dgm:styleLbl>
+  <dgm:styleLbl name="callout">
+    <dgm:fillClrLst meth="repeat">
+      <a:schemeClr val="accent1"/>
+    </dgm:fillClrLst>
+    <dgm:linClrLst meth="repeat">
+      <a:schemeClr val="accent1">
+        <a:tint val="50000"/>
+      </a:schemeClr>
+    </dgm:linClrLst>
+    <dgm:effectClrLst/>
+    <dgm:txLinClrLst/>
+    <dgm:txFillClrLst meth="repeat">
+      <a:schemeClr val="tx1"/>
+    </dgm:txFillClrLst>
+    <dgm:txEffectClrLst/>
+  </dgm:styleLbl>
+  <dgm:styleLbl name="asst0">
+    <dgm:fillClrLst meth="repeat">
+      <a:schemeClr val="accent1"/>
+    </dgm:fillClrLst>
+    <dgm:linClrLst meth="repeat">
+      <a:schemeClr val="lt1"/>
+    </dgm:linClrLst>
+    <dgm:effectClrLst/>
+    <dgm:txLinClrLst/>
+    <dgm:txFillClrLst/>
+    <dgm:txEffectClrLst/>
+  </dgm:styleLbl>
+  <dgm:styleLbl name="asst1">
+    <dgm:fillClrLst meth="repeat">
+      <a:schemeClr val="accent1"/>
+    </dgm:fillClrLst>
+    <dgm:linClrLst meth="repeat">
+      <a:schemeClr val="lt1"/>
+    </dgm:linClrLst>
+    <dgm:effectClrLst/>
+    <dgm:txLinClrLst/>
+    <dgm:txFillClrLst/>
+    <dgm:txEffectClrLst/>
+  </dgm:styleLbl>
+  <dgm:styleLbl name="asst2">
+    <dgm:fillClrLst meth="repeat">
+      <a:schemeClr val="accent1"/>
+    </dgm:fillClrLst>
+    <dgm:linClrLst meth="repeat">
+      <a:schemeClr val="lt1"/>
+    </dgm:linClrLst>
+    <dgm:effectClrLst/>
+    <dgm:txLinClrLst/>
+    <dgm:txFillClrLst/>
+    <dgm:txEffectClrLst/>
+  </dgm:styleLbl>
+  <dgm:styleLbl name="asst3">
+    <dgm:fillClrLst meth="repeat">
+      <a:schemeClr val="accent1"/>
+    </dgm:fillClrLst>
+    <dgm:linClrLst meth="repeat">
+      <a:schemeClr val="lt1"/>
+    </dgm:linClrLst>
+    <dgm:effectClrLst/>
+    <dgm:txLinClrLst/>
+    <dgm:txFillClrLst/>
+    <dgm:txEffectClrLst/>
+  </dgm:styleLbl>
+  <dgm:styleLbl name="asst4">
+    <dgm:fillClrLst meth="repeat">
+      <a:schemeClr val="accent1"/>
+    </dgm:fillClrLst>
+    <dgm:linClrLst meth="repeat">
+      <a:schemeClr val="lt1"/>
+    </dgm:linClrLst>
+    <dgm:effectClrLst/>
+    <dgm:txLinClrLst/>
+    <dgm:txFillClrLst/>
+    <dgm:txEffectClrLst/>
+  </dgm:styleLbl>
+  <dgm:styleLbl name="parChTrans2D1">
+    <dgm:fillClrLst meth="repeat">
+      <a:schemeClr val="accent1">
+        <a:tint val="60000"/>
+      </a:schemeClr>
+    </dgm:fillClrLst>
+    <dgm:linClrLst meth="repeat">
+      <a:schemeClr val="accent1">
+        <a:tint val="60000"/>
+      </a:schemeClr>
+    </dgm:linClrLst>
+    <dgm:effectClrLst/>
+    <dgm:txLinClrLst/>
+    <dgm:txFillClrLst meth="repeat">
+      <a:schemeClr val="lt1"/>
+    </dgm:txFillClrLst>
+    <dgm:txEffectClrLst/>
+  </dgm:styleLbl>
+  <dgm:styleLbl name="parChTrans2D2">
+    <dgm:fillClrLst meth="repeat">
+      <a:schemeClr val="accent1"/>
+    </dgm:fillClrLst>
+    <dgm:linClrLst meth="repeat">
+      <a:schemeClr val="accent1"/>
+    </dgm:linClrLst>
+    <dgm:effectClrLst/>
+    <dgm:txLinClrLst/>
+    <dgm:txFillClrLst meth="repeat">
+      <a:schemeClr val="lt1"/>
+    </dgm:txFillClrLst>
+    <dgm:txEffectClrLst/>
+  </dgm:styleLbl>
+  <dgm:styleLbl name="parChTrans2D3">
+    <dgm:fillClrLst meth="repeat">
+      <a:schemeClr val="accent1"/>
+    </dgm:fillClrLst>
+    <dgm:linClrLst meth="repeat">
+      <a:schemeClr val="accent1"/>
+    </dgm:linClrLst>
+    <dgm:effectClrLst/>
+    <dgm:txLinClrLst/>
+    <dgm:txFillClrLst meth="repeat">
+      <a:schemeClr val="lt1"/>
+    </dgm:txFillClrLst>
+    <dgm:txEffectClrLst/>
+  </dgm:styleLbl>
+  <dgm:styleLbl name="parChTrans2D4">
+    <dgm:fillClrLst meth="repeat">
+      <a:schemeClr val="accent1"/>
+    </dgm:fillClrLst>
+    <dgm:linClrLst meth="repeat">
+      <a:schemeClr val="accent1"/>
+    </dgm:linClrLst>
+    <dgm:effectClrLst/>
+    <dgm:txLinClrLst/>
+    <dgm:txFillClrLst meth="repeat">
+      <a:schemeClr val="lt1"/>
+    </dgm:txFillClrLst>
+    <dgm:txEffectClrLst/>
+  </dgm:styleLbl>
+  <dgm:styleLbl name="parChTrans1D1">
+    <dgm:fillClrLst meth="repeat">
+      <a:schemeClr val="accent1"/>
+    </dgm:fillClrLst>
+    <dgm:linClrLst meth="repeat">
+      <a:schemeClr val="accent1">
+        <a:shade val="60000"/>
+      </a:schemeClr>
+    </dgm:linClrLst>
+    <dgm:effectClrLst/>
+    <dgm:txLinClrLst/>
+    <dgm:txFillClrLst meth="repeat">
+      <a:schemeClr val="tx1"/>
+    </dgm:txFillClrLst>
+    <dgm:txEffectClrLst/>
+  </dgm:styleLbl>
+  <dgm:styleLbl name="parChTrans1D2">
+    <dgm:fillClrLst meth="repeat">
+      <a:schemeClr val="accent1"/>
+    </dgm:fillClrLst>
+    <dgm:linClrLst meth="repeat">
+      <a:schemeClr val="accent1">
+        <a:shade val="60000"/>
+      </a:schemeClr>
+    </dgm:linClrLst>
+    <dgm:effectClrLst/>
+    <dgm:txLinClrLst/>
+    <dgm:txFillClrLst meth="repeat">
+      <a:schemeClr val="tx1"/>
+    </dgm:txFillClrLst>
+    <dgm:txEffectClrLst/>
+  </dgm:styleLbl>
+  <dgm:styleLbl name="parChTrans1D3">
+    <dgm:fillClrLst meth="repeat">
+      <a:schemeClr val="accent1"/>
+    </dgm:fillClrLst>
+    <dgm:linClrLst meth="repeat">
+      <a:schemeClr val="accent1">
+        <a:shade val="80000"/>
+      </a:schemeClr>
+    </dgm:linClrLst>
+    <dgm:effectClrLst/>
+    <dgm:txLinClrLst/>
+    <dgm:txFillClrLst meth="repeat">
+      <a:schemeClr val="tx1"/>
+    </dgm:txFillClrLst>
+    <dgm:txEffectClrLst/>
+  </dgm:styleLbl>
+  <dgm:styleLbl name="parChTrans1D4">
+    <dgm:fillClrLst meth="repeat">
+      <a:schemeClr val="accent1"/>
+    </dgm:fillClrLst>
+    <dgm:linClrLst meth="repeat">
+      <a:schemeClr val="accent1">
+        <a:shade val="80000"/>
+      </a:schemeClr>
+    </dgm:linClrLst>
+    <dgm:effectClrLst/>
+    <dgm:txLinClrLst/>
+    <dgm:txFillClrLst meth="repeat">
+      <a:schemeClr val="tx1"/>
+    </dgm:txFillClrLst>
+    <dgm:txEffectClrLst/>
+  </dgm:styleLbl>
+  <dgm:styleLbl name="fgAcc1">
+    <dgm:fillClrLst meth="repeat">
+      <a:schemeClr val="lt1">
+        <a:alpha val="90000"/>
+      </a:schemeClr>
+    </dgm:fillClrLst>
+    <dgm:linClrLst meth="repeat">
+      <a:schemeClr val="accent1"/>
+    </dgm:linClrLst>
+    <dgm:effectClrLst/>
+    <dgm:txLinClrLst/>
+    <dgm:txFillClrLst meth="repeat">
+      <a:schemeClr val="dk1"/>
+    </dgm:txFillClrLst>
+    <dgm:txEffectClrLst/>
+  </dgm:styleLbl>
+  <dgm:styleLbl name="conFgAcc1">
+    <dgm:fillClrLst meth="repeat">
+      <a:schemeClr val="lt1">
+        <a:alpha val="90000"/>
+      </a:schemeClr>
+    </dgm:fillClrLst>
+    <dgm:linClrLst meth="repeat">
+      <a:schemeClr val="accent1"/>
+    </dgm:linClrLst>
+    <dgm:effectClrLst/>
+    <dgm:txLinClrLst/>
+    <dgm:txFillClrLst meth="repeat">
+      <a:schemeClr val="dk1"/>
+    </dgm:txFillClrLst>
+    <dgm:txEffectClrLst/>
+  </dgm:styleLbl>
+  <dgm:styleLbl name="alignAcc1">
+    <dgm:fillClrLst meth="repeat">
+      <a:schemeClr val="lt1">
+        <a:alpha val="90000"/>
+      </a:schemeClr>
+    </dgm:fillClrLst>
+    <dgm:linClrLst meth="repeat">
+      <a:schemeClr val="accent1"/>
+    </dgm:linClrLst>
+    <dgm:effectClrLst/>
+    <dgm:txLinClrLst/>
+    <dgm:txFillClrLst meth="repeat">
+      <a:schemeClr val="dk1"/>
+    </dgm:txFillClrLst>
+    <dgm:txEffectClrLst/>
+  </dgm:styleLbl>
+  <dgm:styleLbl name="trAlignAcc1">
+    <dgm:fillClrLst meth="repeat">
+      <a:schemeClr val="lt1">
+        <a:alpha val="40000"/>
+      </a:schemeClr>
+    </dgm:fillClrLst>
+    <dgm:linClrLst meth="repeat">
+      <a:schemeClr val="accent1"/>
+    </dgm:linClrLst>
+    <dgm:effectClrLst/>
+    <dgm:txLinClrLst/>
+    <dgm:txFillClrLst meth="repeat">
+      <a:schemeClr val="dk1"/>
+    </dgm:txFillClrLst>
+    <dgm:txEffectClrLst/>
+  </dgm:styleLbl>
+  <dgm:styleLbl name="bgAcc1">
+    <dgm:fillClrLst meth="repeat">
+      <a:schemeClr val="lt1">
+        <a:alpha val="90000"/>
+      </a:schemeClr>
+    </dgm:fillClrLst>
+    <dgm:linClrLst meth="repeat">
+      <a:schemeClr val="accent1"/>
+    </dgm:linClrLst>
+    <dgm:effectClrLst/>
+    <dgm:txLinClrLst/>
+    <dgm:txFillClrLst meth="repeat">
+      <a:schemeClr val="dk1"/>
+    </dgm:txFillClrLst>
+    <dgm:txEffectClrLst/>
+  </dgm:styleLbl>
+  <dgm:styleLbl name="solidFgAcc1">
+    <dgm:fillClrLst meth="repeat">
+      <a:schemeClr val="lt1"/>
+    </dgm:fillClrLst>
+    <dgm:linClrLst meth="repeat">
+      <a:schemeClr val="accent1"/>
+    </dgm:linClrLst>
+    <dgm:effectClrLst/>
+    <dgm:txLinClrLst/>
+    <dgm:txFillClrLst meth="repeat">
+      <a:schemeClr val="dk1"/>
+    </dgm:txFillClrLst>
+    <dgm:txEffectClrLst/>
+  </dgm:styleLbl>
+  <dgm:styleLbl name="solidAlignAcc1">
+    <dgm:fillClrLst meth="repeat">
+      <a:schemeClr val="lt1"/>
+    </dgm:fillClrLst>
+    <dgm:linClrLst meth="repeat">
+      <a:schemeClr val="accent1"/>
+    </dgm:linClrLst>
+    <dgm:effectClrLst/>
+    <dgm:txLinClrLst/>
+    <dgm:txFillClrLst meth="repeat">
+      <a:schemeClr val="dk1"/>
+    </dgm:txFillClrLst>
+    <dgm:txEffectClrLst/>
+  </dgm:styleLbl>
+  <dgm:styleLbl name="solidBgAcc1">
+    <dgm:fillClrLst meth="repeat">
+      <a:schemeClr val="lt1"/>
+    </dgm:fillClrLst>
+    <dgm:linClrLst meth="repeat">
+      <a:schemeClr val="accent1"/>
+    </dgm:linClrLst>
+    <dgm:effectClrLst/>
+    <dgm:txLinClrLst/>
+    <dgm:txFillClrLst meth="repeat">
+      <a:schemeClr val="dk1"/>
+    </dgm:txFillClrLst>
+    <dgm:txEffectClrLst/>
+  </dgm:styleLbl>
+  <dgm:styleLbl name="fgAccFollowNode1">
+    <dgm:fillClrLst meth="repeat">
+      <a:schemeClr val="accent1">
+        <a:alpha val="90000"/>
+        <a:tint val="40000"/>
+      </a:schemeClr>
+    </dgm:fillClrLst>
+    <dgm:linClrLst meth="repeat">
+      <a:schemeClr val="accent1">
+        <a:alpha val="90000"/>
+        <a:tint val="40000"/>
+      </a:schemeClr>
+    </dgm:linClrLst>
+    <dgm:effectClrLst/>
+    <dgm:txLinClrLst/>
+    <dgm:txFillClrLst meth="repeat">
+      <a:schemeClr val="dk1"/>
+    </dgm:txFillClrLst>
+    <dgm:txEffectClrLst/>
+  </dgm:styleLbl>
+  <dgm:styleLbl name="alignAccFollowNode1">
+    <dgm:fillClrLst meth="repeat">
+      <a:schemeClr val="accent1">
+        <a:alpha val="90000"/>
+        <a:tint val="40000"/>
+      </a:schemeClr>
+    </dgm:fillClrLst>
+    <dgm:linClrLst meth="repeat">
+      <a:schemeClr val="accent1">
+        <a:alpha val="90000"/>
+        <a:tint val="40000"/>
+      </a:schemeClr>
+    </dgm:linClrLst>
+    <dgm:effectClrLst/>
+    <dgm:txLinClrLst/>
+    <dgm:txFillClrLst meth="repeat">
+      <a:schemeClr val="dk1"/>
+    </dgm:txFillClrLst>
+    <dgm:txEffectClrLst/>
+  </dgm:styleLbl>
+  <dgm:styleLbl name="bgAccFollowNode1">
+    <dgm:fillClrLst meth="repeat">
+      <a:schemeClr val="accent1">
+        <a:alpha val="90000"/>
+        <a:tint val="40000"/>
+      </a:schemeClr>
+    </dgm:fillClrLst>
+    <dgm:linClrLst meth="repeat">
+      <a:schemeClr val="accent1">
+        <a:alpha val="90000"/>
+        <a:tint val="40000"/>
+      </a:schemeClr>
+    </dgm:linClrLst>
+    <dgm:effectClrLst/>
+    <dgm:txLinClrLst/>
+    <dgm:txFillClrLst meth="repeat">
+      <a:schemeClr val="dk1"/>
+    </dgm:txFillClrLst>
+    <dgm:txEffectClrLst/>
+  </dgm:styleLbl>
+  <dgm:styleLbl name="fgAcc0">
+    <dgm:fillClrLst meth="repeat">
+      <a:schemeClr val="lt1">
+        <a:alpha val="90000"/>
+      </a:schemeClr>
+    </dgm:fillClrLst>
+    <dgm:linClrLst meth="repeat">
+      <a:schemeClr val="accent1"/>
+    </dgm:linClrLst>
+    <dgm:effectClrLst/>
+    <dgm:txLinClrLst/>
+    <dgm:txFillClrLst meth="repeat">
+      <a:schemeClr val="dk1"/>
+    </dgm:txFillClrLst>
+    <dgm:txEffectClrLst/>
+  </dgm:styleLbl>
+  <dgm:styleLbl name="fgAcc2">
+    <dgm:fillClrLst meth="repeat">
+      <a:schemeClr val="lt1">
+        <a:alpha val="90000"/>
+      </a:schemeClr>
+    </dgm:fillClrLst>
+    <dgm:linClrLst meth="repeat">
+      <a:schemeClr val="accent1"/>
+    </dgm:linClrLst>
+    <dgm:effectClrLst/>
+    <dgm:txLinClrLst/>
+    <dgm:txFillClrLst meth="repeat">
+      <a:schemeClr val="dk1"/>
+    </dgm:txFillClrLst>
+    <dgm:txEffectClrLst/>
+  </dgm:styleLbl>
+  <dgm:styleLbl name="fgAcc3">
+    <dgm:fillClrLst meth="repeat">
+      <a:schemeClr val="lt1">
+        <a:alpha val="90000"/>
+      </a:schemeClr>
+    </dgm:fillClrLst>
+    <dgm:linClrLst meth="repeat">
+      <a:schemeClr val="accent1"/>
+    </dgm:linClrLst>
+    <dgm:effectClrLst/>
+    <dgm:txLinClrLst/>
+    <dgm:txFillClrLst meth="repeat">
+      <a:schemeClr val="dk1"/>
+    </dgm:txFillClrLst>
+    <dgm:txEffectClrLst/>
+  </dgm:styleLbl>
+  <dgm:styleLbl name="fgAcc4">
+    <dgm:fillClrLst meth="repeat">
+      <a:schemeClr val="lt1">
+        <a:alpha val="90000"/>
+      </a:schemeClr>
+    </dgm:fillClrLst>
+    <dgm:linClrLst meth="repeat">
+      <a:schemeClr val="accent1"/>
+    </dgm:linClrLst>
+    <dgm:effectClrLst/>
+    <dgm:txLinClrLst/>
+    <dgm:txFillClrLst meth="repeat">
+      <a:schemeClr val="dk1"/>
+    </dgm:txFillClrLst>
+    <dgm:txEffectClrLst/>
+  </dgm:styleLbl>
+  <dgm:styleLbl name="bgShp">
+    <dgm:fillClrLst meth="repeat">
+      <a:schemeClr val="accent1">
+        <a:tint val="40000"/>
+      </a:schemeClr>
+    </dgm:fillClrLst>
+    <dgm:linClrLst meth="repeat">
+      <a:schemeClr val="accent1"/>
+    </dgm:linClrLst>
+    <dgm:effectClrLst/>
+    <dgm:txLinClrLst/>
+    <dgm:txFillClrLst meth="repeat">
+      <a:schemeClr val="dk1"/>
+    </dgm:txFillClrLst>
+    <dgm:txEffectClrLst/>
+  </dgm:styleLbl>
+  <dgm:styleLbl name="dkBgShp">
+    <dgm:fillClrLst meth="repeat">
+      <a:schemeClr val="accent1">
+        <a:shade val="80000"/>
+      </a:schemeClr>
+    </dgm:fillClrLst>
+    <dgm:linClrLst meth="repeat">
+      <a:schemeClr val="accent1"/>
+    </dgm:linClrLst>
+    <dgm:effectClrLst/>
+    <dgm:txLinClrLst/>
+    <dgm:txFillClrLst meth="repeat">
+      <a:schemeClr val="lt1"/>
+    </dgm:txFillClrLst>
+    <dgm:txEffectClrLst/>
+  </dgm:styleLbl>
+  <dgm:styleLbl name="trBgShp">
+    <dgm:fillClrLst meth="repeat">
+      <a:schemeClr val="accent1">
+        <a:tint val="50000"/>
+        <a:alpha val="40000"/>
+      </a:schemeClr>
+    </dgm:fillClrLst>
+    <dgm:linClrLst meth="repeat">
+      <a:schemeClr val="accent1"/>
+    </dgm:linClrLst>
+    <dgm:effectClrLst/>
+    <dgm:txLinClrLst/>
+    <dgm:txFillClrLst meth="repeat">
+      <a:schemeClr val="lt1"/>
+    </dgm:txFillClrLst>
+    <dgm:txEffectClrLst/>
+  </dgm:styleLbl>
+  <dgm:styleLbl name="fgShp">
+    <dgm:fillClrLst meth="repeat">
+      <a:schemeClr val="accent1">
+        <a:tint val="60000"/>
+      </a:schemeClr>
+    </dgm:fillClrLst>
+    <dgm:linClrLst meth="repeat">
+      <a:schemeClr val="lt1"/>
+    </dgm:linClrLst>
+    <dgm:effectClrLst/>
+    <dgm:txLinClrLst/>
+    <dgm:txFillClrLst meth="repeat">
+      <a:schemeClr val="dk1"/>
+    </dgm:txFillClrLst>
+    <dgm:txEffectClrLst/>
+  </dgm:styleLbl>
+  <dgm:styleLbl name="revTx">
+    <dgm:fillClrLst meth="repeat">
+      <a:schemeClr val="lt1">
+        <a:alpha val="0"/>
+      </a:schemeClr>
+    </dgm:fillClrLst>
+    <dgm:linClrLst meth="repeat">
+      <a:schemeClr val="dk1">
+        <a:alpha val="0"/>
+      </a:schemeClr>
+    </dgm:linClrLst>
+    <dgm:effectClrLst/>
+    <dgm:txLinClrLst/>
+    <dgm:txFillClrLst meth="repeat">
+      <a:schemeClr val="tx1"/>
+    </dgm:txFillClrLst>
+    <dgm:txEffectClrLst/>
+  </dgm:styleLbl>
+</dgm:colorsDef>
+</file>
+
+<file path=word/diagrams/data1.xml><?xml version="1.0" encoding="utf-8"?>
+<dgm:dataModel xmlns:dgm="http://schemas.openxmlformats.org/drawingml/2006/diagram" xmlns:a="http://schemas.openxmlformats.org/drawingml/2006/main">
+  <dgm:ptLst>
+    <dgm:pt modelId="{AAF4D74F-A463-4E1B-B163-3A64F766E067}" type="doc">
+      <dgm:prSet loTypeId="urn:microsoft.com/office/officeart/2005/8/layout/default" loCatId="list" qsTypeId="urn:microsoft.com/office/officeart/2005/8/quickstyle/simple1" qsCatId="simple" csTypeId="urn:microsoft.com/office/officeart/2005/8/colors/accent1_2" csCatId="accent1" phldr="1"/>
+      <dgm:spPr/>
+      <dgm:t>
+        <a:bodyPr/>
+        <a:lstStyle/>
+        <a:p>
+          <a:endParaRPr lang="en-CA"/>
+        </a:p>
+      </dgm:t>
+    </dgm:pt>
+    <dgm:pt modelId="{7F97481E-035C-4A22-B252-1155FD773338}">
+      <dgm:prSet phldrT="[Text]" custT="1"/>
+      <dgm:spPr>
+        <a:solidFill>
+          <a:schemeClr val="bg1">
+            <a:lumMod val="95000"/>
+          </a:schemeClr>
+        </a:solidFill>
+      </dgm:spPr>
+      <dgm:t>
+        <a:bodyPr/>
+        <a:lstStyle/>
+        <a:p>
+          <a:pPr algn="ctr">
+            <a:buNone/>
+          </a:pPr>
+          <a:r>
+            <a:rPr lang="en-US" sz="900" b="1">
+              <a:solidFill>
+                <a:srgbClr val="CC0633"/>
+              </a:solidFill>
+              <a:latin typeface="Arial" panose="020B0604020202020204" pitchFamily="34" charset="0"/>
+              <a:cs typeface="Arial" panose="020B0604020202020204" pitchFamily="34" charset="0"/>
+            </a:rPr>
+            <a:t>Functional suitability</a:t>
+          </a:r>
+          <a:br>
+            <a:rPr lang="en-US" sz="700" b="1">
+              <a:solidFill>
+                <a:sysClr val="windowText" lastClr="000000"/>
+              </a:solidFill>
+              <a:latin typeface="Arial" panose="020B0604020202020204" pitchFamily="34" charset="0"/>
+              <a:cs typeface="Arial" panose="020B0604020202020204" pitchFamily="34" charset="0"/>
+            </a:rPr>
+          </a:br>
+          <a:r>
+            <a:rPr lang="en-US" sz="700">
+              <a:solidFill>
+                <a:sysClr val="windowText" lastClr="000000"/>
+              </a:solidFill>
+              <a:latin typeface="Arial" panose="020B0604020202020204" pitchFamily="34" charset="0"/>
+              <a:cs typeface="Arial" panose="020B0604020202020204" pitchFamily="34" charset="0"/>
+            </a:rPr>
+            <a:t>Evaluation, baseline, forests, metrics and artifacts work; no live inference UI is claimed.</a:t>
+          </a:r>
+          <a:endParaRPr lang="en-CA" sz="700">
+            <a:solidFill>
+              <a:sysClr val="windowText" lastClr="000000"/>
+            </a:solidFill>
+            <a:latin typeface="Arial" panose="020B0604020202020204" pitchFamily="34" charset="0"/>
+            <a:cs typeface="Arial" panose="020B0604020202020204" pitchFamily="34" charset="0"/>
+          </a:endParaRPr>
+        </a:p>
+      </dgm:t>
+    </dgm:pt>
+    <dgm:pt modelId="{8CA1C082-42B0-4CE1-8574-238B4EE2B452}" type="parTrans" cxnId="{FE684EDA-5632-47FB-8C5F-CBA7DEBD0C6F}">
+      <dgm:prSet/>
+      <dgm:spPr/>
+      <dgm:t>
+        <a:bodyPr/>
+        <a:lstStyle/>
+        <a:p>
+          <a:pPr algn="ctr"/>
+          <a:endParaRPr lang="en-CA" sz="700"/>
+        </a:p>
+      </dgm:t>
+    </dgm:pt>
+    <dgm:pt modelId="{150D48C6-E0A5-449D-9820-88223BF2861F}" type="sibTrans" cxnId="{FE684EDA-5632-47FB-8C5F-CBA7DEBD0C6F}">
+      <dgm:prSet/>
+      <dgm:spPr/>
+      <dgm:t>
+        <a:bodyPr/>
+        <a:lstStyle/>
+        <a:p>
+          <a:pPr algn="ctr"/>
+          <a:endParaRPr lang="en-CA" sz="700"/>
+        </a:p>
+      </dgm:t>
+    </dgm:pt>
+    <dgm:pt modelId="{A743E167-5E3B-456C-AF20-A5BDFBADC67B}">
+      <dgm:prSet phldrT="[Text]" custT="1"/>
+      <dgm:spPr>
+        <a:solidFill>
+          <a:schemeClr val="bg1">
+            <a:lumMod val="95000"/>
+          </a:schemeClr>
+        </a:solidFill>
+      </dgm:spPr>
+      <dgm:t>
+        <a:bodyPr/>
+        <a:lstStyle/>
+        <a:p>
+          <a:pPr algn="ctr">
+            <a:buNone/>
+          </a:pPr>
+          <a:r>
+            <a:rPr lang="en-CA" sz="900" b="1">
+              <a:solidFill>
+                <a:srgbClr val="CC0633"/>
+              </a:solidFill>
+              <a:latin typeface="Arial" panose="020B0604020202020204" pitchFamily="34" charset="0"/>
+              <a:cs typeface="Arial" panose="020B0604020202020204" pitchFamily="34" charset="0"/>
+            </a:rPr>
+            <a:t>Reliability</a:t>
+          </a:r>
+        </a:p>
+        <a:p>
+          <a:pPr algn="ctr"/>
+          <a:r>
+            <a:rPr lang="en-CA" sz="700" b="0">
+              <a:solidFill>
+                <a:sysClr val="windowText" lastClr="000000"/>
+              </a:solidFill>
+              <a:latin typeface="Arial" panose="020B0604020202020204" pitchFamily="34" charset="0"/>
+              <a:cs typeface="Arial" panose="020B0604020202020204" pitchFamily="34" charset="0"/>
+            </a:rPr>
+            <a:t>Fixed seeds and held-out evidence support repeatability; the small dataset creates high variance</a:t>
+          </a:r>
+          <a:r>
+            <a:rPr lang="en-CA" sz="700" b="1">
+              <a:solidFill>
+                <a:sysClr val="windowText" lastClr="000000"/>
+              </a:solidFill>
+              <a:latin typeface="Arial" panose="020B0604020202020204" pitchFamily="34" charset="0"/>
+              <a:cs typeface="Arial" panose="020B0604020202020204" pitchFamily="34" charset="0"/>
+            </a:rPr>
+            <a:t>.</a:t>
+          </a:r>
+        </a:p>
+      </dgm:t>
+    </dgm:pt>
+    <dgm:pt modelId="{8F0F8C44-F5E3-4BFC-9019-126C7CAC7427}" type="parTrans" cxnId="{5E02A0C8-DB8F-4940-98EA-29D937595C4F}">
+      <dgm:prSet/>
+      <dgm:spPr/>
+      <dgm:t>
+        <a:bodyPr/>
+        <a:lstStyle/>
+        <a:p>
+          <a:pPr algn="ctr"/>
+          <a:endParaRPr lang="en-CA" sz="700"/>
+        </a:p>
+      </dgm:t>
+    </dgm:pt>
+    <dgm:pt modelId="{7976DA7F-E061-4CAD-A0AB-D13E895D1EB1}" type="sibTrans" cxnId="{5E02A0C8-DB8F-4940-98EA-29D937595C4F}">
+      <dgm:prSet/>
+      <dgm:spPr/>
+      <dgm:t>
+        <a:bodyPr/>
+        <a:lstStyle/>
+        <a:p>
+          <a:pPr algn="ctr"/>
+          <a:endParaRPr lang="en-CA" sz="700"/>
+        </a:p>
+      </dgm:t>
+    </dgm:pt>
+    <dgm:pt modelId="{770F58DE-C771-4515-A5B1-437519FC63E8}">
+      <dgm:prSet phldrT="[Text]" custT="1"/>
+      <dgm:spPr>
+        <a:solidFill>
+          <a:schemeClr val="bg1">
+            <a:lumMod val="95000"/>
+          </a:schemeClr>
+        </a:solidFill>
+      </dgm:spPr>
+      <dgm:t>
+        <a:bodyPr/>
+        <a:lstStyle/>
+        <a:p>
+          <a:pPr algn="ctr">
+            <a:buNone/>
+          </a:pPr>
+          <a:r>
+            <a:rPr lang="en-CA" sz="900" b="1">
+              <a:solidFill>
+                <a:srgbClr val="CC0633"/>
+              </a:solidFill>
+              <a:latin typeface="Arial" panose="020B0604020202020204" pitchFamily="34" charset="0"/>
+              <a:cs typeface="Arial" panose="020B0604020202020204" pitchFamily="34" charset="0"/>
+            </a:rPr>
+            <a:t>Performance</a:t>
+          </a:r>
+        </a:p>
+        <a:p>
+          <a:pPr algn="ctr"/>
+          <a:r>
+            <a:rPr lang="en-CA" sz="700" b="0">
+              <a:solidFill>
+                <a:sysClr val="windowText" lastClr="000000"/>
+              </a:solidFill>
+              <a:latin typeface="Arial" panose="020B0604020202020204" pitchFamily="34" charset="0"/>
+              <a:cs typeface="Arial" panose="020B0604020202020204" pitchFamily="34" charset="0"/>
+            </a:rPr>
+            <a:t>scikit-learn runs quickly; the custom implementation is deliberately opt-in.</a:t>
+          </a:r>
+        </a:p>
+      </dgm:t>
+    </dgm:pt>
+    <dgm:pt modelId="{E286E71F-31FE-4C98-8F46-1BC658632E8E}" type="parTrans" cxnId="{E2C0EDE4-3078-4FCA-A4E1-37D7D0EE7068}">
+      <dgm:prSet/>
+      <dgm:spPr/>
+      <dgm:t>
+        <a:bodyPr/>
+        <a:lstStyle/>
+        <a:p>
+          <a:pPr algn="ctr"/>
+          <a:endParaRPr lang="en-CA" sz="700"/>
+        </a:p>
+      </dgm:t>
+    </dgm:pt>
+    <dgm:pt modelId="{617635CF-EACC-44FE-AEBF-FF873210DDF1}" type="sibTrans" cxnId="{E2C0EDE4-3078-4FCA-A4E1-37D7D0EE7068}">
+      <dgm:prSet/>
+      <dgm:spPr/>
+      <dgm:t>
+        <a:bodyPr/>
+        <a:lstStyle/>
+        <a:p>
+          <a:pPr algn="ctr"/>
+          <a:endParaRPr lang="en-CA" sz="700"/>
+        </a:p>
+      </dgm:t>
+    </dgm:pt>
+    <dgm:pt modelId="{AA1D138A-0532-4968-BA8A-3B8281AACCB2}">
+      <dgm:prSet phldrT="[Text]" custT="1"/>
+      <dgm:spPr>
+        <a:solidFill>
+          <a:schemeClr val="bg1">
+            <a:lumMod val="95000"/>
+          </a:schemeClr>
+        </a:solidFill>
+      </dgm:spPr>
+      <dgm:t>
+        <a:bodyPr/>
+        <a:lstStyle/>
+        <a:p>
+          <a:pPr algn="ctr">
+            <a:buNone/>
+          </a:pPr>
+          <a:r>
+            <a:rPr lang="en-CA" sz="900" b="1">
+              <a:solidFill>
+                <a:srgbClr val="CC0633"/>
+              </a:solidFill>
+              <a:latin typeface="Arial" panose="020B0604020202020204" pitchFamily="34" charset="0"/>
+              <a:cs typeface="Arial" panose="020B0604020202020204" pitchFamily="34" charset="0"/>
+            </a:rPr>
+            <a:t>Maintainability</a:t>
+          </a:r>
+        </a:p>
+        <a:p>
+          <a:pPr algn="ctr"/>
+          <a:r>
+            <a:rPr lang="en-CA" sz="700" b="0">
+              <a:solidFill>
+                <a:sysClr val="windowText" lastClr="000000"/>
+              </a:solidFill>
+              <a:latin typeface="Arial" panose="020B0604020202020204" pitchFamily="34" charset="0"/>
+              <a:cs typeface="Arial" panose="020B0604020202020204" pitchFamily="34" charset="0"/>
+            </a:rPr>
+            <a:t>Evaluation responsibilities are separated; raw preprocessing remains outside the clean run path.</a:t>
+          </a:r>
+        </a:p>
+      </dgm:t>
+    </dgm:pt>
+    <dgm:pt modelId="{65E08377-DCCA-4D50-861A-7647DA2375D9}" type="parTrans" cxnId="{C80D4580-E7DE-48C4-B84A-88EBD8E000C6}">
+      <dgm:prSet/>
+      <dgm:spPr/>
+      <dgm:t>
+        <a:bodyPr/>
+        <a:lstStyle/>
+        <a:p>
+          <a:pPr algn="ctr"/>
+          <a:endParaRPr lang="en-CA" sz="700"/>
+        </a:p>
+      </dgm:t>
+    </dgm:pt>
+    <dgm:pt modelId="{70BA5F55-7EB9-4510-B81A-1614FE740701}" type="sibTrans" cxnId="{C80D4580-E7DE-48C4-B84A-88EBD8E000C6}">
+      <dgm:prSet/>
+      <dgm:spPr/>
+      <dgm:t>
+        <a:bodyPr/>
+        <a:lstStyle/>
+        <a:p>
+          <a:pPr algn="ctr"/>
+          <a:endParaRPr lang="en-CA" sz="700"/>
+        </a:p>
+      </dgm:t>
+    </dgm:pt>
+    <dgm:pt modelId="{7E5DA96A-92DE-419D-9133-56AB5F247E65}">
+      <dgm:prSet phldrT="[Text]" custT="1"/>
+      <dgm:spPr>
+        <a:solidFill>
+          <a:schemeClr val="bg1">
+            <a:lumMod val="95000"/>
+          </a:schemeClr>
+        </a:solidFill>
+      </dgm:spPr>
+      <dgm:t>
+        <a:bodyPr/>
+        <a:lstStyle/>
+        <a:p>
+          <a:pPr algn="ctr">
+            <a:buNone/>
+          </a:pPr>
+          <a:r>
+            <a:rPr lang="en-CA" sz="900" b="1">
+              <a:solidFill>
+                <a:srgbClr val="CC0633"/>
+              </a:solidFill>
+              <a:latin typeface="Arial" panose="020B0604020202020204" pitchFamily="34" charset="0"/>
+              <a:cs typeface="Arial" panose="020B0604020202020204" pitchFamily="34" charset="0"/>
+            </a:rPr>
+            <a:t>Compatibility</a:t>
+          </a:r>
+        </a:p>
+        <a:p>
+          <a:pPr algn="ctr"/>
+          <a:r>
+            <a:rPr lang="en-CA" sz="700" b="0">
+              <a:solidFill>
+                <a:sysClr val="windowText" lastClr="000000"/>
+              </a:solidFill>
+              <a:latin typeface="Arial" panose="020B0604020202020204" pitchFamily="34" charset="0"/>
+              <a:cs typeface="Arial" panose="020B0604020202020204" pitchFamily="34" charset="0"/>
+            </a:rPr>
+            <a:t>Runs locally on Python 3.11+ from the included final CSV.</a:t>
+          </a:r>
+        </a:p>
+      </dgm:t>
+    </dgm:pt>
+    <dgm:pt modelId="{C9DC3A6B-B9C0-4C10-9F96-6DE4F4CF9E91}" type="parTrans" cxnId="{2B5785D6-0E06-46D0-BF03-A5541ED85BC6}">
+      <dgm:prSet/>
+      <dgm:spPr/>
+      <dgm:t>
+        <a:bodyPr/>
+        <a:lstStyle/>
+        <a:p>
+          <a:pPr algn="ctr"/>
+          <a:endParaRPr lang="en-CA" sz="700"/>
+        </a:p>
+      </dgm:t>
+    </dgm:pt>
+    <dgm:pt modelId="{AED3D913-EFAD-4A88-AD69-48E95D67B636}" type="sibTrans" cxnId="{2B5785D6-0E06-46D0-BF03-A5541ED85BC6}">
+      <dgm:prSet/>
+      <dgm:spPr/>
+      <dgm:t>
+        <a:bodyPr/>
+        <a:lstStyle/>
+        <a:p>
+          <a:pPr algn="ctr"/>
+          <a:endParaRPr lang="en-CA" sz="700"/>
+        </a:p>
+      </dgm:t>
+    </dgm:pt>
+    <dgm:pt modelId="{C3CAC716-2C14-4099-B8E0-CE8083204203}">
+      <dgm:prSet phldrT="[Text]" custT="1"/>
+      <dgm:spPr>
+        <a:solidFill>
+          <a:schemeClr val="bg1">
+            <a:lumMod val="95000"/>
+          </a:schemeClr>
+        </a:solidFill>
+      </dgm:spPr>
+      <dgm:t>
+        <a:bodyPr/>
+        <a:lstStyle/>
+        <a:p>
+          <a:pPr algn="ctr">
+            <a:buNone/>
+          </a:pPr>
+          <a:r>
+            <a:rPr lang="en-CA" sz="900" b="1">
+              <a:solidFill>
+                <a:srgbClr val="CC0633"/>
+              </a:solidFill>
+              <a:latin typeface="Arial" panose="020B0604020202020204" pitchFamily="34" charset="0"/>
+              <a:cs typeface="Arial" panose="020B0604020202020204" pitchFamily="34" charset="0"/>
+            </a:rPr>
+            <a:t>Security and usability</a:t>
+          </a:r>
+        </a:p>
+        <a:p>
+          <a:pPr algn="ctr"/>
+          <a:r>
+            <a:rPr lang="en-CA" sz="700" b="0">
+              <a:solidFill>
+                <a:sysClr val="windowText" lastClr="000000"/>
+              </a:solidFill>
+              <a:latin typeface="Arial" panose="020B0604020202020204" pitchFamily="34" charset="0"/>
+              <a:cs typeface="Arial" panose="020B0604020202020204" pitchFamily="34" charset="0"/>
+            </a:rPr>
+            <a:t>No credentials or student IDs are included; explicit warnings reduce financial risk.</a:t>
+          </a:r>
+        </a:p>
+      </dgm:t>
+    </dgm:pt>
+    <dgm:pt modelId="{4F9490F1-8685-4F3D-9336-C44DAC7A0019}" type="parTrans" cxnId="{F254991F-F930-4F0C-9C51-F8B512C0362C}">
+      <dgm:prSet/>
+      <dgm:spPr/>
+      <dgm:t>
+        <a:bodyPr/>
+        <a:lstStyle/>
+        <a:p>
+          <a:pPr algn="ctr"/>
+          <a:endParaRPr lang="en-CA" sz="700"/>
+        </a:p>
+      </dgm:t>
+    </dgm:pt>
+    <dgm:pt modelId="{7E3DB6DE-E7B2-4CB2-9D75-62DF40AF130F}" type="sibTrans" cxnId="{F254991F-F930-4F0C-9C51-F8B512C0362C}">
+      <dgm:prSet/>
+      <dgm:spPr/>
+      <dgm:t>
+        <a:bodyPr/>
+        <a:lstStyle/>
+        <a:p>
+          <a:pPr algn="ctr"/>
+          <a:endParaRPr lang="en-CA" sz="700"/>
+        </a:p>
+      </dgm:t>
+    </dgm:pt>
+    <dgm:pt modelId="{05D6EF6B-213A-4424-AE92-E61C7B5974D0}" type="pres">
+      <dgm:prSet presAssocID="{AAF4D74F-A463-4E1B-B163-3A64F766E067}" presName="diagram" presStyleCnt="0">
+        <dgm:presLayoutVars>
+          <dgm:dir/>
+          <dgm:resizeHandles val="exact"/>
+        </dgm:presLayoutVars>
+      </dgm:prSet>
+      <dgm:spPr/>
+    </dgm:pt>
+    <dgm:pt modelId="{6E8D28F7-7904-4231-89B5-51F61B512745}" type="pres">
+      <dgm:prSet presAssocID="{7F97481E-035C-4A22-B252-1155FD773338}" presName="node" presStyleLbl="node1" presStyleIdx="0" presStyleCnt="6" custLinFactNeighborX="9404" custLinFactNeighborY="16418">
+        <dgm:presLayoutVars>
+          <dgm:bulletEnabled val="1"/>
+        </dgm:presLayoutVars>
+      </dgm:prSet>
+      <dgm:spPr/>
+    </dgm:pt>
+    <dgm:pt modelId="{6B51B35E-6FF8-4FF6-A6B0-0D594EDAEFA0}" type="pres">
+      <dgm:prSet presAssocID="{150D48C6-E0A5-449D-9820-88223BF2861F}" presName="sibTrans" presStyleCnt="0"/>
+      <dgm:spPr/>
+    </dgm:pt>
+    <dgm:pt modelId="{A1D6DDBB-264C-4824-8E06-E008A622E658}" type="pres">
+      <dgm:prSet presAssocID="{A743E167-5E3B-456C-AF20-A5BDFBADC67B}" presName="node" presStyleLbl="node1" presStyleIdx="1" presStyleCnt="6" custLinFactNeighborX="-525" custLinFactNeighborY="16634">
+        <dgm:presLayoutVars>
+          <dgm:bulletEnabled val="1"/>
+        </dgm:presLayoutVars>
+      </dgm:prSet>
+      <dgm:spPr/>
+    </dgm:pt>
+    <dgm:pt modelId="{B847CF17-7CE1-4705-B303-AC06633AFCBE}" type="pres">
+      <dgm:prSet presAssocID="{7976DA7F-E061-4CAD-A0AB-D13E895D1EB1}" presName="sibTrans" presStyleCnt="0"/>
+      <dgm:spPr/>
+    </dgm:pt>
+    <dgm:pt modelId="{4A85C3F9-35EB-4740-856C-D2387C04674F}" type="pres">
+      <dgm:prSet presAssocID="{770F58DE-C771-4515-A5B1-437519FC63E8}" presName="node" presStyleLbl="node1" presStyleIdx="2" presStyleCnt="6" custLinFactNeighborX="-10441" custLinFactNeighborY="16622">
+        <dgm:presLayoutVars>
+          <dgm:bulletEnabled val="1"/>
+        </dgm:presLayoutVars>
+      </dgm:prSet>
+      <dgm:spPr/>
+    </dgm:pt>
+    <dgm:pt modelId="{696DFFCB-C5B3-4BE9-9EDB-C78FCB51DFE9}" type="pres">
+      <dgm:prSet presAssocID="{617635CF-EACC-44FE-AEBF-FF873210DDF1}" presName="sibTrans" presStyleCnt="0"/>
+      <dgm:spPr/>
+    </dgm:pt>
+    <dgm:pt modelId="{350F2A61-6A17-4753-A703-2BC8859DC964}" type="pres">
+      <dgm:prSet presAssocID="{AA1D138A-0532-4968-BA8A-3B8281AACCB2}" presName="node" presStyleLbl="node1" presStyleIdx="3" presStyleCnt="6" custLinFactNeighborX="9347" custLinFactNeighborY="64">
+        <dgm:presLayoutVars>
+          <dgm:bulletEnabled val="1"/>
+        </dgm:presLayoutVars>
+      </dgm:prSet>
+      <dgm:spPr/>
+    </dgm:pt>
+    <dgm:pt modelId="{DD4F7AF7-CA3B-42E8-BD21-A0ADFDE028DD}" type="pres">
+      <dgm:prSet presAssocID="{70BA5F55-7EB9-4510-B81A-1614FE740701}" presName="sibTrans" presStyleCnt="0"/>
+      <dgm:spPr/>
+    </dgm:pt>
+    <dgm:pt modelId="{093F8C40-B33D-4330-B62D-3BE7858E28C4}" type="pres">
+      <dgm:prSet presAssocID="{7E5DA96A-92DE-419D-9133-56AB5F247E65}" presName="node" presStyleLbl="node1" presStyleIdx="4" presStyleCnt="6" custLinFactNeighborX="-470">
+        <dgm:presLayoutVars>
+          <dgm:bulletEnabled val="1"/>
+        </dgm:presLayoutVars>
+      </dgm:prSet>
+      <dgm:spPr/>
+    </dgm:pt>
+    <dgm:pt modelId="{2314F259-B726-4601-865E-610ADFE579A8}" type="pres">
+      <dgm:prSet presAssocID="{AED3D913-EFAD-4A88-AD69-48E95D67B636}" presName="sibTrans" presStyleCnt="0"/>
+      <dgm:spPr/>
+    </dgm:pt>
+    <dgm:pt modelId="{AAC04123-6E15-4245-9D83-B8EF10F65644}" type="pres">
+      <dgm:prSet presAssocID="{C3CAC716-2C14-4099-B8E0-CE8083204203}" presName="node" presStyleLbl="node1" presStyleIdx="5" presStyleCnt="6" custLinFactNeighborX="-10340">
+        <dgm:presLayoutVars>
+          <dgm:bulletEnabled val="1"/>
+        </dgm:presLayoutVars>
+      </dgm:prSet>
+      <dgm:spPr/>
+    </dgm:pt>
+  </dgm:ptLst>
+  <dgm:cxnLst>
+    <dgm:cxn modelId="{744A0C04-2070-45B3-A777-8AADC1D936D5}" type="presOf" srcId="{770F58DE-C771-4515-A5B1-437519FC63E8}" destId="{4A85C3F9-35EB-4740-856C-D2387C04674F}" srcOrd="0" destOrd="0" presId="urn:microsoft.com/office/officeart/2005/8/layout/default"/>
+    <dgm:cxn modelId="{BB751309-3220-497F-9D3D-3D52FDE8A12E}" type="presOf" srcId="{AAF4D74F-A463-4E1B-B163-3A64F766E067}" destId="{05D6EF6B-213A-4424-AE92-E61C7B5974D0}" srcOrd="0" destOrd="0" presId="urn:microsoft.com/office/officeart/2005/8/layout/default"/>
+    <dgm:cxn modelId="{F254991F-F930-4F0C-9C51-F8B512C0362C}" srcId="{AAF4D74F-A463-4E1B-B163-3A64F766E067}" destId="{C3CAC716-2C14-4099-B8E0-CE8083204203}" srcOrd="5" destOrd="0" parTransId="{4F9490F1-8685-4F3D-9336-C44DAC7A0019}" sibTransId="{7E3DB6DE-E7B2-4CB2-9D75-62DF40AF130F}"/>
+    <dgm:cxn modelId="{B15A9D7B-6CE1-4FFD-8D69-B3942CDC06AB}" type="presOf" srcId="{AA1D138A-0532-4968-BA8A-3B8281AACCB2}" destId="{350F2A61-6A17-4753-A703-2BC8859DC964}" srcOrd="0" destOrd="0" presId="urn:microsoft.com/office/officeart/2005/8/layout/default"/>
+    <dgm:cxn modelId="{C80D4580-E7DE-48C4-B84A-88EBD8E000C6}" srcId="{AAF4D74F-A463-4E1B-B163-3A64F766E067}" destId="{AA1D138A-0532-4968-BA8A-3B8281AACCB2}" srcOrd="3" destOrd="0" parTransId="{65E08377-DCCA-4D50-861A-7647DA2375D9}" sibTransId="{70BA5F55-7EB9-4510-B81A-1614FE740701}"/>
+    <dgm:cxn modelId="{5E02A0C8-DB8F-4940-98EA-29D937595C4F}" srcId="{AAF4D74F-A463-4E1B-B163-3A64F766E067}" destId="{A743E167-5E3B-456C-AF20-A5BDFBADC67B}" srcOrd="1" destOrd="0" parTransId="{8F0F8C44-F5E3-4BFC-9019-126C7CAC7427}" sibTransId="{7976DA7F-E061-4CAD-A0AB-D13E895D1EB1}"/>
+    <dgm:cxn modelId="{2B5785D6-0E06-46D0-BF03-A5541ED85BC6}" srcId="{AAF4D74F-A463-4E1B-B163-3A64F766E067}" destId="{7E5DA96A-92DE-419D-9133-56AB5F247E65}" srcOrd="4" destOrd="0" parTransId="{C9DC3A6B-B9C0-4C10-9F96-6DE4F4CF9E91}" sibTransId="{AED3D913-EFAD-4A88-AD69-48E95D67B636}"/>
+    <dgm:cxn modelId="{FE684EDA-5632-47FB-8C5F-CBA7DEBD0C6F}" srcId="{AAF4D74F-A463-4E1B-B163-3A64F766E067}" destId="{7F97481E-035C-4A22-B252-1155FD773338}" srcOrd="0" destOrd="0" parTransId="{8CA1C082-42B0-4CE1-8574-238B4EE2B452}" sibTransId="{150D48C6-E0A5-449D-9820-88223BF2861F}"/>
+    <dgm:cxn modelId="{E2C0EDE4-3078-4FCA-A4E1-37D7D0EE7068}" srcId="{AAF4D74F-A463-4E1B-B163-3A64F766E067}" destId="{770F58DE-C771-4515-A5B1-437519FC63E8}" srcOrd="2" destOrd="0" parTransId="{E286E71F-31FE-4C98-8F46-1BC658632E8E}" sibTransId="{617635CF-EACC-44FE-AEBF-FF873210DDF1}"/>
+    <dgm:cxn modelId="{FC9F00F2-5084-4937-B43E-682D3AA7CFD0}" type="presOf" srcId="{A743E167-5E3B-456C-AF20-A5BDFBADC67B}" destId="{A1D6DDBB-264C-4824-8E06-E008A622E658}" srcOrd="0" destOrd="0" presId="urn:microsoft.com/office/officeart/2005/8/layout/default"/>
+    <dgm:cxn modelId="{E64205F8-123D-49E7-976A-77C8E1B79043}" type="presOf" srcId="{C3CAC716-2C14-4099-B8E0-CE8083204203}" destId="{AAC04123-6E15-4245-9D83-B8EF10F65644}" srcOrd="0" destOrd="0" presId="urn:microsoft.com/office/officeart/2005/8/layout/default"/>
+    <dgm:cxn modelId="{B618B1FC-B2EB-4534-8701-13CCFE4B45DD}" type="presOf" srcId="{7E5DA96A-92DE-419D-9133-56AB5F247E65}" destId="{093F8C40-B33D-4330-B62D-3BE7858E28C4}" srcOrd="0" destOrd="0" presId="urn:microsoft.com/office/officeart/2005/8/layout/default"/>
+    <dgm:cxn modelId="{F48B59FE-63CF-486B-8E3B-0606BBF7F031}" type="presOf" srcId="{7F97481E-035C-4A22-B252-1155FD773338}" destId="{6E8D28F7-7904-4231-89B5-51F61B512745}" srcOrd="0" destOrd="0" presId="urn:microsoft.com/office/officeart/2005/8/layout/default"/>
+    <dgm:cxn modelId="{8A17A5D1-65F0-4ABC-83DF-A4825B093EC3}" type="presParOf" srcId="{05D6EF6B-213A-4424-AE92-E61C7B5974D0}" destId="{6E8D28F7-7904-4231-89B5-51F61B512745}" srcOrd="0" destOrd="0" presId="urn:microsoft.com/office/officeart/2005/8/layout/default"/>
+    <dgm:cxn modelId="{421342DD-775F-4B85-A9A3-622DBA1FF687}" type="presParOf" srcId="{05D6EF6B-213A-4424-AE92-E61C7B5974D0}" destId="{6B51B35E-6FF8-4FF6-A6B0-0D594EDAEFA0}" srcOrd="1" destOrd="0" presId="urn:microsoft.com/office/officeart/2005/8/layout/default"/>
+    <dgm:cxn modelId="{2F2DE136-1516-4E2E-A6FB-DFFB11CD9BAD}" type="presParOf" srcId="{05D6EF6B-213A-4424-AE92-E61C7B5974D0}" destId="{A1D6DDBB-264C-4824-8E06-E008A622E658}" srcOrd="2" destOrd="0" presId="urn:microsoft.com/office/officeart/2005/8/layout/default"/>
+    <dgm:cxn modelId="{5ED7A069-C3A1-439C-8DD2-680F63FCFDAD}" type="presParOf" srcId="{05D6EF6B-213A-4424-AE92-E61C7B5974D0}" destId="{B847CF17-7CE1-4705-B303-AC06633AFCBE}" srcOrd="3" destOrd="0" presId="urn:microsoft.com/office/officeart/2005/8/layout/default"/>
+    <dgm:cxn modelId="{C7FDA457-E6CC-422D-98FD-D827CC0DECEA}" type="presParOf" srcId="{05D6EF6B-213A-4424-AE92-E61C7B5974D0}" destId="{4A85C3F9-35EB-4740-856C-D2387C04674F}" srcOrd="4" destOrd="0" presId="urn:microsoft.com/office/officeart/2005/8/layout/default"/>
+    <dgm:cxn modelId="{31967EC0-50CA-45AD-B0DA-28DCCA13A5F0}" type="presParOf" srcId="{05D6EF6B-213A-4424-AE92-E61C7B5974D0}" destId="{696DFFCB-C5B3-4BE9-9EDB-C78FCB51DFE9}" srcOrd="5" destOrd="0" presId="urn:microsoft.com/office/officeart/2005/8/layout/default"/>
+    <dgm:cxn modelId="{EAB6511E-24F1-46FE-97AA-743E9790964E}" type="presParOf" srcId="{05D6EF6B-213A-4424-AE92-E61C7B5974D0}" destId="{350F2A61-6A17-4753-A703-2BC8859DC964}" srcOrd="6" destOrd="0" presId="urn:microsoft.com/office/officeart/2005/8/layout/default"/>
+    <dgm:cxn modelId="{59AA144F-A19D-4F64-98CE-597E041F01B6}" type="presParOf" srcId="{05D6EF6B-213A-4424-AE92-E61C7B5974D0}" destId="{DD4F7AF7-CA3B-42E8-BD21-A0ADFDE028DD}" srcOrd="7" destOrd="0" presId="urn:microsoft.com/office/officeart/2005/8/layout/default"/>
+    <dgm:cxn modelId="{656E48A2-C84B-4380-B709-71D5AD62E74F}" type="presParOf" srcId="{05D6EF6B-213A-4424-AE92-E61C7B5974D0}" destId="{093F8C40-B33D-4330-B62D-3BE7858E28C4}" srcOrd="8" destOrd="0" presId="urn:microsoft.com/office/officeart/2005/8/layout/default"/>
+    <dgm:cxn modelId="{BA946809-BBFF-4970-BB6D-DB69B0180B68}" type="presParOf" srcId="{05D6EF6B-213A-4424-AE92-E61C7B5974D0}" destId="{2314F259-B726-4601-865E-610ADFE579A8}" srcOrd="9" destOrd="0" presId="urn:microsoft.com/office/officeart/2005/8/layout/default"/>
+    <dgm:cxn modelId="{1131C6D0-2D40-484A-B7EE-BECE46B4A0FA}" type="presParOf" srcId="{05D6EF6B-213A-4424-AE92-E61C7B5974D0}" destId="{AAC04123-6E15-4245-9D83-B8EF10F65644}" srcOrd="10" destOrd="0" presId="urn:microsoft.com/office/officeart/2005/8/layout/default"/>
+  </dgm:cxnLst>
+  <dgm:bg/>
+  <dgm:whole/>
+  <dgm:extLst>
+    <a:ext uri="http://schemas.microsoft.com/office/drawing/2008/diagram">
+      <dsp:dataModelExt xmlns:dsp="http://schemas.microsoft.com/office/drawing/2008/diagram" relId="rId14" minVer="http://schemas.openxmlformats.org/drawingml/2006/diagram"/>
+    </a:ext>
+  </dgm:extLst>
+</dgm:dataModel>
+</file>
+
+<file path=word/diagrams/drawing1.xml><?xml version="1.0" encoding="utf-8"?>
+<dsp:drawing xmlns:dgm="http://schemas.openxmlformats.org/drawingml/2006/diagram" xmlns:dsp="http://schemas.microsoft.com/office/drawing/2008/diagram" xmlns:a="http://schemas.openxmlformats.org/drawingml/2006/main">
+  <dsp:spTree>
+    <dsp:nvGrpSpPr>
+      <dsp:cNvPr id="0" name=""/>
+      <dsp:cNvGrpSpPr/>
+    </dsp:nvGrpSpPr>
+    <dsp:grpSpPr/>
+    <dsp:sp modelId="{6E8D28F7-7904-4231-89B5-51F61B512745}">
+      <dsp:nvSpPr>
+        <dsp:cNvPr id="0" name=""/>
+        <dsp:cNvSpPr/>
+      </dsp:nvSpPr>
+      <dsp:spPr>
+        <a:xfrm>
+          <a:off x="912032" y="160275"/>
+          <a:ext cx="1620738" cy="972442"/>
+        </a:xfrm>
+        <a:prstGeom prst="rect">
+          <a:avLst/>
+        </a:prstGeom>
+        <a:solidFill>
+          <a:schemeClr val="bg1">
+            <a:lumMod val="95000"/>
+          </a:schemeClr>
+        </a:solidFill>
+        <a:ln w="25400" cap="flat" cmpd="sng" algn="ctr">
+          <a:solidFill>
+            <a:schemeClr val="lt1">
+              <a:hueOff val="0"/>
+              <a:satOff val="0"/>
+              <a:lumOff val="0"/>
+              <a:alphaOff val="0"/>
+            </a:schemeClr>
+          </a:solidFill>
+          <a:prstDash val="solid"/>
+        </a:ln>
+        <a:effectLst/>
+      </dsp:spPr>
+      <dsp:style>
+        <a:lnRef idx="2">
+          <a:scrgbClr r="0" g="0" b="0"/>
+        </a:lnRef>
+        <a:fillRef idx="1">
+          <a:scrgbClr r="0" g="0" b="0"/>
+        </a:fillRef>
+        <a:effectRef idx="0">
+          <a:scrgbClr r="0" g="0" b="0"/>
+        </a:effectRef>
+        <a:fontRef idx="minor">
+          <a:schemeClr val="lt1"/>
+        </a:fontRef>
+      </dsp:style>
+      <dsp:txBody>
+        <a:bodyPr spcFirstLastPara="0" vert="horz" wrap="square" lIns="34290" tIns="34290" rIns="34290" bIns="34290" numCol="1" spcCol="1270" anchor="ctr" anchorCtr="0">
+          <a:noAutofit/>
+        </a:bodyPr>
+        <a:lstStyle/>
+        <a:p>
+          <a:pPr marL="0" lvl="0" indent="0" algn="ctr" defTabSz="400050">
+            <a:lnSpc>
+              <a:spcPct val="90000"/>
+            </a:lnSpc>
+            <a:spcBef>
+              <a:spcPct val="0"/>
+            </a:spcBef>
+            <a:spcAft>
+              <a:spcPct val="35000"/>
+            </a:spcAft>
+            <a:buNone/>
+          </a:pPr>
+          <a:r>
+            <a:rPr lang="en-US" sz="900" b="1" kern="1200">
+              <a:solidFill>
+                <a:srgbClr val="CC0633"/>
+              </a:solidFill>
+              <a:latin typeface="Arial" panose="020B0604020202020204" pitchFamily="34" charset="0"/>
+              <a:cs typeface="Arial" panose="020B0604020202020204" pitchFamily="34" charset="0"/>
+            </a:rPr>
+            <a:t>Functional suitability</a:t>
+          </a:r>
+          <a:br>
+            <a:rPr lang="en-US" sz="700" b="1" kern="1200">
+              <a:solidFill>
+                <a:sysClr val="windowText" lastClr="000000"/>
+              </a:solidFill>
+              <a:latin typeface="Arial" panose="020B0604020202020204" pitchFamily="34" charset="0"/>
+              <a:cs typeface="Arial" panose="020B0604020202020204" pitchFamily="34" charset="0"/>
+            </a:rPr>
+          </a:br>
+          <a:r>
+            <a:rPr lang="en-US" sz="700" kern="1200">
+              <a:solidFill>
+                <a:sysClr val="windowText" lastClr="000000"/>
+              </a:solidFill>
+              <a:latin typeface="Arial" panose="020B0604020202020204" pitchFamily="34" charset="0"/>
+              <a:cs typeface="Arial" panose="020B0604020202020204" pitchFamily="34" charset="0"/>
+            </a:rPr>
+            <a:t>Evaluation, baseline, forests, metrics and artifacts work; no live inference UI is claimed.</a:t>
+          </a:r>
+          <a:endParaRPr lang="en-CA" sz="700" kern="1200">
+            <a:solidFill>
+              <a:sysClr val="windowText" lastClr="000000"/>
+            </a:solidFill>
+            <a:latin typeface="Arial" panose="020B0604020202020204" pitchFamily="34" charset="0"/>
+            <a:cs typeface="Arial" panose="020B0604020202020204" pitchFamily="34" charset="0"/>
+          </a:endParaRPr>
+        </a:p>
+      </dsp:txBody>
+      <dsp:txXfrm>
+        <a:off x="912032" y="160275"/>
+        <a:ext cx="1620738" cy="972442"/>
+      </dsp:txXfrm>
+    </dsp:sp>
+    <dsp:sp modelId="{A1D6DDBB-264C-4824-8E06-E008A622E658}">
+      <dsp:nvSpPr>
+        <dsp:cNvPr id="0" name=""/>
+        <dsp:cNvSpPr/>
+      </dsp:nvSpPr>
+      <dsp:spPr>
+        <a:xfrm>
+          <a:off x="2533921" y="162376"/>
+          <a:ext cx="1620738" cy="972442"/>
+        </a:xfrm>
+        <a:prstGeom prst="rect">
+          <a:avLst/>
+        </a:prstGeom>
+        <a:solidFill>
+          <a:schemeClr val="bg1">
+            <a:lumMod val="95000"/>
+          </a:schemeClr>
+        </a:solidFill>
+        <a:ln w="25400" cap="flat" cmpd="sng" algn="ctr">
+          <a:solidFill>
+            <a:schemeClr val="lt1">
+              <a:hueOff val="0"/>
+              <a:satOff val="0"/>
+              <a:lumOff val="0"/>
+              <a:alphaOff val="0"/>
+            </a:schemeClr>
+          </a:solidFill>
+          <a:prstDash val="solid"/>
+        </a:ln>
+        <a:effectLst/>
+      </dsp:spPr>
+      <dsp:style>
+        <a:lnRef idx="2">
+          <a:scrgbClr r="0" g="0" b="0"/>
+        </a:lnRef>
+        <a:fillRef idx="1">
+          <a:scrgbClr r="0" g="0" b="0"/>
+        </a:fillRef>
+        <a:effectRef idx="0">
+          <a:scrgbClr r="0" g="0" b="0"/>
+        </a:effectRef>
+        <a:fontRef idx="minor">
+          <a:schemeClr val="lt1"/>
+        </a:fontRef>
+      </dsp:style>
+      <dsp:txBody>
+        <a:bodyPr spcFirstLastPara="0" vert="horz" wrap="square" lIns="34290" tIns="34290" rIns="34290" bIns="34290" numCol="1" spcCol="1270" anchor="ctr" anchorCtr="0">
+          <a:noAutofit/>
+        </a:bodyPr>
+        <a:lstStyle/>
+        <a:p>
+          <a:pPr marL="0" lvl="0" indent="0" algn="ctr" defTabSz="400050">
+            <a:lnSpc>
+              <a:spcPct val="90000"/>
+            </a:lnSpc>
+            <a:spcBef>
+              <a:spcPct val="0"/>
+            </a:spcBef>
+            <a:spcAft>
+              <a:spcPct val="35000"/>
+            </a:spcAft>
+            <a:buNone/>
+          </a:pPr>
+          <a:r>
+            <a:rPr lang="en-CA" sz="900" b="1" kern="1200">
+              <a:solidFill>
+                <a:srgbClr val="CC0633"/>
+              </a:solidFill>
+              <a:latin typeface="Arial" panose="020B0604020202020204" pitchFamily="34" charset="0"/>
+              <a:cs typeface="Arial" panose="020B0604020202020204" pitchFamily="34" charset="0"/>
+            </a:rPr>
+            <a:t>Reliability</a:t>
+          </a:r>
+        </a:p>
+        <a:p>
+          <a:pPr marL="0" lvl="0" indent="0" algn="ctr" defTabSz="400050">
+            <a:lnSpc>
+              <a:spcPct val="90000"/>
+            </a:lnSpc>
+            <a:spcBef>
+              <a:spcPct val="0"/>
+            </a:spcBef>
+            <a:spcAft>
+              <a:spcPct val="35000"/>
+            </a:spcAft>
+            <a:buNone/>
+          </a:pPr>
+          <a:r>
+            <a:rPr lang="en-CA" sz="700" b="0" kern="1200">
+              <a:solidFill>
+                <a:sysClr val="windowText" lastClr="000000"/>
+              </a:solidFill>
+              <a:latin typeface="Arial" panose="020B0604020202020204" pitchFamily="34" charset="0"/>
+              <a:cs typeface="Arial" panose="020B0604020202020204" pitchFamily="34" charset="0"/>
+            </a:rPr>
+            <a:t>Fixed seeds and held-out evidence support repeatability; the small dataset creates high variance</a:t>
+          </a:r>
+          <a:r>
+            <a:rPr lang="en-CA" sz="700" b="1" kern="1200">
+              <a:solidFill>
+                <a:sysClr val="windowText" lastClr="000000"/>
+              </a:solidFill>
+              <a:latin typeface="Arial" panose="020B0604020202020204" pitchFamily="34" charset="0"/>
+              <a:cs typeface="Arial" panose="020B0604020202020204" pitchFamily="34" charset="0"/>
+            </a:rPr>
+            <a:t>.</a:t>
+          </a:r>
+        </a:p>
+      </dsp:txBody>
+      <dsp:txXfrm>
+        <a:off x="2533921" y="162376"/>
+        <a:ext cx="1620738" cy="972442"/>
+      </dsp:txXfrm>
+    </dsp:sp>
+    <dsp:sp modelId="{4A85C3F9-35EB-4740-856C-D2387C04674F}">
+      <dsp:nvSpPr>
+        <dsp:cNvPr id="0" name=""/>
+        <dsp:cNvSpPr/>
+      </dsp:nvSpPr>
+      <dsp:spPr>
+        <a:xfrm>
+          <a:off x="4156021" y="162259"/>
+          <a:ext cx="1620738" cy="972442"/>
+        </a:xfrm>
+        <a:prstGeom prst="rect">
+          <a:avLst/>
+        </a:prstGeom>
+        <a:solidFill>
+          <a:schemeClr val="bg1">
+            <a:lumMod val="95000"/>
+          </a:schemeClr>
+        </a:solidFill>
+        <a:ln w="25400" cap="flat" cmpd="sng" algn="ctr">
+          <a:solidFill>
+            <a:schemeClr val="lt1">
+              <a:hueOff val="0"/>
+              <a:satOff val="0"/>
+              <a:lumOff val="0"/>
+              <a:alphaOff val="0"/>
+            </a:schemeClr>
+          </a:solidFill>
+          <a:prstDash val="solid"/>
+        </a:ln>
+        <a:effectLst/>
+      </dsp:spPr>
+      <dsp:style>
+        <a:lnRef idx="2">
+          <a:scrgbClr r="0" g="0" b="0"/>
+        </a:lnRef>
+        <a:fillRef idx="1">
+          <a:scrgbClr r="0" g="0" b="0"/>
+        </a:fillRef>
+        <a:effectRef idx="0">
+          <a:scrgbClr r="0" g="0" b="0"/>
+        </a:effectRef>
+        <a:fontRef idx="minor">
+          <a:schemeClr val="lt1"/>
+        </a:fontRef>
+      </dsp:style>
+      <dsp:txBody>
+        <a:bodyPr spcFirstLastPara="0" vert="horz" wrap="square" lIns="34290" tIns="34290" rIns="34290" bIns="34290" numCol="1" spcCol="1270" anchor="ctr" anchorCtr="0">
+          <a:noAutofit/>
+        </a:bodyPr>
+        <a:lstStyle/>
+        <a:p>
+          <a:pPr marL="0" lvl="0" indent="0" algn="ctr" defTabSz="400050">
+            <a:lnSpc>
+              <a:spcPct val="90000"/>
+            </a:lnSpc>
+            <a:spcBef>
+              <a:spcPct val="0"/>
+            </a:spcBef>
+            <a:spcAft>
+              <a:spcPct val="35000"/>
+            </a:spcAft>
+            <a:buNone/>
+          </a:pPr>
+          <a:r>
+            <a:rPr lang="en-CA" sz="900" b="1" kern="1200">
+              <a:solidFill>
+                <a:srgbClr val="CC0633"/>
+              </a:solidFill>
+              <a:latin typeface="Arial" panose="020B0604020202020204" pitchFamily="34" charset="0"/>
+              <a:cs typeface="Arial" panose="020B0604020202020204" pitchFamily="34" charset="0"/>
+            </a:rPr>
+            <a:t>Performance</a:t>
+          </a:r>
+        </a:p>
+        <a:p>
+          <a:pPr marL="0" lvl="0" indent="0" algn="ctr" defTabSz="400050">
+            <a:lnSpc>
+              <a:spcPct val="90000"/>
+            </a:lnSpc>
+            <a:spcBef>
+              <a:spcPct val="0"/>
+            </a:spcBef>
+            <a:spcAft>
+              <a:spcPct val="35000"/>
+            </a:spcAft>
+            <a:buNone/>
+          </a:pPr>
+          <a:r>
+            <a:rPr lang="en-CA" sz="700" b="0" kern="1200">
+              <a:solidFill>
+                <a:sysClr val="windowText" lastClr="000000"/>
+              </a:solidFill>
+              <a:latin typeface="Arial" panose="020B0604020202020204" pitchFamily="34" charset="0"/>
+              <a:cs typeface="Arial" panose="020B0604020202020204" pitchFamily="34" charset="0"/>
+            </a:rPr>
+            <a:t>scikit-learn runs quickly; the custom implementation is deliberately opt-in.</a:t>
+          </a:r>
+        </a:p>
+      </dsp:txBody>
+      <dsp:txXfrm>
+        <a:off x="4156021" y="162259"/>
+        <a:ext cx="1620738" cy="972442"/>
+      </dsp:txXfrm>
+    </dsp:sp>
+    <dsp:sp modelId="{350F2A61-6A17-4753-A703-2BC8859DC964}">
+      <dsp:nvSpPr>
+        <dsp:cNvPr id="0" name=""/>
+        <dsp:cNvSpPr/>
+      </dsp:nvSpPr>
+      <dsp:spPr>
+        <a:xfrm>
+          <a:off x="911109" y="1135757"/>
+          <a:ext cx="1620738" cy="972442"/>
+        </a:xfrm>
+        <a:prstGeom prst="rect">
+          <a:avLst/>
+        </a:prstGeom>
+        <a:solidFill>
+          <a:schemeClr val="bg1">
+            <a:lumMod val="95000"/>
+          </a:schemeClr>
+        </a:solidFill>
+        <a:ln w="25400" cap="flat" cmpd="sng" algn="ctr">
+          <a:solidFill>
+            <a:schemeClr val="lt1">
+              <a:hueOff val="0"/>
+              <a:satOff val="0"/>
+              <a:lumOff val="0"/>
+              <a:alphaOff val="0"/>
+            </a:schemeClr>
+          </a:solidFill>
+          <a:prstDash val="solid"/>
+        </a:ln>
+        <a:effectLst/>
+      </dsp:spPr>
+      <dsp:style>
+        <a:lnRef idx="2">
+          <a:scrgbClr r="0" g="0" b="0"/>
+        </a:lnRef>
+        <a:fillRef idx="1">
+          <a:scrgbClr r="0" g="0" b="0"/>
+        </a:fillRef>
+        <a:effectRef idx="0">
+          <a:scrgbClr r="0" g="0" b="0"/>
+        </a:effectRef>
+        <a:fontRef idx="minor">
+          <a:schemeClr val="lt1"/>
+        </a:fontRef>
+      </dsp:style>
+      <dsp:txBody>
+        <a:bodyPr spcFirstLastPara="0" vert="horz" wrap="square" lIns="34290" tIns="34290" rIns="34290" bIns="34290" numCol="1" spcCol="1270" anchor="ctr" anchorCtr="0">
+          <a:noAutofit/>
+        </a:bodyPr>
+        <a:lstStyle/>
+        <a:p>
+          <a:pPr marL="0" lvl="0" indent="0" algn="ctr" defTabSz="400050">
+            <a:lnSpc>
+              <a:spcPct val="90000"/>
+            </a:lnSpc>
+            <a:spcBef>
+              <a:spcPct val="0"/>
+            </a:spcBef>
+            <a:spcAft>
+              <a:spcPct val="35000"/>
+            </a:spcAft>
+            <a:buNone/>
+          </a:pPr>
+          <a:r>
+            <a:rPr lang="en-CA" sz="900" b="1" kern="1200">
+              <a:solidFill>
+                <a:srgbClr val="CC0633"/>
+              </a:solidFill>
+              <a:latin typeface="Arial" panose="020B0604020202020204" pitchFamily="34" charset="0"/>
+              <a:cs typeface="Arial" panose="020B0604020202020204" pitchFamily="34" charset="0"/>
+            </a:rPr>
+            <a:t>Maintainability</a:t>
+          </a:r>
+        </a:p>
+        <a:p>
+          <a:pPr marL="0" lvl="0" indent="0" algn="ctr" defTabSz="400050">
+            <a:lnSpc>
+              <a:spcPct val="90000"/>
+            </a:lnSpc>
+            <a:spcBef>
+              <a:spcPct val="0"/>
+            </a:spcBef>
+            <a:spcAft>
+              <a:spcPct val="35000"/>
+            </a:spcAft>
+            <a:buNone/>
+          </a:pPr>
+          <a:r>
+            <a:rPr lang="en-CA" sz="700" b="0" kern="1200">
+              <a:solidFill>
+                <a:sysClr val="windowText" lastClr="000000"/>
+              </a:solidFill>
+              <a:latin typeface="Arial" panose="020B0604020202020204" pitchFamily="34" charset="0"/>
+              <a:cs typeface="Arial" panose="020B0604020202020204" pitchFamily="34" charset="0"/>
+            </a:rPr>
+            <a:t>Evaluation responsibilities are separated; raw preprocessing remains outside the clean run path.</a:t>
+          </a:r>
+        </a:p>
+      </dsp:txBody>
+      <dsp:txXfrm>
+        <a:off x="911109" y="1135757"/>
+        <a:ext cx="1620738" cy="972442"/>
+      </dsp:txXfrm>
+    </dsp:sp>
+    <dsp:sp modelId="{093F8C40-B33D-4330-B62D-3BE7858E28C4}">
+      <dsp:nvSpPr>
+        <dsp:cNvPr id="0" name=""/>
+        <dsp:cNvSpPr/>
+      </dsp:nvSpPr>
+      <dsp:spPr>
+        <a:xfrm>
+          <a:off x="2534813" y="1135136"/>
+          <a:ext cx="1620738" cy="972442"/>
+        </a:xfrm>
+        <a:prstGeom prst="rect">
+          <a:avLst/>
+        </a:prstGeom>
+        <a:solidFill>
+          <a:schemeClr val="bg1">
+            <a:lumMod val="95000"/>
+          </a:schemeClr>
+        </a:solidFill>
+        <a:ln w="25400" cap="flat" cmpd="sng" algn="ctr">
+          <a:solidFill>
+            <a:schemeClr val="lt1">
+              <a:hueOff val="0"/>
+              <a:satOff val="0"/>
+              <a:lumOff val="0"/>
+              <a:alphaOff val="0"/>
+            </a:schemeClr>
+          </a:solidFill>
+          <a:prstDash val="solid"/>
+        </a:ln>
+        <a:effectLst/>
+      </dsp:spPr>
+      <dsp:style>
+        <a:lnRef idx="2">
+          <a:scrgbClr r="0" g="0" b="0"/>
+        </a:lnRef>
+        <a:fillRef idx="1">
+          <a:scrgbClr r="0" g="0" b="0"/>
+        </a:fillRef>
+        <a:effectRef idx="0">
+          <a:scrgbClr r="0" g="0" b="0"/>
+        </a:effectRef>
+        <a:fontRef idx="minor">
+          <a:schemeClr val="lt1"/>
+        </a:fontRef>
+      </dsp:style>
+      <dsp:txBody>
+        <a:bodyPr spcFirstLastPara="0" vert="horz" wrap="square" lIns="34290" tIns="34290" rIns="34290" bIns="34290" numCol="1" spcCol="1270" anchor="ctr" anchorCtr="0">
+          <a:noAutofit/>
+        </a:bodyPr>
+        <a:lstStyle/>
+        <a:p>
+          <a:pPr marL="0" lvl="0" indent="0" algn="ctr" defTabSz="400050">
+            <a:lnSpc>
+              <a:spcPct val="90000"/>
+            </a:lnSpc>
+            <a:spcBef>
+              <a:spcPct val="0"/>
+            </a:spcBef>
+            <a:spcAft>
+              <a:spcPct val="35000"/>
+            </a:spcAft>
+            <a:buNone/>
+          </a:pPr>
+          <a:r>
+            <a:rPr lang="en-CA" sz="900" b="1" kern="1200">
+              <a:solidFill>
+                <a:srgbClr val="CC0633"/>
+              </a:solidFill>
+              <a:latin typeface="Arial" panose="020B0604020202020204" pitchFamily="34" charset="0"/>
+              <a:cs typeface="Arial" panose="020B0604020202020204" pitchFamily="34" charset="0"/>
+            </a:rPr>
+            <a:t>Compatibility</a:t>
+          </a:r>
+        </a:p>
+        <a:p>
+          <a:pPr marL="0" lvl="0" indent="0" algn="ctr" defTabSz="400050">
+            <a:lnSpc>
+              <a:spcPct val="90000"/>
+            </a:lnSpc>
+            <a:spcBef>
+              <a:spcPct val="0"/>
+            </a:spcBef>
+            <a:spcAft>
+              <a:spcPct val="35000"/>
+            </a:spcAft>
+            <a:buNone/>
+          </a:pPr>
+          <a:r>
+            <a:rPr lang="en-CA" sz="700" b="0" kern="1200">
+              <a:solidFill>
+                <a:sysClr val="windowText" lastClr="000000"/>
+              </a:solidFill>
+              <a:latin typeface="Arial" panose="020B0604020202020204" pitchFamily="34" charset="0"/>
+              <a:cs typeface="Arial" panose="020B0604020202020204" pitchFamily="34" charset="0"/>
+            </a:rPr>
+            <a:t>Runs locally on Python 3.11+ from the included final CSV.</a:t>
+          </a:r>
+        </a:p>
+      </dsp:txBody>
+      <dsp:txXfrm>
+        <a:off x="2534813" y="1135136"/>
+        <a:ext cx="1620738" cy="972442"/>
+      </dsp:txXfrm>
+    </dsp:sp>
+    <dsp:sp modelId="{AAC04123-6E15-4245-9D83-B8EF10F65644}">
+      <dsp:nvSpPr>
+        <dsp:cNvPr id="0" name=""/>
+        <dsp:cNvSpPr/>
+      </dsp:nvSpPr>
+      <dsp:spPr>
+        <a:xfrm>
+          <a:off x="4157658" y="1135136"/>
+          <a:ext cx="1620738" cy="972442"/>
+        </a:xfrm>
+        <a:prstGeom prst="rect">
+          <a:avLst/>
+        </a:prstGeom>
+        <a:solidFill>
+          <a:schemeClr val="bg1">
+            <a:lumMod val="95000"/>
+          </a:schemeClr>
+        </a:solidFill>
+        <a:ln w="25400" cap="flat" cmpd="sng" algn="ctr">
+          <a:solidFill>
+            <a:schemeClr val="lt1">
+              <a:hueOff val="0"/>
+              <a:satOff val="0"/>
+              <a:lumOff val="0"/>
+              <a:alphaOff val="0"/>
+            </a:schemeClr>
+          </a:solidFill>
+          <a:prstDash val="solid"/>
+        </a:ln>
+        <a:effectLst/>
+      </dsp:spPr>
+      <dsp:style>
+        <a:lnRef idx="2">
+          <a:scrgbClr r="0" g="0" b="0"/>
+        </a:lnRef>
+        <a:fillRef idx="1">
+          <a:scrgbClr r="0" g="0" b="0"/>
+        </a:fillRef>
+        <a:effectRef idx="0">
+          <a:scrgbClr r="0" g="0" b="0"/>
+        </a:effectRef>
+        <a:fontRef idx="minor">
+          <a:schemeClr val="lt1"/>
+        </a:fontRef>
+      </dsp:style>
+      <dsp:txBody>
+        <a:bodyPr spcFirstLastPara="0" vert="horz" wrap="square" lIns="34290" tIns="34290" rIns="34290" bIns="34290" numCol="1" spcCol="1270" anchor="ctr" anchorCtr="0">
+          <a:noAutofit/>
+        </a:bodyPr>
+        <a:lstStyle/>
+        <a:p>
+          <a:pPr marL="0" lvl="0" indent="0" algn="ctr" defTabSz="400050">
+            <a:lnSpc>
+              <a:spcPct val="90000"/>
+            </a:lnSpc>
+            <a:spcBef>
+              <a:spcPct val="0"/>
+            </a:spcBef>
+            <a:spcAft>
+              <a:spcPct val="35000"/>
+            </a:spcAft>
+            <a:buNone/>
+          </a:pPr>
+          <a:r>
+            <a:rPr lang="en-CA" sz="900" b="1" kern="1200">
+              <a:solidFill>
+                <a:srgbClr val="CC0633"/>
+              </a:solidFill>
+              <a:latin typeface="Arial" panose="020B0604020202020204" pitchFamily="34" charset="0"/>
+              <a:cs typeface="Arial" panose="020B0604020202020204" pitchFamily="34" charset="0"/>
+            </a:rPr>
+            <a:t>Security and usability</a:t>
+          </a:r>
+        </a:p>
+        <a:p>
+          <a:pPr marL="0" lvl="0" indent="0" algn="ctr" defTabSz="400050">
+            <a:lnSpc>
+              <a:spcPct val="90000"/>
+            </a:lnSpc>
+            <a:spcBef>
+              <a:spcPct val="0"/>
+            </a:spcBef>
+            <a:spcAft>
+              <a:spcPct val="35000"/>
+            </a:spcAft>
+            <a:buNone/>
+          </a:pPr>
+          <a:r>
+            <a:rPr lang="en-CA" sz="700" b="0" kern="1200">
+              <a:solidFill>
+                <a:sysClr val="windowText" lastClr="000000"/>
+              </a:solidFill>
+              <a:latin typeface="Arial" panose="020B0604020202020204" pitchFamily="34" charset="0"/>
+              <a:cs typeface="Arial" panose="020B0604020202020204" pitchFamily="34" charset="0"/>
+            </a:rPr>
+            <a:t>No credentials or student IDs are included; explicit warnings reduce financial risk.</a:t>
+          </a:r>
+        </a:p>
+      </dsp:txBody>
+      <dsp:txXfrm>
+        <a:off x="4157658" y="1135136"/>
+        <a:ext cx="1620738" cy="972442"/>
+      </dsp:txXfrm>
+    </dsp:sp>
+  </dsp:spTree>
+</dsp:drawing>
+</file>
+
+<file path=word/diagrams/layout1.xml><?xml version="1.0" encoding="utf-8"?>
+<dgm:layoutDef xmlns:dgm="http://schemas.openxmlformats.org/drawingml/2006/diagram" xmlns:a="http://schemas.openxmlformats.org/drawingml/2006/main" uniqueId="urn:microsoft.com/office/officeart/2005/8/layout/default">
+  <dgm:title val=""/>
+  <dgm:desc val=""/>
+  <dgm:catLst>
+    <dgm:cat type="list" pri="400"/>
+  </dgm:catLst>
+  <dgm:sampData>
+    <dgm:dataModel>
+      <dgm:ptLst>
+        <dgm:pt modelId="0" type="doc"/>
+        <dgm:pt modelId="1">
+          <dgm:prSet phldr="1"/>
+        </dgm:pt>
+        <dgm:pt modelId="2">
+          <dgm:prSet phldr="1"/>
+        </dgm:pt>
+        <dgm:pt modelId="3">
+          <dgm:prSet phldr="1"/>
+        </dgm:pt>
+        <dgm:pt modelId="4">
+          <dgm:prSet phldr="1"/>
+        </dgm:pt>
+        <dgm:pt modelId="5">
+          <dgm:prSet phldr="1"/>
+        </dgm:pt>
+      </dgm:ptLst>
+      <dgm:cxnLst>
+        <dgm:cxn modelId="6" srcId="0" destId="1" srcOrd="0" destOrd="0"/>
+        <dgm:cxn modelId="7" srcId="0" destId="2" srcOrd="1" destOrd="0"/>
+        <dgm:cxn modelId="8" srcId="0" destId="3" srcOrd="2" destOrd="0"/>
+        <dgm:cxn modelId="9" srcId="0" destId="4" srcOrd="3" destOrd="0"/>
+        <dgm:cxn modelId="10" srcId="0" destId="5" srcOrd="4" destOrd="0"/>
+      </dgm:cxnLst>
+      <dgm:bg/>
+      <dgm:whole/>
+    </dgm:dataModel>
+  </dgm:sampData>
+  <dgm:styleData>
+    <dgm:dataModel>
+      <dgm:ptLst>
+        <dgm:pt modelId="0" type="doc"/>
+        <dgm:pt modelId="1"/>
+        <dgm:pt modelId="2"/>
+      </dgm:ptLst>
+      <dgm:cxnLst>
+        <dgm:cxn modelId="3" srcId="0" destId="1" srcOrd="0" destOrd="0"/>
+        <dgm:cxn modelId="4" srcId="0" destId="2" srcOrd="1" destOrd="0"/>
+      </dgm:cxnLst>
+      <dgm:bg/>
+      <dgm:whole/>
+    </dgm:dataModel>
+  </dgm:styleData>
+  <dgm:clrData>
+    <dgm:dataModel>
+      <dgm:ptLst>
+        <dgm:pt modelId="0" type="doc"/>
+        <dgm:pt modelId="1"/>
+        <dgm:pt modelId="2"/>
+        <dgm:pt modelId="3"/>
+        <dgm:pt modelId="4"/>
+        <dgm:pt modelId="5"/>
+        <dgm:pt modelId="6"/>
+      </dgm:ptLst>
+      <dgm:cxnLst>
+        <dgm:cxn modelId="7" srcId="0" destId="1" srcOrd="0" destOrd="0"/>
+        <dgm:cxn modelId="8" srcId="0" destId="2" srcOrd="1" destOrd="0"/>
+        <dgm:cxn modelId="9" srcId="0" destId="3" srcOrd="2" destOrd="0"/>
+        <dgm:cxn modelId="10" srcId="0" destId="4" srcOrd="3" destOrd="0"/>
+        <dgm:cxn modelId="11" srcId="0" destId="5" srcOrd="4" destOrd="0"/>
+        <dgm:cxn modelId="12" srcId="0" destId="6" srcOrd="5" destOrd="0"/>
+      </dgm:cxnLst>
+      <dgm:bg/>
+      <dgm:whole/>
+    </dgm:dataModel>
+  </dgm:clrData>
+  <dgm:layoutNode name="diagram">
+    <dgm:varLst>
+      <dgm:dir/>
+      <dgm:resizeHandles val="exact"/>
+    </dgm:varLst>
+    <dgm:choose name="Name0">
+      <dgm:if name="Name1" func="var" arg="dir" op="equ" val="norm">
+        <dgm:alg type="snake">
+          <dgm:param type="grDir" val="tL"/>
+          <dgm:param type="flowDir" val="row"/>
+          <dgm:param type="contDir" val="sameDir"/>
+          <dgm:param type="off" val="ctr"/>
+        </dgm:alg>
+      </dgm:if>
+      <dgm:else name="Name2">
+        <dgm:alg type="snake">
+          <dgm:param type="grDir" val="tR"/>
+          <dgm:param type="flowDir" val="row"/>
+          <dgm:param type="contDir" val="sameDir"/>
+          <dgm:param type="off" val="ctr"/>
+        </dgm:alg>
+      </dgm:else>
+    </dgm:choose>
+    <dgm:shape xmlns:r="http://schemas.openxmlformats.org/officeDocument/2006/relationships" r:blip="">
+      <dgm:adjLst/>
+    </dgm:shape>
+    <dgm:presOf/>
+    <dgm:constrLst>
+      <dgm:constr type="w" for="ch" forName="node" refType="w"/>
+      <dgm:constr type="h" for="ch" forName="node" refType="w" refFor="ch" refForName="node" fact="0.6"/>
+      <dgm:constr type="w" for="ch" forName="sibTrans" refType="w" refFor="ch" refForName="node" fact="0.1"/>
+      <dgm:constr type="sp" refType="w" refFor="ch" refForName="sibTrans"/>
+      <dgm:constr type="primFontSz" for="ch" forName="node" op="equ" val="65"/>
+    </dgm:constrLst>
+    <dgm:ruleLst/>
+    <dgm:forEach name="Name3" axis="ch" ptType="node">
+      <dgm:layoutNode name="node">
+        <dgm:varLst>
+          <dgm:bulletEnabled val="1"/>
+        </dgm:varLst>
+        <dgm:alg type="tx"/>
+        <dgm:shape xmlns:r="http://schemas.openxmlformats.org/officeDocument/2006/relationships" type="rect" r:blip="">
+          <dgm:adjLst/>
+        </dgm:shape>
+        <dgm:presOf axis="desOrSelf" ptType="node"/>
+        <dgm:constrLst>
+          <dgm:constr type="lMarg" refType="primFontSz" fact="0.3"/>
+          <dgm:constr type="rMarg" refType="primFontSz" fact="0.3"/>
+          <dgm:constr type="tMarg" refType="primFontSz" fact="0.3"/>
+          <dgm:constr type="bMarg" refType="primFontSz" fact="0.3"/>
+        </dgm:constrLst>
+        <dgm:ruleLst>
+          <dgm:rule type="primFontSz" val="5" fact="NaN" max="NaN"/>
+        </dgm:ruleLst>
+      </dgm:layoutNode>
+      <dgm:forEach name="Name4" axis="followSib" ptType="sibTrans" cnt="1">
+        <dgm:layoutNode name="sibTrans">
+          <dgm:alg type="sp"/>
+          <dgm:shape xmlns:r="http://schemas.openxmlformats.org/officeDocument/2006/relationships" r:blip="">
+            <dgm:adjLst/>
+          </dgm:shape>
+          <dgm:presOf/>
+          <dgm:constrLst/>
+          <dgm:ruleLst/>
+        </dgm:layoutNode>
+      </dgm:forEach>
+    </dgm:forEach>
+  </dgm:layoutNode>
+</dgm:layoutDef>
+</file>
+
+<file path=word/diagrams/quickStyle1.xml><?xml version="1.0" encoding="utf-8"?>
+<dgm:styleDef xmlns:dgm="http://schemas.openxmlformats.org/drawingml/2006/diagram" xmlns:a="http://schemas.openxmlformats.org/drawingml/2006/main" uniqueId="urn:microsoft.com/office/officeart/2005/8/quickstyle/simple1">
+  <dgm:title val=""/>
+  <dgm:desc val=""/>
+  <dgm:catLst>
+    <dgm:cat type="simple" pri="10100"/>
+  </dgm:catLst>
+  <dgm:scene3d>
+    <a:camera prst="orthographicFront"/>
+    <a:lightRig rig="threePt" dir="t"/>
+  </dgm:scene3d>
+  <dgm:styleLbl name="node0">
+    <dgm:scene3d>
+      <a:camera prst="orthographicFront"/>
+      <a:lightRig rig="threePt" dir="t"/>
+    </dgm:scene3d>
+    <dgm:sp3d/>
+    <dgm:txPr/>
+    <dgm:style>
+      <a:lnRef idx="2">
+        <a:scrgbClr r="0" g="0" b="0"/>
+      </a:lnRef>
+      <a:fillRef idx="1">
+        <a:scrgbClr r="0" g="0" b="0"/>
+      </a:fillRef>
+      <a:effectRef idx="0">
+        <a:scrgbClr r="0" g="0" b="0"/>
+      </a:effectRef>
+      <a:fontRef idx="minor">
+        <a:schemeClr val="lt1"/>
+      </a:fontRef>
+    </dgm:style>
+  </dgm:styleLbl>
+  <dgm:styleLbl name="lnNode1">
+    <dgm:scene3d>
+      <a:camera prst="orthographicFront"/>
+      <a:lightRig rig="threePt" dir="t"/>
+    </dgm:scene3d>
+    <dgm:sp3d/>
+    <dgm:txPr/>
+    <dgm:style>
+      <a:lnRef idx="2">
+        <a:scrgbClr r="0" g="0" b="0"/>
+      </a:lnRef>
+      <a:fillRef idx="1">
+        <a:scrgbClr r="0" g="0" b="0"/>
+      </a:fillRef>
+      <a:effectRef idx="0">
+        <a:scrgbClr r="0" g="0" b="0"/>
+      </a:effectRef>
+      <a:fontRef idx="minor">
+        <a:schemeClr val="lt1"/>
+      </a:fontRef>
+    </dgm:style>
+  </dgm:styleLbl>
+  <dgm:styleLbl name="vennNode1">
+    <dgm:scene3d>
+      <a:camera prst="orthographicFront"/>
+      <a:lightRig rig="threePt" dir="t"/>
+    </dgm:scene3d>
+    <dgm:sp3d/>
+    <dgm:txPr/>
+    <dgm:style>
+      <a:lnRef idx="2">
+        <a:scrgbClr r="0" g="0" b="0"/>
+      </a:lnRef>
+      <a:fillRef idx="1">
+        <a:scrgbClr r="0" g="0" b="0"/>
+      </a:fillRef>
+      <a:effectRef idx="0">
+        <a:scrgbClr r="0" g="0" b="0"/>
+      </a:effectRef>
+      <a:fontRef idx="minor">
+        <a:schemeClr val="tx1"/>
+      </a:fontRef>
+    </dgm:style>
+  </dgm:styleLbl>
+  <dgm:styleLbl name="alignNode1">
+    <dgm:scene3d>
+      <a:camera prst="orthographicFront"/>
+      <a:lightRig rig="threePt" dir="t"/>
+    </dgm:scene3d>
+    <dgm:sp3d/>
+    <dgm:txPr/>
+    <dgm:style>
+      <a:lnRef idx="2">
+        <a:scrgbClr r="0" g="0" b="0"/>
+      </a:lnRef>
+      <a:fillRef idx="1">
+        <a:scrgbClr r="0" g="0" b="0"/>
+      </a:fillRef>
+      <a:effectRef idx="0">
+        <a:scrgbClr r="0" g="0" b="0"/>
+      </a:effectRef>
+      <a:fontRef idx="minor">
+        <a:schemeClr val="lt1"/>
+      </a:fontRef>
+    </dgm:style>
+  </dgm:styleLbl>
+  <dgm:styleLbl name="node1">
+    <dgm:scene3d>
+      <a:camera prst="orthographicFront"/>
+      <a:lightRig rig="threePt" dir="t"/>
+    </dgm:scene3d>
+    <dgm:sp3d/>
+    <dgm:txPr/>
+    <dgm:style>
+      <a:lnRef idx="2">
+        <a:scrgbClr r="0" g="0" b="0"/>
+      </a:lnRef>
+      <a:fillRef idx="1">
+        <a:scrgbClr r="0" g="0" b="0"/>
+      </a:fillRef>
+      <a:effectRef idx="0">
+        <a:scrgbClr r="0" g="0" b="0"/>
+      </a:effectRef>
+      <a:fontRef idx="minor">
+        <a:schemeClr val="lt1"/>
+      </a:fontRef>
+    </dgm:style>
+  </dgm:styleLbl>
+  <dgm:styleLbl name="node2">
+    <dgm:scene3d>
+      <a:camera prst="orthographicFront"/>
+      <a:lightRig rig="threePt" dir="t"/>
+    </dgm:scene3d>
+    <dgm:sp3d/>
+    <dgm:txPr/>
+    <dgm:style>
+      <a:lnRef idx="2">
+        <a:scrgbClr r="0" g="0" b="0"/>
+      </a:lnRef>
+      <a:fillRef idx="1">
+        <a:scrgbClr r="0" g="0" b="0"/>
+      </a:fillRef>
+      <a:effectRef idx="0">
+        <a:scrgbClr r="0" g="0" b="0"/>
+      </a:effectRef>
+      <a:fontRef idx="minor">
+        <a:schemeClr val="lt1"/>
+      </a:fontRef>
+    </dgm:style>
+  </dgm:styleLbl>
+  <dgm:styleLbl name="node3">
+    <dgm:scene3d>
+      <a:camera prst="orthographicFront"/>
+      <a:lightRig rig="threePt" dir="t"/>
+    </dgm:scene3d>
+    <dgm:sp3d/>
+    <dgm:txPr/>
+    <dgm:style>
+      <a:lnRef idx="2">
+        <a:scrgbClr r="0" g="0" b="0"/>
+      </a:lnRef>
+      <a:fillRef idx="1">
+        <a:scrgbClr r="0" g="0" b="0"/>
+      </a:fillRef>
+      <a:effectRef idx="0">
+        <a:scrgbClr r="0" g="0" b="0"/>
+      </a:effectRef>
+      <a:fontRef idx="minor">
+        <a:schemeClr val="lt1"/>
+      </a:fontRef>
+    </dgm:style>
+  </dgm:styleLbl>
+  <dgm:styleLbl name="node4">
+    <dgm:scene3d>
+      <a:camera prst="orthographicFront"/>
+      <a:lightRig rig="threePt" dir="t"/>
+    </dgm:scene3d>
+    <dgm:sp3d/>
+    <dgm:txPr/>
+    <dgm:style>
+      <a:lnRef idx="2">
+        <a:scrgbClr r="0" g="0" b="0"/>
+      </a:lnRef>
+      <a:fillRef idx="1">
+        <a:scrgbClr r="0" g="0" b="0"/>
+      </a:fillRef>
+      <a:effectRef idx="0">
+        <a:scrgbClr r="0" g="0" b="0"/>
+      </a:effectRef>
+      <a:fontRef idx="minor">
+        <a:schemeClr val="lt1"/>
+      </a:fontRef>
+    </dgm:style>
+  </dgm:styleLbl>
+  <dgm:styleLbl name="fgImgPlace1">
+    <dgm:scene3d>
+      <a:camera prst="orthographicFront"/>
+      <a:lightRig rig="threePt" dir="t"/>
+    </dgm:scene3d>
+    <dgm:sp3d/>
+    <dgm:txPr/>
+    <dgm:style>
+      <a:lnRef idx="2">
+        <a:scrgbClr r="0" g="0" b="0"/>
+      </a:lnRef>
+      <a:fillRef idx="1">
+        <a:scrgbClr r="0" g="0" b="0"/>
+      </a:fillRef>
+      <a:effectRef idx="0">
+        <a:scrgbClr r="0" g="0" b="0"/>
+      </a:effectRef>
+      <a:fontRef idx="minor"/>
+    </dgm:style>
+  </dgm:styleLbl>
+  <dgm:styleLbl name="alignImgPlace1">
+    <dgm:scene3d>
+      <a:camera prst="orthographicFront"/>
+      <a:lightRig rig="threePt" dir="t"/>
+    </dgm:scene3d>
+    <dgm:sp3d/>
+    <dgm:txPr/>
+    <dgm:style>
+      <a:lnRef idx="2">
+        <a:scrgbClr r="0" g="0" b="0"/>
+      </a:lnRef>
+      <a:fillRef idx="1">
+        <a:scrgbClr r="0" g="0" b="0"/>
+      </a:fillRef>
+      <a:effectRef idx="0">
+        <a:scrgbClr r="0" g="0" b="0"/>
+      </a:effectRef>
+      <a:fontRef idx="minor"/>
+    </dgm:style>
+  </dgm:styleLbl>
+  <dgm:styleLbl name="bgImgPlace1">
+    <dgm:scene3d>
+      <a:camera prst="orthographicFront"/>
+      <a:lightRig rig="threePt" dir="t"/>
+    </dgm:scene3d>
+    <dgm:sp3d/>
+    <dgm:txPr/>
+    <dgm:style>
+      <a:lnRef idx="2">
+        <a:scrgbClr r="0" g="0" b="0"/>
+      </a:lnRef>
+      <a:fillRef idx="1">
+        <a:scrgbClr r="0" g="0" b="0"/>
+      </a:fillRef>
+      <a:effectRef idx="0">
+        <a:scrgbClr r="0" g="0" b="0"/>
+      </a:effectRef>
+      <a:fontRef idx="minor"/>
+    </dgm:style>
+  </dgm:styleLbl>
+  <dgm:styleLbl name="sibTrans2D1">
+    <dgm:scene3d>
+      <a:camera prst="orthographicFront"/>
+      <a:lightRig rig="threePt" dir="t"/>
+    </dgm:scene3d>
+    <dgm:sp3d/>
+    <dgm:txPr/>
+    <dgm:style>
+      <a:lnRef idx="0">
+        <a:scrgbClr r="0" g="0" b="0"/>
+      </a:lnRef>
+      <a:fillRef idx="1">
+        <a:scrgbClr r="0" g="0" b="0"/>
+      </a:fillRef>
+      <a:effectRef idx="0">
+        <a:scrgbClr r="0" g="0" b="0"/>
+      </a:effectRef>
+      <a:fontRef idx="minor">
+        <a:schemeClr val="lt1"/>
+      </a:fontRef>
+    </dgm:style>
+  </dgm:styleLbl>
+  <dgm:styleLbl name="fgSibTrans2D1">
+    <dgm:scene3d>
+      <a:camera prst="orthographicFront"/>
+      <a:lightRig rig="threePt" dir="t"/>
+    </dgm:scene3d>
+    <dgm:sp3d/>
+    <dgm:txPr/>
+    <dgm:style>
+      <a:lnRef idx="0">
+        <a:scrgbClr r="0" g="0" b="0"/>
+      </a:lnRef>
+      <a:fillRef idx="1">
+        <a:scrgbClr r="0" g="0" b="0"/>
+      </a:fillRef>
+      <a:effectRef idx="0">
+        <a:scrgbClr r="0" g="0" b="0"/>
+      </a:effectRef>
+      <a:fontRef idx="minor">
+        <a:schemeClr val="lt1"/>
+      </a:fontRef>
+    </dgm:style>
+  </dgm:styleLbl>
+  <dgm:styleLbl name="bgSibTrans2D1">
+    <dgm:scene3d>
+      <a:camera prst="orthographicFront"/>
+      <a:lightRig rig="threePt" dir="t"/>
+    </dgm:scene3d>
+    <dgm:sp3d/>
+    <dgm:txPr/>
+    <dgm:style>
+      <a:lnRef idx="0">
+        <a:scrgbClr r="0" g="0" b="0"/>
+      </a:lnRef>
+      <a:fillRef idx="1">
+        <a:scrgbClr r="0" g="0" b="0"/>
+      </a:fillRef>
+      <a:effectRef idx="0">
+        <a:scrgbClr r="0" g="0" b="0"/>
+      </a:effectRef>
+      <a:fontRef idx="minor">
+        <a:schemeClr val="lt1"/>
+      </a:fontRef>
+    </dgm:style>
+  </dgm:styleLbl>
+  <dgm:styleLbl name="sibTrans1D1">
+    <dgm:scene3d>
+      <a:camera prst="orthographicFront"/>
+      <a:lightRig rig="threePt" dir="t"/>
+    </dgm:scene3d>
+    <dgm:sp3d/>
+    <dgm:txPr/>
+    <dgm:style>
+      <a:lnRef idx="1">
+        <a:scrgbClr r="0" g="0" b="0"/>
+      </a:lnRef>
+      <a:fillRef idx="0">
+        <a:scrgbClr r="0" g="0" b="0"/>
+      </a:fillRef>
+      <a:effectRef idx="0">
+        <a:scrgbClr r="0" g="0" b="0"/>
+      </a:effectRef>
+      <a:fontRef idx="minor"/>
+    </dgm:style>
+  </dgm:styleLbl>
+  <dgm:styleLbl name="callout">
+    <dgm:scene3d>
+      <a:camera prst="orthographicFront"/>
+      <a:lightRig rig="threePt" dir="t"/>
+    </dgm:scene3d>
+    <dgm:sp3d/>
+    <dgm:txPr/>
+    <dgm:style>
+      <a:lnRef idx="2">
+        <a:scrgbClr r="0" g="0" b="0"/>
+      </a:lnRef>
+      <a:fillRef idx="1">
+        <a:scrgbClr r="0" g="0" b="0"/>
+      </a:fillRef>
+      <a:effectRef idx="0">
+        <a:scrgbClr r="0" g="0" b="0"/>
+      </a:effectRef>
+      <a:fontRef idx="minor"/>
+    </dgm:style>
+  </dgm:styleLbl>
+  <dgm:styleLbl name="asst0">
+    <dgm:scene3d>
+      <a:camera prst="orthographicFront"/>
+      <a:lightRig rig="threePt" dir="t"/>
+    </dgm:scene3d>
+    <dgm:sp3d/>
+    <dgm:txPr/>
+    <dgm:style>
+      <a:lnRef idx="2">
+        <a:scrgbClr r="0" g="0" b="0"/>
+      </a:lnRef>
+      <a:fillRef idx="1">
+        <a:scrgbClr r="0" g="0" b="0"/>
+      </a:fillRef>
+      <a:effectRef idx="0">
+        <a:scrgbClr r="0" g="0" b="0"/>
+      </a:effectRef>
+      <a:fontRef idx="minor">
+        <a:schemeClr val="lt1"/>
+      </a:fontRef>
+    </dgm:style>
+  </dgm:styleLbl>
+  <dgm:styleLbl name="asst1">
+    <dgm:scene3d>
+      <a:camera prst="orthographicFront"/>
+      <a:lightRig rig="threePt" dir="t"/>
+    </dgm:scene3d>
+    <dgm:sp3d/>
+    <dgm:txPr/>
+    <dgm:style>
+      <a:lnRef idx="2">
+        <a:scrgbClr r="0" g="0" b="0"/>
+      </a:lnRef>
+      <a:fillRef idx="1">
+        <a:scrgbClr r="0" g="0" b="0"/>
+      </a:fillRef>
+      <a:effectRef idx="0">
+        <a:scrgbClr r="0" g="0" b="0"/>
+      </a:effectRef>
+      <a:fontRef idx="minor">
+        <a:schemeClr val="lt1"/>
+      </a:fontRef>
+    </dgm:style>
+  </dgm:styleLbl>
+  <dgm:styleLbl name="asst2">
+    <dgm:scene3d>
+      <a:camera prst="orthographicFront"/>
+      <a:lightRig rig="threePt" dir="t"/>
+    </dgm:scene3d>
+    <dgm:sp3d/>
+    <dgm:txPr/>
+    <dgm:style>
+      <a:lnRef idx="2">
+        <a:scrgbClr r="0" g="0" b="0"/>
+      </a:lnRef>
+      <a:fillRef idx="1">
+        <a:scrgbClr r="0" g="0" b="0"/>
+      </a:fillRef>
+      <a:effectRef idx="0">
+        <a:scrgbClr r="0" g="0" b="0"/>
+      </a:effectRef>
+      <a:fontRef idx="minor">
+        <a:schemeClr val="lt1"/>
+      </a:fontRef>
+    </dgm:style>
+  </dgm:styleLbl>
+  <dgm:styleLbl name="asst3">
+    <dgm:scene3d>
+      <a:camera prst="orthographicFront"/>
+      <a:lightRig rig="threePt" dir="t"/>
+    </dgm:scene3d>
+    <dgm:sp3d/>
+    <dgm:txPr/>
+    <dgm:style>
+      <a:lnRef idx="2">
+        <a:scrgbClr r="0" g="0" b="0"/>
+      </a:lnRef>
+      <a:fillRef idx="1">
+        <a:scrgbClr r="0" g="0" b="0"/>
+      </a:fillRef>
+      <a:effectRef idx="0">
+        <a:scrgbClr r="0" g="0" b="0"/>
+      </a:effectRef>
+      <a:fontRef idx="minor">
+        <a:schemeClr val="lt1"/>
+      </a:fontRef>
+    </dgm:style>
+  </dgm:styleLbl>
+  <dgm:styleLbl name="asst4">
+    <dgm:scene3d>
+      <a:camera prst="orthographicFront"/>
+      <a:lightRig rig="threePt" dir="t"/>
+    </dgm:scene3d>
+    <dgm:sp3d/>
+    <dgm:txPr/>
+    <dgm:style>
+      <a:lnRef idx="2">
+        <a:scrgbClr r="0" g="0" b="0"/>
+      </a:lnRef>
+      <a:fillRef idx="1">
+        <a:scrgbClr r="0" g="0" b="0"/>
+      </a:fillRef>
+      <a:effectRef idx="0">
+        <a:scrgbClr r="0" g="0" b="0"/>
+      </a:effectRef>
+      <a:fontRef idx="minor">
+        <a:schemeClr val="lt1"/>
+      </a:fontRef>
+    </dgm:style>
+  </dgm:styleLbl>
+  <dgm:styleLbl name="parChTrans2D1">
+    <dgm:scene3d>
+      <a:camera prst="orthographicFront"/>
+      <a:lightRig rig="threePt" dir="t"/>
+    </dgm:scene3d>
+    <dgm:sp3d/>
+    <dgm:txPr/>
+    <dgm:style>
+      <a:lnRef idx="2">
+        <a:scrgbClr r="0" g="0" b="0"/>
+      </a:lnRef>
+      <a:fillRef idx="1">
+        <a:scrgbClr r="0" g="0" b="0"/>
+      </a:fillRef>
+      <a:effectRef idx="0">
+        <a:scrgbClr r="0" g="0" b="0"/>
+      </a:effectRef>
+      <a:fontRef idx="minor">
+        <a:schemeClr val="lt1"/>
+      </a:fontRef>
+    </dgm:style>
+  </dgm:styleLbl>
+  <dgm:styleLbl name="parChTrans2D2">
+    <dgm:scene3d>
+      <a:camera prst="orthographicFront"/>
+      <a:lightRig rig="threePt" dir="t"/>
+    </dgm:scene3d>
+    <dgm:sp3d/>
+    <dgm:txPr/>
+    <dgm:style>
+      <a:lnRef idx="2">
+        <a:scrgbClr r="0" g="0" b="0"/>
+      </a:lnRef>
+      <a:fillRef idx="1">
+        <a:scrgbClr r="0" g="0" b="0"/>
+      </a:fillRef>
+      <a:effectRef idx="0">
+        <a:scrgbClr r="0" g="0" b="0"/>
+      </a:effectRef>
+      <a:fontRef idx="minor">
+        <a:schemeClr val="lt1"/>
+      </a:fontRef>
+    </dgm:style>
+  </dgm:styleLbl>
+  <dgm:styleLbl name="parChTrans2D3">
+    <dgm:scene3d>
+      <a:camera prst="orthographicFront"/>
+      <a:lightRig rig="threePt" dir="t"/>
+    </dgm:scene3d>
+    <dgm:sp3d/>
+    <dgm:txPr/>
+    <dgm:style>
+      <a:lnRef idx="2">
+        <a:scrgbClr r="0" g="0" b="0"/>
+      </a:lnRef>
+      <a:fillRef idx="1">
+        <a:scrgbClr r="0" g="0" b="0"/>
+      </a:fillRef>
+      <a:effectRef idx="0">
+        <a:scrgbClr r="0" g="0" b="0"/>
+      </a:effectRef>
+      <a:fontRef idx="minor">
+        <a:schemeClr val="lt1"/>
+      </a:fontRef>
+    </dgm:style>
+  </dgm:styleLbl>
+  <dgm:styleLbl name="parChTrans2D4">
+    <dgm:scene3d>
+      <a:camera prst="orthographicFront"/>
+      <a:lightRig rig="threePt" dir="t"/>
+    </dgm:scene3d>
+    <dgm:sp3d/>
+    <dgm:txPr/>
+    <dgm:style>
+      <a:lnRef idx="2">
+        <a:scrgbClr r="0" g="0" b="0"/>
+      </a:lnRef>
+      <a:fillRef idx="1">
+        <a:scrgbClr r="0" g="0" b="0"/>
+      </a:fillRef>
+      <a:effectRef idx="0">
+        <a:scrgbClr r="0" g="0" b="0"/>
+      </a:effectRef>
+      <a:fontRef idx="minor">
+        <a:schemeClr val="lt1"/>
+      </a:fontRef>
+    </dgm:style>
+  </dgm:styleLbl>
+  <dgm:styleLbl name="parChTrans1D1">
+    <dgm:scene3d>
+      <a:camera prst="orthographicFront"/>
+      <a:lightRig rig="threePt" dir="t"/>
+    </dgm:scene3d>
+    <dgm:sp3d/>
+    <dgm:txPr/>
+    <dgm:style>
+      <a:lnRef idx="2">
+        <a:scrgbClr r="0" g="0" b="0"/>
+      </a:lnRef>
+      <a:fillRef idx="0">
+        <a:scrgbClr r="0" g="0" b="0"/>
+      </a:fillRef>
+      <a:effectRef idx="0">
+        <a:scrgbClr r="0" g="0" b="0"/>
+      </a:effectRef>
+      <a:fontRef idx="minor"/>
+    </dgm:style>
+  </dgm:styleLbl>
+  <dgm:styleLbl name="parChTrans1D2">
+    <dgm:scene3d>
+      <a:camera prst="orthographicFront"/>
+      <a:lightRig rig="threePt" dir="t"/>
+    </dgm:scene3d>
+    <dgm:sp3d/>
+    <dgm:txPr/>
+    <dgm:style>
+      <a:lnRef idx="2">
+        <a:scrgbClr r="0" g="0" b="0"/>
+      </a:lnRef>
+      <a:fillRef idx="0">
+        <a:scrgbClr r="0" g="0" b="0"/>
+      </a:fillRef>
+      <a:effectRef idx="0">
+        <a:scrgbClr r="0" g="0" b="0"/>
+      </a:effectRef>
+      <a:fontRef idx="minor"/>
+    </dgm:style>
+  </dgm:styleLbl>
+  <dgm:styleLbl name="parChTrans1D3">
+    <dgm:scene3d>
+      <a:camera prst="orthographicFront"/>
+      <a:lightRig rig="threePt" dir="t"/>
+    </dgm:scene3d>
+    <dgm:sp3d/>
+    <dgm:txPr/>
+    <dgm:style>
+      <a:lnRef idx="2">
+        <a:scrgbClr r="0" g="0" b="0"/>
+      </a:lnRef>
+      <a:fillRef idx="0">
+        <a:scrgbClr r="0" g="0" b="0"/>
+      </a:fillRef>
+      <a:effectRef idx="0">
+        <a:scrgbClr r="0" g="0" b="0"/>
+      </a:effectRef>
+      <a:fontRef idx="minor"/>
+    </dgm:style>
+  </dgm:styleLbl>
+  <dgm:styleLbl name="parChTrans1D4">
+    <dgm:scene3d>
+      <a:camera prst="orthographicFront"/>
+      <a:lightRig rig="threePt" dir="t"/>
+    </dgm:scene3d>
+    <dgm:sp3d/>
+    <dgm:txPr/>
+    <dgm:style>
+      <a:lnRef idx="2">
+        <a:scrgbClr r="0" g="0" b="0"/>
+      </a:lnRef>
+      <a:fillRef idx="0">
+        <a:scrgbClr r="0" g="0" b="0"/>
+      </a:fillRef>
+      <a:effectRef idx="0">
+        <a:scrgbClr r="0" g="0" b="0"/>
+      </a:effectRef>
+      <a:fontRef idx="minor"/>
+    </dgm:style>
+  </dgm:styleLbl>
+  <dgm:styleLbl name="fgAcc1">
+    <dgm:scene3d>
+      <a:camera prst="orthographicFront"/>
+      <a:lightRig rig="threePt" dir="t"/>
+    </dgm:scene3d>
+    <dgm:sp3d/>
+    <dgm:txPr/>
+    <dgm:style>
+      <a:lnRef idx="2">
+        <a:scrgbClr r="0" g="0" b="0"/>
+      </a:lnRef>
+      <a:fillRef idx="1">
+        <a:scrgbClr r="0" g="0" b="0"/>
+      </a:fillRef>
+      <a:effectRef idx="0">
+        <a:scrgbClr r="0" g="0" b="0"/>
+      </a:effectRef>
+      <a:fontRef idx="minor"/>
+    </dgm:style>
+  </dgm:styleLbl>
+  <dgm:styleLbl name="conFgAcc1">
+    <dgm:scene3d>
+      <a:camera prst="orthographicFront"/>
+      <a:lightRig rig="threePt" dir="t"/>
+    </dgm:scene3d>
+    <dgm:sp3d/>
+    <dgm:txPr/>
+    <dgm:style>
+      <a:lnRef idx="2">
+        <a:scrgbClr r="0" g="0" b="0"/>
+      </a:lnRef>
+      <a:fillRef idx="1">
+        <a:scrgbClr r="0" g="0" b="0"/>
+      </a:fillRef>
+      <a:effectRef idx="0">
+        <a:scrgbClr r="0" g="0" b="0"/>
+      </a:effectRef>
+      <a:fontRef idx="minor"/>
+    </dgm:style>
+  </dgm:styleLbl>
+  <dgm:styleLbl name="alignAcc1">
+    <dgm:scene3d>
+      <a:camera prst="orthographicFront"/>
+      <a:lightRig rig="threePt" dir="t"/>
+    </dgm:scene3d>
+    <dgm:sp3d/>
+    <dgm:txPr/>
+    <dgm:style>
+      <a:lnRef idx="2">
+        <a:scrgbClr r="0" g="0" b="0"/>
+      </a:lnRef>
+      <a:fillRef idx="1">
+        <a:scrgbClr r="0" g="0" b="0"/>
+      </a:fillRef>
+      <a:effectRef idx="0">
+        <a:scrgbClr r="0" g="0" b="0"/>
+      </a:effectRef>
+      <a:fontRef idx="minor"/>
+    </dgm:style>
+  </dgm:styleLbl>
+  <dgm:styleLbl name="trAlignAcc1">
+    <dgm:scene3d>
+      <a:camera prst="orthographicFront"/>
+      <a:lightRig rig="threePt" dir="t"/>
+    </dgm:scene3d>
+    <dgm:sp3d/>
+    <dgm:txPr/>
+    <dgm:style>
+      <a:lnRef idx="1">
+        <a:scrgbClr r="0" g="0" b="0"/>
+      </a:lnRef>
+      <a:fillRef idx="1">
+        <a:scrgbClr r="0" g="0" b="0"/>
+      </a:fillRef>
+      <a:effectRef idx="0">
+        <a:scrgbClr r="0" g="0" b="0"/>
+      </a:effectRef>
+      <a:fontRef idx="minor"/>
+    </dgm:style>
+  </dgm:styleLbl>
+  <dgm:styleLbl name="bgAcc1">
+    <dgm:scene3d>
+      <a:camera prst="orthographicFront"/>
+      <a:lightRig rig="threePt" dir="t"/>
+    </dgm:scene3d>
+    <dgm:sp3d/>
+    <dgm:txPr/>
+    <dgm:style>
+      <a:lnRef idx="2">
+        <a:scrgbClr r="0" g="0" b="0"/>
+      </a:lnRef>
+      <a:fillRef idx="1">
+        <a:scrgbClr r="0" g="0" b="0"/>
+      </a:fillRef>
+      <a:effectRef idx="0">
+        <a:scrgbClr r="0" g="0" b="0"/>
+      </a:effectRef>
+      <a:fontRef idx="minor"/>
+    </dgm:style>
+  </dgm:styleLbl>
+  <dgm:styleLbl name="solidFgAcc1">
+    <dgm:scene3d>
+      <a:camera prst="orthographicFront"/>
+      <a:lightRig rig="threePt" dir="t"/>
+    </dgm:scene3d>
+    <dgm:sp3d/>
+    <dgm:txPr/>
+    <dgm:style>
+      <a:lnRef idx="2">
+        <a:scrgbClr r="0" g="0" b="0"/>
+      </a:lnRef>
+      <a:fillRef idx="1">
+        <a:scrgbClr r="0" g="0" b="0"/>
+      </a:fillRef>
+      <a:effectRef idx="0">
+        <a:scrgbClr r="0" g="0" b="0"/>
+      </a:effectRef>
+      <a:fontRef idx="minor"/>
+    </dgm:style>
+  </dgm:styleLbl>
+  <dgm:styleLbl name="solidAlignAcc1">
+    <dgm:scene3d>
+      <a:camera prst="orthographicFront"/>
+      <a:lightRig rig="threePt" dir="t"/>
+    </dgm:scene3d>
+    <dgm:sp3d/>
+    <dgm:txPr/>
+    <dgm:style>
+      <a:lnRef idx="2">
+        <a:scrgbClr r="0" g="0" b="0"/>
+      </a:lnRef>
+      <a:fillRef idx="1">
+        <a:scrgbClr r="0" g="0" b="0"/>
+      </a:fillRef>
+      <a:effectRef idx="0">
+        <a:scrgbClr r="0" g="0" b="0"/>
+      </a:effectRef>
+      <a:fontRef idx="minor"/>
+    </dgm:style>
+  </dgm:styleLbl>
+  <dgm:styleLbl name="solidBgAcc1">
+    <dgm:scene3d>
+      <a:camera prst="orthographicFront"/>
+      <a:lightRig rig="threePt" dir="t"/>
+    </dgm:scene3d>
+    <dgm:sp3d/>
+    <dgm:txPr/>
+    <dgm:style>
+      <a:lnRef idx="2">
+        <a:scrgbClr r="0" g="0" b="0"/>
+      </a:lnRef>
+      <a:fillRef idx="1">
+        <a:scrgbClr r="0" g="0" b="0"/>
+      </a:fillRef>
+      <a:effectRef idx="0">
+        <a:scrgbClr r="0" g="0" b="0"/>
+      </a:effectRef>
+      <a:fontRef idx="minor"/>
+    </dgm:style>
+  </dgm:styleLbl>
+  <dgm:styleLbl name="fgAccFollowNode1">
+    <dgm:scene3d>
+      <a:camera prst="orthographicFront"/>
+      <a:lightRig rig="threePt" dir="t"/>
+    </dgm:scene3d>
+    <dgm:sp3d/>
+    <dgm:txPr/>
+    <dgm:style>
+      <a:lnRef idx="2">
+        <a:scrgbClr r="0" g="0" b="0"/>
+      </a:lnRef>
+      <a:fillRef idx="1">
+        <a:scrgbClr r="0" g="0" b="0"/>
+      </a:fillRef>
+      <a:effectRef idx="0">
+        <a:scrgbClr r="0" g="0" b="0"/>
+      </a:effectRef>
+      <a:fontRef idx="minor"/>
+    </dgm:style>
+  </dgm:styleLbl>
+  <dgm:styleLbl name="alignAccFollowNode1">
+    <dgm:scene3d>
+      <a:camera prst="orthographicFront"/>
+      <a:lightRig rig="threePt" dir="t"/>
+    </dgm:scene3d>
+    <dgm:sp3d/>
+    <dgm:txPr/>
+    <dgm:style>
+      <a:lnRef idx="2">
+        <a:scrgbClr r="0" g="0" b="0"/>
+      </a:lnRef>
+      <a:fillRef idx="1">
+        <a:scrgbClr r="0" g="0" b="0"/>
+      </a:fillRef>
+      <a:effectRef idx="0">
+        <a:scrgbClr r="0" g="0" b="0"/>
+      </a:effectRef>
+      <a:fontRef idx="minor"/>
+    </dgm:style>
+  </dgm:styleLbl>
+  <dgm:styleLbl name="bgAccFollowNode1">
+    <dgm:scene3d>
+      <a:camera prst="orthographicFront"/>
+      <a:lightRig rig="threePt" dir="t"/>
+    </dgm:scene3d>
+    <dgm:sp3d/>
+    <dgm:txPr/>
+    <dgm:style>
+      <a:lnRef idx="2">
+        <a:scrgbClr r="0" g="0" b="0"/>
+      </a:lnRef>
+      <a:fillRef idx="1">
+        <a:scrgbClr r="0" g="0" b="0"/>
+      </a:fillRef>
+      <a:effectRef idx="0">
+        <a:scrgbClr r="0" g="0" b="0"/>
+      </a:effectRef>
+      <a:fontRef idx="minor"/>
+    </dgm:style>
+  </dgm:styleLbl>
+  <dgm:styleLbl name="fgAcc0">
+    <dgm:scene3d>
+      <a:camera prst="orthographicFront"/>
+      <a:lightRig rig="threePt" dir="t"/>
+    </dgm:scene3d>
+    <dgm:sp3d/>
+    <dgm:txPr/>
+    <dgm:style>
+      <a:lnRef idx="2">
+        <a:scrgbClr r="0" g="0" b="0"/>
+      </a:lnRef>
+      <a:fillRef idx="1">
+        <a:scrgbClr r="0" g="0" b="0"/>
+      </a:fillRef>
+      <a:effectRef idx="0">
+        <a:scrgbClr r="0" g="0" b="0"/>
+      </a:effectRef>
+      <a:fontRef idx="minor"/>
+    </dgm:style>
+  </dgm:styleLbl>
+  <dgm:styleLbl name="fgAcc2">
+    <dgm:scene3d>
+      <a:camera prst="orthographicFront"/>
+      <a:lightRig rig="threePt" dir="t"/>
+    </dgm:scene3d>
+    <dgm:sp3d/>
+    <dgm:txPr/>
+    <dgm:style>
+      <a:lnRef idx="2">
+        <a:scrgbClr r="0" g="0" b="0"/>
+      </a:lnRef>
+      <a:fillRef idx="1">
+        <a:scrgbClr r="0" g="0" b="0"/>
+      </a:fillRef>
+      <a:effectRef idx="0">
+        <a:scrgbClr r="0" g="0" b="0"/>
+      </a:effectRef>
+      <a:fontRef idx="minor"/>
+    </dgm:style>
+  </dgm:styleLbl>
+  <dgm:styleLbl name="fgAcc3">
+    <dgm:scene3d>
+      <a:camera prst="orthographicFront"/>
+      <a:lightRig rig="threePt" dir="t"/>
+    </dgm:scene3d>
+    <dgm:sp3d/>
+    <dgm:txPr/>
+    <dgm:style>
+      <a:lnRef idx="2">
+        <a:scrgbClr r="0" g="0" b="0"/>
+      </a:lnRef>
+      <a:fillRef idx="1">
+        <a:scrgbClr r="0" g="0" b="0"/>
+      </a:fillRef>
+      <a:effectRef idx="0">
+        <a:scrgbClr r="0" g="0" b="0"/>
+      </a:effectRef>
+      <a:fontRef idx="minor"/>
+    </dgm:style>
+  </dgm:styleLbl>
+  <dgm:styleLbl name="fgAcc4">
+    <dgm:scene3d>
+      <a:camera prst="orthographicFront"/>
+      <a:lightRig rig="threePt" dir="t"/>
+    </dgm:scene3d>
+    <dgm:sp3d/>
+    <dgm:txPr/>
+    <dgm:style>
+      <a:lnRef idx="2">
+        <a:scrgbClr r="0" g="0" b="0"/>
+      </a:lnRef>
+      <a:fillRef idx="1">
+        <a:scrgbClr r="0" g="0" b="0"/>
+      </a:fillRef>
+      <a:effectRef idx="0">
+        <a:scrgbClr r="0" g="0" b="0"/>
+      </a:effectRef>
+      <a:fontRef idx="minor"/>
+    </dgm:style>
+  </dgm:styleLbl>
+  <dgm:styleLbl name="bgShp">
+    <dgm:scene3d>
+      <a:camera prst="orthographicFront"/>
+      <a:lightRig rig="threePt" dir="t"/>
+    </dgm:scene3d>
+    <dgm:sp3d/>
+    <dgm:txPr/>
+    <dgm:style>
+      <a:lnRef idx="0">
+        <a:scrgbClr r="0" g="0" b="0"/>
+      </a:lnRef>
+      <a:fillRef idx="1">
+        <a:scrgbClr r="0" g="0" b="0"/>
+      </a:fillRef>
+      <a:effectRef idx="0">
+        <a:scrgbClr r="0" g="0" b="0"/>
+      </a:effectRef>
+      <a:fontRef idx="minor"/>
+    </dgm:style>
+  </dgm:styleLbl>
+  <dgm:styleLbl name="dkBgShp">
+    <dgm:scene3d>
+      <a:camera prst="orthographicFront"/>
+      <a:lightRig rig="threePt" dir="t"/>
+    </dgm:scene3d>
+    <dgm:sp3d/>
+    <dgm:txPr/>
+    <dgm:style>
+      <a:lnRef idx="0">
+        <a:scrgbClr r="0" g="0" b="0"/>
+      </a:lnRef>
+      <a:fillRef idx="1">
+        <a:scrgbClr r="0" g="0" b="0"/>
+      </a:fillRef>
+      <a:effectRef idx="0">
+        <a:scrgbClr r="0" g="0" b="0"/>
+      </a:effectRef>
+      <a:fontRef idx="minor"/>
+    </dgm:style>
+  </dgm:styleLbl>
+  <dgm:styleLbl name="trBgShp">
+    <dgm:scene3d>
+      <a:camera prst="orthographicFront"/>
+      <a:lightRig rig="threePt" dir="t"/>
+    </dgm:scene3d>
+    <dgm:sp3d/>
+    <dgm:txPr/>
+    <dgm:style>
+      <a:lnRef idx="0">
+        <a:scrgbClr r="0" g="0" b="0"/>
+      </a:lnRef>
+      <a:fillRef idx="1">
+        <a:scrgbClr r="0" g="0" b="0"/>
+      </a:fillRef>
+      <a:effectRef idx="0">
+        <a:scrgbClr r="0" g="0" b="0"/>
+      </a:effectRef>
+      <a:fontRef idx="minor"/>
+    </dgm:style>
+  </dgm:styleLbl>
+  <dgm:styleLbl name="fgShp">
+    <dgm:scene3d>
+      <a:camera prst="orthographicFront"/>
+      <a:lightRig rig="threePt" dir="t"/>
+    </dgm:scene3d>
+    <dgm:sp3d/>
+    <dgm:txPr/>
+    <dgm:style>
+      <a:lnRef idx="2">
+        <a:scrgbClr r="0" g="0" b="0"/>
+      </a:lnRef>
+      <a:fillRef idx="1">
+        <a:scrgbClr r="0" g="0" b="0"/>
+      </a:fillRef>
+      <a:effectRef idx="0">
+        <a:scrgbClr r="0" g="0" b="0"/>
+      </a:effectRef>
+      <a:fontRef idx="minor"/>
+    </dgm:style>
+  </dgm:styleLbl>
+  <dgm:styleLbl name="revTx">
+    <dgm:scene3d>
+      <a:camera prst="orthographicFront"/>
+      <a:lightRig rig="threePt" dir="t"/>
+    </dgm:scene3d>
+    <dgm:sp3d/>
+    <dgm:txPr/>
+    <dgm:style>
+      <a:lnRef idx="0">
+        <a:scrgbClr r="0" g="0" b="0"/>
+      </a:lnRef>
+      <a:fillRef idx="0">
+        <a:scrgbClr r="0" g="0" b="0"/>
+      </a:fillRef>
+      <a:effectRef idx="0">
+        <a:scrgbClr r="0" g="0" b="0"/>
+      </a:effectRef>
+      <a:fontRef idx="minor"/>
+    </dgm:style>
+  </dgm:styleLbl>
+</dgm:styleDef>
+</file>
+
 <file path=word/theme/theme1.xml><?xml version="1.0" encoding="utf-8"?>
 <a:theme xmlns:a="http://schemas.openxmlformats.org/drawingml/2006/main" name="Office Theme">
   <a:themeElements>

</xml_diff>